<commit_message>
Add/update resource data for UWTranslationNotes
</commit_message>
<xml_diff>
--- a/arb/docx/08.content.docx
+++ b/arb/docx/08.content.docx
@@ -32,51 +32,16 @@
     </w:p>
     <w:p>
       <w:pPr>
-        <w:pStyle w:val="Heading2"/>
-        <w:bidi/>
-      </w:pPr>
-      <w:r>
-        <w:rPr>
-          <w:lang w:val="ar_AE" w:bidi="ar_AE"/>
-        </w:rPr>
-        <w:t>License Information</w:t>
-      </w:r>
-      <w:r>
-        <w:rPr>
-          <w:lang w:val="ar_AE" w:bidi="ar_AE"/>
-        </w:rPr>
-      </w:r>
-    </w:p>
-    <w:p>
-      <w:pPr>
-        <w:bidi/>
-      </w:pPr>
-      <w:r>
-        <w:rPr>
-          <w:lang w:val="ar_AE" w:bidi="ar_AE"/>
-        </w:rPr>
-      </w:r>
-      <w:r>
-        <w:rPr>
-          <w:b/>
-          <w:lang w:val="ar_AE" w:bidi="ar_AE"/>
-        </w:rPr>
-        <w:t>ملاحظات الترجمة (كلمة متكشفة)</w:t>
-      </w:r>
-      <w:r>
-        <w:rPr>
-          <w:lang w:val="ar_AE" w:bidi="ar_AE"/>
-        </w:rPr>
-        <w:t xml:space="preserve"> (Arabic) is based on</w:t>
-      </w:r>
-      <w:r>
-        <w:rPr>
-          <w:lang w:val="ar_AE" w:bidi="ar_AE"/>
-        </w:rPr>
-        <w:t xml:space="preserve">: </w:t>
-      </w:r>
-      <w:r>
-        <w:rPr>
+        <w:bidi/>
+      </w:pPr>
+      <w:r>
+        <w:rPr>
+          <w:lang w:val="ar_AE" w:bidi="ar_AE"/>
+        </w:rPr>
+      </w:r>
+      <w:r>
+        <w:rPr>
+          <w:b/>
           <w:lang w:val="ar_AE" w:bidi="ar_AE"/>
         </w:rPr>
         <w:t>unfoldingWord® Translation Notes</w:t>
@@ -85,64 +50,31 @@
         <w:rPr>
           <w:lang w:val="ar_AE" w:bidi="ar_AE"/>
         </w:rPr>
-        <w:t xml:space="preserve">, </w:t>
-      </w:r>
-      <w:hyperlink r:id="rId13">
-        <w:r>
-          <w:rPr>
-            <w:lang w:val="ar_AE" w:bidi="ar_AE"/>
-          </w:rPr>
-          <w:rPr>
-            <w:color w:val="0000EE"/>
-            <w:u w:val="single"/>
-          </w:rPr>
-          <w:t>unfoldingWord</w:t>
-        </w:r>
-      </w:hyperlink>
-      <w:r>
-        <w:rPr>
-          <w:lang w:val="ar_AE" w:bidi="ar_AE"/>
-        </w:rPr>
-        <w:t xml:space="preserve">, 2022, which is licensed under a </w:t>
-      </w:r>
-      <w:hyperlink r:id="rId14">
-        <w:r>
-          <w:rPr>
-            <w:lang w:val="ar_AE" w:bidi="ar_AE"/>
-          </w:rPr>
-          <w:rPr>
-            <w:color w:val="0000EE"/>
-            <w:u w:val="single"/>
-          </w:rPr>
-          <w:t>CC BY-SA 4.0 license</w:t>
-        </w:r>
-      </w:hyperlink>
-      <w:r>
-        <w:rPr>
-          <w:lang w:val="ar_AE" w:bidi="ar_AE"/>
-        </w:rPr>
-        <w:t>.</w:t>
-      </w:r>
-      <w:r>
-        <w:rPr>
-          <w:lang w:val="ar_AE" w:bidi="ar_AE"/>
-        </w:rPr>
-      </w:r>
-    </w:p>
-    <w:p>
-      <w:pPr>
-        <w:bidi/>
-      </w:pPr>
-      <w:r>
-        <w:rPr>
-          <w:lang w:val="ar_AE" w:bidi="ar_AE"/>
-        </w:rPr>
-      </w:r>
-      <w:r>
-        <w:rPr>
-          <w:lang w:val="ar_AE" w:bidi="ar_AE"/>
-        </w:rPr>
-        <w:t>This PDF version is provided under the same license.</w:t>
+        <w:t xml:space="preserve"> © 2022 unfoldingWord. Released under CC BY-SA 4.0 license. </w:t>
+      </w:r>
+      <w:r>
+        <w:rPr>
+          <w:lang w:val="ar_AE" w:bidi="ar_AE"/>
+        </w:rPr>
+        <w:t>unfoldingWord® Translation Notes</w:t>
+      </w:r>
+      <w:r>
+        <w:rPr>
+          <w:lang w:val="ar_AE" w:bidi="ar_AE"/>
+        </w:rPr>
+        <w:t xml:space="preserve"> has been adapted in the following languages: Tok Pisin, Arabic (عربي), French (Français), Hindi (हिंदी), Indonesian (Bahasa Indonesia), Portuguese (Português), Russian (Русский), Spanish (Español), Swahili (Kiswahili), and Simplified Chinese (简体中文) from </w:t>
+      </w:r>
+      <w:r>
+        <w:rPr>
+          <w:lang w:val="ar_AE" w:bidi="ar_AE"/>
+        </w:rPr>
+        <w:t>unfoldingWord® Translation Notes</w:t>
+      </w:r>
+      <w:r>
+        <w:rPr>
+          <w:lang w:val="ar_AE" w:bidi="ar_AE"/>
+        </w:rPr>
+        <w:t xml:space="preserve"> © 2022 unfoldingWord. Released under CC BY-SA 4.0 license by Mission Mutual</w:t>
       </w:r>
       <w:r>
         <w:rPr>
@@ -21366,7 +21298,7 @@
         </w:rPr>
         <w:t xml:space="preserve">أوضح سؤال نُعمي البلاغي في </w:t>
       </w:r>
-      <w:hyperlink r:id="rId15">
+      <w:hyperlink r:id="rId13">
         <w:r>
           <w:rPr>
             <w:lang w:val="ar_AE" w:bidi="ar_AE"/>
@@ -21384,7 +21316,7 @@
         </w:rPr>
         <w:t xml:space="preserve"> سبب الخطة التي ستخبر بها راعوث في الآيات </w:t>
       </w:r>
-      <w:hyperlink r:id="rId16">
+      <w:hyperlink r:id="rId14">
         <w:r>
           <w:rPr>
             <w:lang w:val="ar_AE" w:bidi="ar_AE"/>
@@ -21524,7 +21456,7 @@
         </w:rPr>
         <w:t xml:space="preserve">تستخدم نعمي صيغة السؤال هنا لتذكير راعوث بأمر كانت قد أخبرتها به سابقًا (انظر </w:t>
       </w:r>
-      <w:hyperlink r:id="rId17">
+      <w:hyperlink r:id="rId15">
         <w:r>
           <w:rPr>
             <w:lang w:val="ar_AE" w:bidi="ar_AE"/>
@@ -22852,7 +22784,7 @@
         </w:rPr>
         <w:t xml:space="preserve">تُلخص هذه العبارة الأفعال التي ستقوم بها راعوث في </w:t>
       </w:r>
-      <w:hyperlink r:id="rId18">
+      <w:hyperlink r:id="rId16">
         <w:r>
           <w:rPr>
             <w:lang w:val="ar_AE" w:bidi="ar_AE"/>
@@ -22870,7 +22802,7 @@
         </w:rPr>
         <w:t xml:space="preserve">. إذا أساء الناس فهم ذلك وظنوا أن راعوث قامت بهذه الأفعال في </w:t>
       </w:r>
-      <w:hyperlink r:id="rId19">
+      <w:hyperlink r:id="rId17">
         <w:r>
           <w:rPr>
             <w:lang w:val="ar_AE" w:bidi="ar_AE"/>
@@ -22888,7 +22820,7 @@
         </w:rPr>
         <w:t xml:space="preserve"> ثم أعادتها مرة أخرى في </w:t>
       </w:r>
-      <w:hyperlink r:id="rId18">
+      <w:hyperlink r:id="rId16">
         <w:r>
           <w:rPr>
             <w:lang w:val="ar_AE" w:bidi="ar_AE"/>
@@ -22919,7 +22851,7 @@
         </w:rPr>
         <w:t xml:space="preserve">. أو لتوضيح ترتيب الأحداث بشكل أفضل، يمكنك نقل هذه الجملة إلى نهاية </w:t>
       </w:r>
-      <w:hyperlink r:id="rId18">
+      <w:hyperlink r:id="rId16">
         <w:r>
           <w:rPr>
             <w:lang w:val="ar_AE" w:bidi="ar_AE"/>
@@ -23275,7 +23207,7 @@
         </w:rPr>
         <w:t xml:space="preserve">في </w:t>
       </w:r>
-      <w:hyperlink r:id="rId20">
+      <w:hyperlink r:id="rId18">
         <w:r>
           <w:rPr>
             <w:lang w:val="ar_AE" w:bidi="ar_AE"/>
@@ -24020,7 +23952,7 @@
         </w:rPr>
         <w:t xml:space="preserve">انظر كيف قُمت بترجمة هذا المصطلح في </w:t>
       </w:r>
-      <w:hyperlink r:id="rId17">
+      <w:hyperlink r:id="rId15">
         <w:r>
           <w:rPr>
             <w:lang w:val="ar_AE" w:bidi="ar_AE"/>
@@ -24295,7 +24227,7 @@
         </w:rPr>
         <w:t xml:space="preserve">في </w:t>
       </w:r>
-      <w:hyperlink r:id="rId21">
+      <w:hyperlink r:id="rId19">
         <w:r>
           <w:rPr>
             <w:lang w:val="ar_AE" w:bidi="ar_AE"/>
@@ -24840,7 +24772,7 @@
         </w:rPr>
         <w:t xml:space="preserve"> إلى أن ما ورد في الآية </w:t>
       </w:r>
-      <w:hyperlink r:id="rId22">
+      <w:hyperlink r:id="rId20">
         <w:r>
           <w:rPr>
             <w:lang w:val="ar_AE" w:bidi="ar_AE"/>
@@ -24980,7 +24912,7 @@
         </w:rPr>
         <w:t xml:space="preserve">انظر كيف قُمت بترجمة هذا التعبير في </w:t>
       </w:r>
-      <w:hyperlink r:id="rId21">
+      <w:hyperlink r:id="rId19">
         <w:r>
           <w:rPr>
             <w:lang w:val="ar_AE" w:bidi="ar_AE"/>
@@ -24998,7 +24930,7 @@
         </w:rPr>
         <w:t xml:space="preserve"> و</w:t>
       </w:r>
-      <w:hyperlink r:id="rId22">
+      <w:hyperlink r:id="rId20">
         <w:r>
           <w:rPr>
             <w:lang w:val="ar_AE" w:bidi="ar_AE"/>
@@ -25392,7 +25324,7 @@
         </w:rPr>
         <w:t xml:space="preserve"> إلى أن ما سيأتي بعد ذلك هو أمر آخر مهم يجب على راعوث الانتباه إليه، وكذلك ما ذكره بوعز بقوله "والآن" في </w:t>
       </w:r>
-      <w:hyperlink r:id="rId23">
+      <w:hyperlink r:id="rId21">
         <w:r>
           <w:rPr>
             <w:lang w:val="ar_AE" w:bidi="ar_AE"/>
@@ -25545,7 +25477,7 @@
         </w:rPr>
         <w:t xml:space="preserve">إلى التباين بين استعداد بوعز للزواج من راعوث </w:t>
       </w:r>
-      <w:hyperlink r:id="rId23">
+      <w:hyperlink r:id="rId21">
         <w:r>
           <w:rPr>
             <w:lang w:val="ar_AE" w:bidi="ar_AE"/>
@@ -25563,7 +25495,7 @@
         </w:rPr>
         <w:t xml:space="preserve"> وبين إمكانية زواج رجل آخر منها </w:t>
       </w:r>
-      <w:hyperlink r:id="rId24">
+      <w:hyperlink r:id="rId22">
         <w:r>
           <w:rPr>
             <w:lang w:val="ar_AE" w:bidi="ar_AE"/>
@@ -25730,7 +25662,7 @@
         </w:rPr>
         <w:t xml:space="preserve">في </w:t>
       </w:r>
-      <w:hyperlink r:id="rId17">
+      <w:hyperlink r:id="rId15">
         <w:r>
           <w:rPr>
             <w:lang w:val="ar_AE" w:bidi="ar_AE"/>
@@ -27681,7 +27613,7 @@
         </w:rPr>
         <w:t xml:space="preserve">انظر كيف قُمت بترجمة هذه العبارة في </w:t>
       </w:r>
-      <w:hyperlink r:id="rId25">
+      <w:hyperlink r:id="rId23">
         <w:r>
           <w:rPr>
             <w:lang w:val="ar_AE" w:bidi="ar_AE"/>
@@ -29279,7 +29211,7 @@
         </w:rPr>
         <w:t xml:space="preserve">في </w:t>
       </w:r>
-      <w:hyperlink r:id="rId17">
+      <w:hyperlink r:id="rId15">
         <w:r>
           <w:rPr>
             <w:lang w:val="ar_AE" w:bidi="ar_AE"/>
@@ -33052,7 +32984,7 @@
         </w:rPr>
         <w:t xml:space="preserve">انظر كيف قُمت بترجمة هذه العبارة في </w:t>
       </w:r>
-      <w:hyperlink r:id="rId26">
+      <w:hyperlink r:id="rId24">
         <w:r>
           <w:rPr>
             <w:lang w:val="ar_AE" w:bidi="ar_AE"/>
@@ -33197,7 +33129,7 @@
         </w:rPr>
         <w:t xml:space="preserve">كاسم للإشارة إلى الشخص الذي مات. ربما تستخدم لغتك الصفات بنفس الطريقة. وإلا، فيمكنك ترجمة هذه الكلمة باستخدام عبارة مكافئة. انظر كيف قُمت بترجمتها في </w:t>
       </w:r>
-      <w:hyperlink r:id="rId26">
+      <w:hyperlink r:id="rId24">
         <w:r>
           <w:rPr>
             <w:lang w:val="ar_AE" w:bidi="ar_AE"/>
@@ -35157,7 +35089,7 @@
         </w:rPr>
         <w:t xml:space="preserve"> إلى أن بوعز نفذ ما وعد به في الآية </w:t>
       </w:r>
-      <w:hyperlink r:id="rId27">
+      <w:hyperlink r:id="rId25">
         <w:r>
           <w:rPr>
             <w:lang w:val="ar_AE" w:bidi="ar_AE"/>
@@ -35175,7 +35107,7 @@
         </w:rPr>
         <w:t xml:space="preserve">. استخدم أداة ربط مناسبة في لغتك توضح أن ما يلي هو نتيجة لما سبق. لا تشير هذه العبارة إلى أي شكل من أشكال العنف. إلى جانب العبارة التالية، بل انها تعني ببساطة أن بوعز تزوج من راعوث. استخدم أداة ربط مناسبة تشير إلى أن هذا الفعل من بوعز هو نتيجة للاتفاق المُبرم في الآية </w:t>
       </w:r>
-      <w:hyperlink r:id="rId27">
+      <w:hyperlink r:id="rId25">
         <w:r>
           <w:rPr>
             <w:lang w:val="ar_AE" w:bidi="ar_AE"/>
@@ -35463,7 +35395,7 @@
         </w:rPr>
         <w:t xml:space="preserve"> المدينة كما ورد في </w:t>
       </w:r>
-      <w:hyperlink r:id="rId28">
+      <w:hyperlink r:id="rId26">
         <w:r>
           <w:rPr>
             <w:lang w:val="ar_AE" w:bidi="ar_AE"/>
@@ -37529,7 +37461,7 @@
         </w:rPr>
         <w:t xml:space="preserve">بما أنه قد ذُكر سابقًا أن فارص هو ابن يهوذا، فإن الكاتب يواصل سرد سلسلة النسب المنحدرة من فارص. كانت الآية </w:t>
       </w:r>
-      <w:hyperlink r:id="rId29">
+      <w:hyperlink r:id="rId27">
         <w:r>
           <w:rPr>
             <w:lang w:val="ar_AE" w:bidi="ar_AE"/>
@@ -37547,7 +37479,7 @@
         </w:rPr>
         <w:t xml:space="preserve"> خاتمة قصة نعمي وراعوث، وتبدأ الآية </w:t>
       </w:r>
-      <w:hyperlink r:id="rId30">
+      <w:hyperlink r:id="rId28">
         <w:r>
           <w:rPr>
             <w:lang w:val="ar_AE" w:bidi="ar_AE"/>
@@ -38155,7 +38087,7 @@
         </w:rPr>
         <w:t xml:space="preserve"> في </w:t>
       </w:r>
-      <w:hyperlink r:id="rId29">
+      <w:hyperlink r:id="rId27">
         <w:r>
           <w:rPr>
             <w:lang w:val="ar_AE" w:bidi="ar_AE"/>

</xml_diff>

<commit_message>
Updated translation notes and resources for 1116 files across multiple languages
</commit_message>
<xml_diff>
--- a/arb/docx/08.content.docx
+++ b/arb/docx/08.content.docx
@@ -22,7 +22,7 @@
         <w:rPr>
           <w:lang w:val="ar_AE" w:bidi="ar_AE"/>
         </w:rPr>
-        <w:t>Resource: ملاحظات الترجمة (كلمة متكشفة)</w:t>
+        <w:t>Resource: unfoldingWord® Translation Notes</w:t>
       </w:r>
       <w:r>
         <w:rPr>
@@ -96,7 +96,7 @@
         <w:rPr>
           <w:lang w:val="ar_AE" w:bidi="ar_AE"/>
         </w:rPr>
-        <w:t>ملاحظات الترجمة (كلمة متكشفة)</w:t>
+        <w:t>unfoldingWord® Translation Notes</w:t>
       </w:r>
     </w:p>
     <w:p>

</xml_diff>

<commit_message>
Update Arabic translation notes for 2026-07-06
</commit_message>
<xml_diff>
--- a/arb/docx/08.content.docx
+++ b/arb/docx/08.content.docx
@@ -895,7 +895,7 @@
         <w:rPr>
           <w:lang w:val="ar_AE" w:bidi="ar_AE"/>
         </w:rPr>
-        <w:t>בִּ⁠ימֵי֙ שְׁפֹ֣ט הַ⁠שֹּׁפְטִ֔ים</w:t>
+        <w:t>בִּ⁠ימֵי֙ שְׁפֹ֣ט הַ⁠שֹּׁפְטִ֔ים</w:t>
       </w:r>
     </w:p>
     <w:p>
@@ -1030,7 +1030,7 @@
         <w:rPr>
           <w:lang w:val="ar_AE" w:bidi="ar_AE"/>
         </w:rPr>
-        <w:t>בָּ⁠אָ֑רֶץ</w:t>
+        <w:t>בָּ⁠אָ֑רֶץ</w:t>
       </w:r>
     </w:p>
     <w:p>
@@ -1422,7 +1422,7 @@
         <w:rPr>
           <w:lang w:val="ar_AE" w:bidi="ar_AE"/>
         </w:rPr>
-        <w:t>וַ⁠תִּשָּׁאֵ֥ר הִ֖יא וּ⁠שְׁנֵ֥י בָנֶֽי⁠הָ</w:t>
+        <w:t>וַ⁠תִּשָּׁאֵ֥ר הִ֖יא וּ⁠שְׁנֵ֥י בָנֶֽי⁠הָ</w:t>
       </w:r>
     </w:p>
     <w:p>
@@ -1530,7 +1530,7 @@
         <w:rPr>
           <w:lang w:val="ar_AE" w:bidi="ar_AE"/>
         </w:rPr>
-        <w:t>וַ⁠יִּשְׂא֣וּ לָ⁠הֶ֗ם נָשִׁים֙</w:t>
+        <w:t>וַ⁠יִּשְׂא֣וּ לָ⁠הֶ֗ם נָשִׁים֙</w:t>
       </w:r>
     </w:p>
     <w:p>
@@ -1665,7 +1665,7 @@
         <w:rPr>
           <w:lang w:val="ar_AE" w:bidi="ar_AE"/>
         </w:rPr>
-        <w:t>שֵׁ֤ם הָֽ⁠אַחַת֙ עָרְפָּ֔ה וְ⁠שֵׁ֥ם הַ⁠שֵּׁנִ֖ית ר֑וּת</w:t>
+        <w:t>שֵׁ֤ם הָֽ⁠אַחַת֙ עָרְפָּ֔ה וְ⁠שֵׁ֥ם הַ⁠שֵּׁנִ֖ית ר֑וּת</w:t>
       </w:r>
     </w:p>
     <w:p>
@@ -1765,7 +1765,7 @@
         <w:rPr>
           <w:lang w:val="ar_AE" w:bidi="ar_AE"/>
         </w:rPr>
-        <w:t>וַ⁠תִּשָּׁאֵר֙ הָֽ⁠אִשָּׁ֔ה מִ⁠שְּׁנֵ֥י יְלָדֶ֖י⁠הָ וּ⁠מֵ⁠אִישָֽׁ⁠הּ</w:t>
+        <w:t>וַ⁠תִּשָּׁאֵר֙ הָֽ⁠אִשָּׁ֔ה מִ⁠שְּׁנֵ֥י יְלָדֶ֖י⁠הָ וּ⁠מֵ⁠אִישָֽׁ⁠הּ</w:t>
       </w:r>
     </w:p>
     <w:p>
@@ -1887,7 +1887,7 @@
         <w:rPr>
           <w:lang w:val="ar_AE" w:bidi="ar_AE"/>
         </w:rPr>
-        <w:t>וַ⁠תָּ֤קָם הִיא֙ וְ⁠כַלֹּתֶ֔י⁠הָ וַ⁠תָּ֖שָׁב</w:t>
+        <w:t>וַ⁠תָּ֤קָם הִיא֙ וְ⁠כַלֹּתֶ֔י⁠הָ וַ⁠תָּ֖שָׁב</w:t>
       </w:r>
     </w:p>
     <w:p>
@@ -2009,7 +2009,7 @@
         <w:rPr>
           <w:lang w:val="ar_AE" w:bidi="ar_AE"/>
         </w:rPr>
-        <w:t>וַ⁠תָּ֤קָם הִיא֙ וְ⁠כַלֹּתֶ֔י⁠הָ וַ⁠תָּ֖שָׁב</w:t>
+        <w:t>וַ⁠תָּ֤קָם הִיא֙ וְ⁠כַלֹּתֶ֔י⁠הָ וַ⁠תָּ֖שָׁב</w:t>
       </w:r>
     </w:p>
     <w:p>
@@ -2241,7 +2241,7 @@
         <w:rPr>
           <w:lang w:val="ar_AE" w:bidi="ar_AE"/>
         </w:rPr>
-        <w:t>כִּ֤י שָֽׁמְעָה֙ בִּ⁠שְׂדֵ֣ה מוֹאָ֔ב כִּֽי־פָקַ֤ד יְהוָה֙ אֶת־עַמּ֔⁠וֹ לָ⁠תֵ֥ת לָ⁠הֶ֖ם לָֽחֶם</w:t>
+        <w:t>כִּ֤י שָֽׁמְעָה֙ בִּ⁠שְׂדֵ֣ה מוֹאָ֔ב כִּֽי־פָקַ֤ד יְהוָה֙ אֶת־עַמּ֔⁠וֹ לָ⁠תֵ֥ת לָ⁠הֶ֖ם לָֽחֶם</w:t>
       </w:r>
     </w:p>
     <w:p>
@@ -2363,7 +2363,7 @@
         <w:rPr>
           <w:lang w:val="ar_AE" w:bidi="ar_AE"/>
         </w:rPr>
-        <w:t>שָֽׁמְעָה֙ בִּ⁠שְׂדֵ֣ה מוֹאָ֔ב</w:t>
+        <w:t>שָֽׁמְעָה֙ בִּ⁠שְׂדֵ֣ה מוֹאָ֔ב</w:t>
       </w:r>
     </w:p>
     <w:p>
@@ -2936,7 +2936,7 @@
         <w:rPr>
           <w:lang w:val="ar_AE" w:bidi="ar_AE"/>
         </w:rPr>
-        <w:t>לֵ֣כְנָה שֹּׁ֔בְנָה אִשָּׁ֖ה</w:t>
+        <w:t>לֵ֣כְנָה שֹּׁ֔בְנָה אִשָּׁ֖ה</w:t>
       </w:r>
     </w:p>
     <w:p>
@@ -3058,7 +3058,7 @@
         <w:rPr>
           <w:lang w:val="ar_AE" w:bidi="ar_AE"/>
         </w:rPr>
-        <w:t>לֵ֣כְנָה שֹּׁ֔בְנָה אִשָּׁ֖ה לְ⁠בֵ֣ית אִמָּ֑⁠הּ</w:t>
+        <w:t>לֵ֣כְנָה שֹּׁ֔בְנָה אִשָּׁ֖ה לְ⁠בֵ֣ית אִמָּ֑⁠הּ</w:t>
       </w:r>
     </w:p>
     <w:p>
@@ -3242,7 +3242,7 @@
         <w:rPr>
           <w:lang w:val="ar_AE" w:bidi="ar_AE"/>
         </w:rPr>
-        <w:t>יעשה יְהוָ֤ה עִמָּ⁠כֶם֙ חֶ֔סֶד כַּ⁠אֲשֶׁ֧ר עֲשִׂיתֶ֛ם עִם־הַ⁠מֵּתִ֖ים וְ⁠עִמָּדִֽ⁠י</w:t>
+        <w:t>יעשה יְהוָ֤ה עִמָּ⁠כֶם֙ חֶ֔סֶד כַּ⁠אֲשֶׁ֧ר עֲשִׂיתֶ֛ם עִם־הַ⁠מֵּתִ֖ים וְ⁠עִמָּדִֽ⁠י</w:t>
       </w:r>
     </w:p>
     <w:p>
@@ -3364,7 +3364,7 @@
         <w:rPr>
           <w:lang w:val="ar_AE" w:bidi="ar_AE"/>
         </w:rPr>
-        <w:t>עִם־הַ⁠מֵּתִ֖ים</w:t>
+        <w:t>עִם־הַ⁠מֵּתִ֖ים</w:t>
       </w:r>
     </w:p>
     <w:p>
@@ -3875,7 +3875,7 @@
         <w:rPr>
           <w:lang w:val="ar_AE" w:bidi="ar_AE"/>
         </w:rPr>
-        <w:t>בֵּ֣ית אִישָׁ֑⁠הּ</w:t>
+        <w:t>בֵּ֣ית אִישָׁ֑⁠הּ</w:t>
       </w:r>
     </w:p>
     <w:p>
@@ -4010,7 +4010,7 @@
         <w:rPr>
           <w:lang w:val="ar_AE" w:bidi="ar_AE"/>
         </w:rPr>
-        <w:t>וַ⁠תִּשֶּׂ֥אנָה קוֹלָ֖⁠ן וַ⁠תִּבְכֶּֽינָה</w:t>
+        <w:t>וַ⁠תִּשֶּׂ֥אנָה קוֹלָ֖⁠ן וַ⁠תִּבְכֶּֽינָה</w:t>
       </w:r>
     </w:p>
     <w:p>
@@ -4280,7 +4280,7 @@
         <w:rPr>
           <w:lang w:val="ar_AE" w:bidi="ar_AE"/>
         </w:rPr>
-        <w:t>וַ⁠תֹּאמַ֖רְנָה</w:t>
+        <w:t>וַ⁠תֹּאמַ֖רְנָה</w:t>
       </w:r>
     </w:p>
     <w:p>
@@ -4428,7 +4428,7 @@
         <w:rPr>
           <w:lang w:val="ar_AE" w:bidi="ar_AE"/>
         </w:rPr>
-        <w:t>כִּי</w:t>
+        <w:t>כִּי</w:t>
       </w:r>
     </w:p>
     <w:p>
@@ -4549,7 +4549,7 @@
         <w:rPr>
           <w:lang w:val="ar_AE" w:bidi="ar_AE"/>
         </w:rPr>
-        <w:t>אִתָּ֥⁠ךְ</w:t>
+        <w:t>אִתָּ֥⁠ךְ</w:t>
       </w:r>
     </w:p>
     <w:p>
@@ -4671,7 +4671,7 @@
         <w:rPr>
           <w:lang w:val="ar_AE" w:bidi="ar_AE"/>
         </w:rPr>
-        <w:t>וַ⁠תֹּ֤אמֶר נָעֳמִי֙</w:t>
+        <w:t>וַ⁠תֹּ֤אמֶר נָעֳמִי֙</w:t>
       </w:r>
     </w:p>
     <w:p>
@@ -4958,7 +4958,7 @@
         <w:rPr>
           <w:lang w:val="ar_AE" w:bidi="ar_AE"/>
         </w:rPr>
-        <w:t>לָ֥⁠מָּה תֵלַ֖כְנָה עִמִּ֑⁠י</w:t>
+        <w:t>לָ֥⁠מָּה תֵלַ֖כְנָה עִמִּ֑⁠י</w:t>
       </w:r>
     </w:p>
     <w:p>
@@ -5080,7 +5080,7 @@
         <w:rPr>
           <w:lang w:val="ar_AE" w:bidi="ar_AE"/>
         </w:rPr>
-        <w:t>הַֽ⁠עֽוֹד־לִ֤⁠י בָנִים֙ בְּֽ⁠מֵעַ֔⁠י וְ⁠הָי֥וּ לָ⁠כֶ֖ם לַ⁠אֲנָשִֽׁים</w:t>
+        <w:t>הַֽ⁠עֽוֹד־לִ֤⁠י בָנִים֙ בְּֽ⁠מֵעַ֔⁠י וְ⁠הָי֥וּ לָ⁠כֶ֖ם לַ⁠אֲנָשִֽׁים</w:t>
       </w:r>
     </w:p>
     <w:p>
@@ -5202,7 +5202,7 @@
         <w:rPr>
           <w:lang w:val="ar_AE" w:bidi="ar_AE"/>
         </w:rPr>
-        <w:t>זָקַ֖נְתִּי מִ⁠הְי֣וֹת לְ⁠אִ֑ישׁ</w:t>
+        <w:t>זָקַ֖נְתִּי מִ⁠הְי֣וֹת לְ⁠אִ֑ישׁ</w:t>
       </w:r>
     </w:p>
     <w:p>
@@ -5324,7 +5324,7 @@
         <w:rPr>
           <w:lang w:val="ar_AE" w:bidi="ar_AE"/>
         </w:rPr>
-        <w:t>כִּ֤י אָמַ֨רְתִּי֙ יֶשׁ־לִ֣⁠י תִקְוָ֔ה גַּ֣ם הָיִ֤יתִי הַ⁠לַּ֨יְלָה֙ לְ⁠אִ֔ישׁ וְ⁠גַ֖ם יָלַ֥דְתִּי בָנִֽים</w:t>
+        <w:t>כִּ֤י אָמַ֨רְתִּי֙ יֶשׁ־לִ֣⁠י תִקְוָ֔ה גַּ֣ם הָיִ֤יתִי הַ⁠לַּ֨יְלָה֙ לְ⁠אִ֔ישׁ וְ⁠גַ֖ם יָלַ֥דְתִּי בָנִֽים</w:t>
       </w:r>
     </w:p>
     <w:p>
@@ -5530,7 +5530,7 @@
         <w:rPr>
           <w:lang w:val="ar_AE" w:bidi="ar_AE"/>
         </w:rPr>
-        <w:t>הֲ⁠לָהֵ֣ן ׀ תְּשַׂבֵּ֗רְנָה עַ֚ד אֲשֶׁ֣ר יִגְדָּ֔לוּ הֲ⁠לָהֵן֙ תֵּֽעָגֵ֔נָה לְ⁠בִלְתִּ֖י הֱי֣וֹת לְ⁠אִ֑ישׁ</w:t>
+        <w:t>הֲ⁠לָהֵ֣ן ׀ תְּשַׂבֵּ֗רְנָה עַ֚ד אֲשֶׁ֣ר יִגְדָּ֔לוּ הֲ⁠לָהֵן֙ תֵּֽעָגֵ֔נָה לְ⁠בִלְתִּ֖י הֱי֣וֹת לְ⁠אִ֑ישׁ</w:t>
       </w:r>
     </w:p>
     <w:p>
@@ -5652,7 +5652,7 @@
         <w:rPr>
           <w:lang w:val="ar_AE" w:bidi="ar_AE"/>
         </w:rPr>
-        <w:t>הֲ⁠לָהֵ֣ן ׀ תְּשַׂבֵּ֗רְנָה עַ֚ד אֲשֶׁ֣ר יִגְדָּ֔לוּ הֲ⁠לָהֵן֙ תֵּֽעָגֵ֔נָה לְ⁠בִלְתִּ֖י הֱי֣וֹת לְ⁠אִ֑ישׁ</w:t>
+        <w:t>הֲ⁠לָהֵ֣ן ׀ תְּשַׂבֵּ֗רְנָה עַ֚ד אֲשֶׁ֣ר יִגְדָּ֔לוּ הֲ⁠לָהֵן֙ תֵּֽעָגֵ֔נָה לְ⁠בִלְתִּ֖י הֱי֣וֹת לְ⁠אִ֑ישׁ</w:t>
       </w:r>
     </w:p>
     <w:p>
@@ -6131,7 +6131,7 @@
         <w:rPr>
           <w:lang w:val="ar_AE" w:bidi="ar_AE"/>
         </w:rPr>
-        <w:t>וַ⁠תִּשֶּׂ֣נָה קוֹלָ֔⁠ן וַ⁠תִּבְכֶּ֖ינָה</w:t>
+        <w:t>וַ⁠תִּשֶּׂ֣נָה קוֹלָ֔⁠ן וַ⁠תִּבְכֶּ֖ינָה</w:t>
       </w:r>
     </w:p>
     <w:p>
@@ -6266,7 +6266,7 @@
         <w:rPr>
           <w:lang w:val="ar_AE" w:bidi="ar_AE"/>
         </w:rPr>
-        <w:t>וְ⁠ר֖וּת דָּ֥בְקָה בָּֽ⁠הּ</w:t>
+        <w:t>וְ⁠ר֖וּת דָּ֥בְקָה בָּֽ⁠הּ</w:t>
       </w:r>
     </w:p>
     <w:p>
@@ -6388,7 +6388,7 @@
         <w:rPr>
           <w:lang w:val="ar_AE" w:bidi="ar_AE"/>
         </w:rPr>
-        <w:t>הִנֵּה֙</w:t>
+        <w:t>הִנֵּה֙</w:t>
       </w:r>
     </w:p>
     <w:p>
@@ -6642,7 +6642,7 @@
         <w:rPr>
           <w:lang w:val="ar_AE" w:bidi="ar_AE"/>
         </w:rPr>
-        <w:t>עַמָּ֖⁠הּ</w:t>
+        <w:t>עַמָּ֖⁠הּ</w:t>
       </w:r>
     </w:p>
     <w:p>
@@ -7304,7 +7304,7 @@
         <w:rPr>
           <w:lang w:val="ar_AE" w:bidi="ar_AE"/>
         </w:rPr>
-        <w:t>עַמֵּ֣⁠ךְ עַמִּ֔⁠י וֵ⁠אלֹהַ֖יִ⁠ךְ אֱלֹהָֽ⁠י</w:t>
+        <w:t>עַמֵּ֣⁠ךְ עַמִּ֔⁠י וֵ⁠אלֹהַ֖יִ⁠ךְ אֱלֹהָֽ⁠י</w:t>
       </w:r>
     </w:p>
     <w:p>
@@ -7426,7 +7426,7 @@
         <w:rPr>
           <w:lang w:val="ar_AE" w:bidi="ar_AE"/>
         </w:rPr>
-        <w:t>כֹּה֩ יַעֲשֶׂ֨ה יְהוָ֥ה לִ⁠י֙ וְ⁠כֹ֣ה יֹסִ֔יף</w:t>
+        <w:t>כֹּה֩ יַעֲשֶׂ֨ה יְהוָ֥ה לִ⁠י֙ וְ⁠כֹ֣ה יֹסִ֔יף</w:t>
       </w:r>
     </w:p>
     <w:p>
@@ -7548,7 +7548,7 @@
         <w:rPr>
           <w:lang w:val="ar_AE" w:bidi="ar_AE"/>
         </w:rPr>
-        <w:t>כִּ֣י הַ⁠מָּ֔וֶת יַפְרִ֖יד בֵּינִ֥⁠י וּ⁠בֵינֵֽ⁠ךְ</w:t>
+        <w:t>כִּ֣י הַ⁠מָּ֔וֶת יַפְרִ֖יד בֵּינִ֥⁠י וּ⁠בֵינֵֽ⁠ךְ</w:t>
       </w:r>
     </w:p>
     <w:p>
@@ -7670,7 +7670,7 @@
         <w:rPr>
           <w:lang w:val="ar_AE" w:bidi="ar_AE"/>
         </w:rPr>
-        <w:t>יַפְרִ֖יד בֵּינִ֥⁠י וּ⁠בֵינֵֽ⁠ךְ</w:t>
+        <w:t>יַפְרִ֖יד בֵּינִ֥⁠י וּ⁠בֵינֵֽ⁠ךְ</w:t>
       </w:r>
     </w:p>
     <w:p>
@@ -7792,7 +7792,7 @@
         <w:rPr>
           <w:lang w:val="ar_AE" w:bidi="ar_AE"/>
         </w:rPr>
-        <w:t>וַ⁠תֶּחְדַּ֖ל לְ⁠דַבֵּ֥ר אֵלֶֽי⁠הָ</w:t>
+        <w:t>וַ⁠תֶּחְדַּ֖ל לְ⁠דַבֵּ֥ר אֵלֶֽי⁠הָ</w:t>
       </w:r>
     </w:p>
     <w:p>
@@ -7914,7 +7914,7 @@
         <w:rPr>
           <w:lang w:val="ar_AE" w:bidi="ar_AE"/>
         </w:rPr>
-        <w:t>וַ⁠תֶּחְדַּ֖ל לְ⁠דַבֵּ֥ר אֵלֶֽי⁠הָ</w:t>
+        <w:t>וַ⁠תֶּחְדַּ֖ל לְ⁠דַבֵּ֥ר אֵלֶֽי⁠הָ</w:t>
       </w:r>
     </w:p>
     <w:p>
@@ -8184,7 +8184,7 @@
         <w:rPr>
           <w:lang w:val="ar_AE" w:bidi="ar_AE"/>
         </w:rPr>
-        <w:t>כְּ⁠בֹאָ֨⁠נָה֙ בֵּ֣ית לֶ֔חֶם</w:t>
+        <w:t>כְּ⁠בֹאָ֨⁠נָה֙ בֵּ֣ית לֶ֔חֶם</w:t>
       </w:r>
     </w:p>
     <w:p>
@@ -8306,7 +8306,7 @@
         <w:rPr>
           <w:lang w:val="ar_AE" w:bidi="ar_AE"/>
         </w:rPr>
-        <w:t>כָּל־הָ⁠עִיר֙</w:t>
+        <w:t>כָּל־הָ⁠עִיר֙</w:t>
       </w:r>
     </w:p>
     <w:p>
@@ -8441,7 +8441,7 @@
         <w:rPr>
           <w:lang w:val="ar_AE" w:bidi="ar_AE"/>
         </w:rPr>
-        <w:t>כָּל־הָ⁠עִיר֙</w:t>
+        <w:t>כָּל־הָ⁠עִיר֙</w:t>
       </w:r>
     </w:p>
     <w:p>
@@ -8698,7 +8698,7 @@
         <w:rPr>
           <w:lang w:val="ar_AE" w:bidi="ar_AE"/>
         </w:rPr>
-        <w:t>אַל־תִּקְרֶ֥אנָה לִ֖⁠י נָעֳמִ֑י</w:t>
+        <w:t>אַל־תִּקְרֶ֥אנָה לִ֖⁠י נָעֳמִ֑י</w:t>
       </w:r>
     </w:p>
     <w:p>
@@ -8968,7 +8968,7 @@
         <w:rPr>
           <w:lang w:val="ar_AE" w:bidi="ar_AE"/>
         </w:rPr>
-        <w:t>אֲנִי֙ מְלֵאָ֣ה הָלַ֔כְתִּי וְ⁠רֵיקָ֖ם הֱשִׁיבַ֣⁠נִי יְהוָ֑ה</w:t>
+        <w:t>אֲנִי֙ מְלֵאָ֣ה הָלַ֔כְתִּי וְ⁠רֵיקָ֖ם הֱשִׁיבַ֣⁠נִי יְהוָ֑ה</w:t>
       </w:r>
     </w:p>
     <w:p>
@@ -9116,7 +9116,7 @@
         <w:rPr>
           <w:lang w:val="ar_AE" w:bidi="ar_AE"/>
         </w:rPr>
-        <w:t>לָ֣⁠מָּה תִקְרֶ֤אנָה לִ⁠י֙ נָעֳמִ֔י</w:t>
+        <w:t>לָ֣⁠מָּה תִקְרֶ֤אנָה לִ⁠י֙ נָעֳמִ֔י</w:t>
       </w:r>
     </w:p>
     <w:p>
@@ -9238,7 +9238,7 @@
         <w:rPr>
           <w:lang w:val="ar_AE" w:bidi="ar_AE"/>
         </w:rPr>
-        <w:t>וַֽ⁠יהוָה֙ עָ֣נָה בִ֔⁠י וְ⁠שַׁדַּ֖י הֵ֥רַֽע לִֽ⁠י</w:t>
+        <w:t>וַֽ⁠יהוָה֙ עָ֣נָה בִ֔⁠י וְ⁠שַׁדַּ֖י הֵ֥רַֽע לִֽ⁠י</w:t>
       </w:r>
     </w:p>
     <w:p>
@@ -9605,7 +9605,7 @@
         <w:rPr>
           <w:lang w:val="ar_AE" w:bidi="ar_AE"/>
         </w:rPr>
-        <w:t>וַ⁠תָּ֣שָׁב נָעֳמִ֗י וְ⁠ר֨וּת הַ⁠מּוֹאֲבִיָּ֤ה כַלָּתָ⁠הּ֙ עִמָּ֔⁠הּ הַ⁠שָּׁ֖בָה מִ⁠שְּׂדֵ֣י מוֹאָ֑ב</w:t>
+        <w:t>וַ⁠תָּ֣שָׁב נָעֳמִ֗י וְ⁠ר֨וּת הַ⁠מּוֹאֲבִיָּ֤ה כַלָּתָ⁠הּ֙ עִמָּ֔⁠הּ הַ⁠שָּׁ֖בָה מִ⁠שְּׂדֵ֣י מוֹאָ֑ב</w:t>
       </w:r>
     </w:p>
     <w:p>
@@ -9727,7 +9727,7 @@
         <w:rPr>
           <w:lang w:val="ar_AE" w:bidi="ar_AE"/>
         </w:rPr>
-        <w:t>וְ⁠הֵ֗מָּה בָּ֚אוּ בֵּ֣ית לֶ֔חֶם בִּ⁠תְחִלַּ֖ת קְצִ֥יר שְׂעֹרִֽים</w:t>
+        <w:t>וְ⁠הֵ֗מָּה בָּ֚אוּ בֵּ֣ית לֶ֔חֶם בִּ⁠תְחִלַּ֖ת קְצִ֥יר שְׂעֹרִֽים</w:t>
       </w:r>
     </w:p>
     <w:p>
@@ -9849,7 +9849,7 @@
         <w:rPr>
           <w:lang w:val="ar_AE" w:bidi="ar_AE"/>
         </w:rPr>
-        <w:t>בִּ⁠תְחִלַּ֖ת קְצִ֥יר שְׂעֹרִֽים</w:t>
+        <w:t>בִּ⁠תְחִלַּ֖ת קְצִ֥יר שְׂעֹרִֽים</w:t>
       </w:r>
     </w:p>
     <w:p>
@@ -9984,7 +9984,7 @@
         <w:rPr>
           <w:lang w:val="ar_AE" w:bidi="ar_AE"/>
         </w:rPr>
-        <w:t>וּֽ⁠לְ⁠נָעֳמִ֞י מוֹדַ֣ע לְ⁠אִישָׁ֗⁠הּ</w:t>
+        <w:t>וּֽ⁠לְ⁠נָעֳמִ֞י מוֹדַ֣ע לְ⁠אִישָׁ֗⁠הּ</w:t>
       </w:r>
     </w:p>
     <w:p>
@@ -10106,7 +10106,7 @@
         <w:rPr>
           <w:lang w:val="ar_AE" w:bidi="ar_AE"/>
         </w:rPr>
-        <w:t>וּֽ⁠לְ⁠נָעֳמִ֞י מוֹדַ֣ע לְ⁠אִישָׁ֗⁠הּ</w:t>
+        <w:t>וּֽ⁠לְ⁠נָעֳמִ֞י מוֹדַ֣ע לְ⁠אִישָׁ֗⁠הּ</w:t>
       </w:r>
     </w:p>
     <w:p>
@@ -10241,7 +10241,7 @@
         <w:rPr>
           <w:lang w:val="ar_AE" w:bidi="ar_AE"/>
         </w:rPr>
-        <w:t>אִ֚ישׁ גִּבּ֣וֹר חַ֔יִל</w:t>
+        <w:t>אִ֚ישׁ גִּבּ֣וֹר חַ֔יִל</w:t>
       </w:r>
     </w:p>
     <w:p>
@@ -10376,7 +10376,7 @@
         <w:rPr>
           <w:lang w:val="ar_AE" w:bidi="ar_AE"/>
         </w:rPr>
-        <w:t>מִ⁠מִּשְׁפַּ֖חַת אֱלִימֶ֑לֶךְ</w:t>
+        <w:t>מִ⁠מִּשְׁפַּ֖חַת אֱלִימֶ֑לֶךְ</w:t>
       </w:r>
     </w:p>
     <w:p>
@@ -10511,7 +10511,7 @@
         <w:rPr>
           <w:lang w:val="ar_AE" w:bidi="ar_AE"/>
         </w:rPr>
-        <w:t>ר֨וּת הַ⁠מּוֹאֲבִיָּ֜ה</w:t>
+        <w:t>ר֨וּת הַ⁠מּוֹאֲבִיָּ֜ה</w:t>
       </w:r>
     </w:p>
     <w:p>
@@ -10717,7 +10717,7 @@
         <w:rPr>
           <w:lang w:val="ar_AE" w:bidi="ar_AE"/>
         </w:rPr>
-        <w:t>אֲשֶׁ֥ר אֶמְצָא־חֵ֖ן בְּ⁠עֵינָ֑י⁠ו</w:t>
+        <w:t>אֲשֶׁ֥ר אֶמְצָא־חֵ֖ן בְּ⁠עֵינָ֑י⁠ו</w:t>
       </w:r>
     </w:p>
     <w:p>
@@ -10852,7 +10852,7 @@
         <w:rPr>
           <w:lang w:val="ar_AE" w:bidi="ar_AE"/>
         </w:rPr>
-        <w:t>בִתִּֽ⁠י</w:t>
+        <w:t>בִתִּֽ⁠י</w:t>
       </w:r>
     </w:p>
     <w:p>
@@ -10974,7 +10974,7 @@
         <w:rPr>
           <w:lang w:val="ar_AE" w:bidi="ar_AE"/>
         </w:rPr>
-        <w:t>וַ⁠יִּ֣קֶר מִקְרֶ֔⁠הָ</w:t>
+        <w:t>וַ⁠יִּ֣קֶר מִקְרֶ֔⁠הָ</w:t>
       </w:r>
     </w:p>
     <w:p>
@@ -11109,7 +11109,7 @@
         <w:rPr>
           <w:lang w:val="ar_AE" w:bidi="ar_AE"/>
         </w:rPr>
-        <w:t>מִ⁠מִּשְׁפַּ֥חַת אֱלִימֶֽלֶךְ</w:t>
+        <w:t>מִ⁠מִּשְׁפַּ֥חַת אֱלִימֶֽלֶךְ</w:t>
       </w:r>
     </w:p>
     <w:p>
@@ -11244,7 +11244,7 @@
         <w:rPr>
           <w:lang w:val="ar_AE" w:bidi="ar_AE"/>
         </w:rPr>
-        <w:t>וְ⁠הִנֵּה</w:t>
+        <w:t>וְ⁠הִנֵּה</w:t>
       </w:r>
     </w:p>
     <w:p>
@@ -11379,7 +11379,7 @@
         <w:rPr>
           <w:lang w:val="ar_AE" w:bidi="ar_AE"/>
         </w:rPr>
-        <w:t>בָּ֚א מִ⁠בֵּ֣ית לֶ֔חֶם</w:t>
+        <w:t>בָּ֚א מִ⁠בֵּ֣ית לֶ֔חֶם</w:t>
       </w:r>
     </w:p>
     <w:p>
@@ -11487,7 +11487,7 @@
         <w:rPr>
           <w:lang w:val="ar_AE" w:bidi="ar_AE"/>
         </w:rPr>
-        <w:t>יְהוָ֣ה עִמָּ⁠כֶ֑ם</w:t>
+        <w:t>יְהוָ֣ה עִמָּ⁠כֶ֑ם</w:t>
       </w:r>
     </w:p>
     <w:p>
@@ -11834,7 +11834,7 @@
         <w:rPr>
           <w:lang w:val="ar_AE" w:bidi="ar_AE"/>
         </w:rPr>
-        <w:t>לְ⁠מִ֖י הַ⁠נַּעֲרָ֥ה הַ⁠זֹּֽאת</w:t>
+        <w:t>לְ⁠מִ֖י הַ⁠נַּעֲרָ֥ה הַ⁠זֹּֽאת</w:t>
       </w:r>
     </w:p>
     <w:p>
@@ -11956,7 +11956,7 @@
         <w:rPr>
           <w:lang w:val="ar_AE" w:bidi="ar_AE"/>
         </w:rPr>
-        <w:t>וַ⁠יַּ֗עַן &amp; וַ⁠יֹּאמַ֑ר</w:t>
+        <w:t>וַ⁠יַּ֗עַן &amp; וַ⁠יֹּאמַ֑ר</w:t>
       </w:r>
     </w:p>
     <w:p>
@@ -12118,7 +12118,7 @@
         <w:rPr>
           <w:lang w:val="ar_AE" w:bidi="ar_AE"/>
         </w:rPr>
-        <w:t>וַ⁠תֹּ֗אמֶר אֲלַקֳטָה־נָּא֙ וְ⁠אָסַפְתִּ֣י בָֽ⁠עֳמָרִ֔ים אַחֲרֵ֖י הַ⁠קּוֹצְרִ֑ים</w:t>
+        <w:t>וַ⁠תֹּ֗אמֶר אֲלַקֳטָה־נָּא֙ וְ⁠אָסַפְתִּ֣י בָֽ⁠עֳמָרִ֔ים אַחֲרֵ֖י הַ⁠קּוֹצְרִ֑ים</w:t>
       </w:r>
     </w:p>
     <w:p>
@@ -12240,7 +12240,7 @@
         <w:rPr>
           <w:lang w:val="ar_AE" w:bidi="ar_AE"/>
         </w:rPr>
-        <w:t>אֲלַקֳטָה־נָּא֙ וְ⁠אָסַפְתִּ֣י</w:t>
+        <w:t>אֲלַקֳטָה־נָּא֙ וְ⁠אָסַפְתִּ֣י</w:t>
       </w:r>
     </w:p>
     <w:p>
@@ -12514,7 +12514,7 @@
         <w:rPr>
           <w:lang w:val="ar_AE" w:bidi="ar_AE"/>
         </w:rPr>
-        <w:t>הֲ⁠ל֧וֹא שָׁמַ֣עַתְּ בִּתִּ֗⁠י</w:t>
+        <w:t>הֲ⁠ל֧וֹא שָׁמַ֣עַתְּ בִּתִּ֗⁠י</w:t>
       </w:r>
     </w:p>
     <w:p>
@@ -12636,7 +12636,7 @@
         <w:rPr>
           <w:lang w:val="ar_AE" w:bidi="ar_AE"/>
         </w:rPr>
-        <w:t>בִּתִּ֗⁠י</w:t>
+        <w:t>בִּתִּ֗⁠י</w:t>
       </w:r>
     </w:p>
     <w:p>
@@ -12771,7 +12771,7 @@
         <w:rPr>
           <w:lang w:val="ar_AE" w:bidi="ar_AE"/>
         </w:rPr>
-        <w:t>עֵינַ֜יִ⁠ךְ בַּ⁠שָּׂדֶ֤ה</w:t>
+        <w:t>עֵינַ֜יִ⁠ךְ בַּ⁠שָּׂדֶ֤ה</w:t>
       </w:r>
     </w:p>
     <w:p>
@@ -13028,7 +13028,7 @@
         <w:rPr>
           <w:lang w:val="ar_AE" w:bidi="ar_AE"/>
         </w:rPr>
-        <w:t>הֲ⁠ל֥וֹא צִוִּ֛יתִי אֶת־הַ⁠נְּעָרִ֖ים לְ⁠בִלְתִּ֣י נָגְעֵ֑⁠ךְ</w:t>
+        <w:t>הֲ⁠ל֥וֹא צִוִּ֛יתִי אֶת־הַ⁠נְּעָרִ֖ים לְ⁠בִלְתִּ֣י נָגְעֵ֑⁠ךְ</w:t>
       </w:r>
     </w:p>
     <w:p>
@@ -13150,7 +13150,7 @@
         <w:rPr>
           <w:lang w:val="ar_AE" w:bidi="ar_AE"/>
         </w:rPr>
-        <w:t>אֶת־הַ⁠נְּעָרִ֖ים</w:t>
+        <w:t>אֶת־הַ⁠נְּעָרִ֖ים</w:t>
       </w:r>
     </w:p>
     <w:p>
@@ -13272,7 +13272,7 @@
         <w:rPr>
           <w:lang w:val="ar_AE" w:bidi="ar_AE"/>
         </w:rPr>
-        <w:t>לְ⁠בִלְתִּ֣י נָגְעֵ֑⁠ךְ</w:t>
+        <w:t>לְ⁠בִלְתִּ֣י נָגְעֵ֑⁠ךְ</w:t>
       </w:r>
     </w:p>
     <w:p>
@@ -13491,7 +13491,7 @@
         <w:rPr>
           <w:lang w:val="ar_AE" w:bidi="ar_AE"/>
         </w:rPr>
-        <w:t>וַ⁠תִּפֹּל֙ עַל־פָּנֶ֔י⁠הָ וַ⁠תִּשְׁתַּ֖חוּ אָ֑רְצָ⁠ה</w:t>
+        <w:t>וַ⁠תִּפֹּל֙ עַל־פָּנֶ֔י⁠הָ וַ⁠תִּשְׁתַּ֖חוּ אָ֑רְצָ⁠ה</w:t>
       </w:r>
     </w:p>
     <w:p>
@@ -13613,7 +13613,7 @@
         <w:rPr>
           <w:lang w:val="ar_AE" w:bidi="ar_AE"/>
         </w:rPr>
-        <w:t>וַ⁠תִּפֹּל֙ עַל־פָּנֶ֔י⁠הָ וַ⁠תִּשְׁתַּ֖חוּ אָ֑רְצָ⁠ה</w:t>
+        <w:t>וַ⁠תִּפֹּל֙ עַל־פָּנֶ֔י⁠הָ וַ⁠תִּשְׁתַּ֖חוּ אָ֑רְצָ⁠ה</w:t>
       </w:r>
     </w:p>
     <w:p>
@@ -13761,7 +13761,7 @@
         <w:rPr>
           <w:lang w:val="ar_AE" w:bidi="ar_AE"/>
         </w:rPr>
-        <w:t>וַ⁠תִּפֹּל֙ עַל־פָּנֶ֔י⁠הָ וַ⁠תִּשְׁתַּ֖חוּ אָ֑רְצָ⁠ה</w:t>
+        <w:t>וַ⁠תִּפֹּל֙ עַל־פָּנֶ֔י⁠הָ וַ⁠תִּשְׁתַּ֖חוּ אָ֑רְצָ⁠ה</w:t>
       </w:r>
     </w:p>
     <w:p>
@@ -13896,7 +13896,7 @@
         <w:rPr>
           <w:lang w:val="ar_AE" w:bidi="ar_AE"/>
         </w:rPr>
-        <w:t>מַדּוּעַ֩ מָצָ֨אתִי חֵ֤ן בְּ⁠עֵינֶ֨י⁠ךָ֙ לְ⁠הַכִּירֵ֔⁠נִי וְ⁠אָּנֹכִ֖י נָכְרִיָּֽה</w:t>
+        <w:t>מַדּוּעַ֩ מָצָ֨אתִי חֵ֤ן בְּ⁠עֵינֶ֨י⁠ךָ֙ לְ⁠הַכִּירֵ֔⁠נִי וְ⁠אָּנֹכִ֖י נָכְרִיָּֽה</w:t>
       </w:r>
     </w:p>
     <w:p>
@@ -14018,7 +14018,7 @@
         <w:rPr>
           <w:lang w:val="ar_AE" w:bidi="ar_AE"/>
         </w:rPr>
-        <w:t>מָצָ֨אתִי חֵ֤ן בְּ⁠עֵינֶ֨י⁠ךָ֙</w:t>
+        <w:t>מָצָ֨אתִי חֵ֤ן בְּ⁠עֵינֶ֨י⁠ךָ֙</w:t>
       </w:r>
     </w:p>
     <w:p>
@@ -14285,7 +14285,7 @@
         <w:rPr>
           <w:lang w:val="ar_AE" w:bidi="ar_AE"/>
         </w:rPr>
-        <w:t>הֻגֵּ֨ד הֻגַּ֜ד</w:t>
+        <w:t>הֻגֵּ֨ד הֻגַּ֜ד</w:t>
       </w:r>
     </w:p>
     <w:p>
@@ -14420,7 +14420,7 @@
         <w:rPr>
           <w:lang w:val="ar_AE" w:bidi="ar_AE"/>
         </w:rPr>
-        <w:t>הֻגֵּ֨ד הֻגַּ֜ד לִ֗⁠י</w:t>
+        <w:t>הֻגֵּ֨ד הֻגַּ֜ד לִ֗⁠י</w:t>
       </w:r>
     </w:p>
     <w:p>
@@ -14542,7 +14542,7 @@
         <w:rPr>
           <w:lang w:val="ar_AE" w:bidi="ar_AE"/>
         </w:rPr>
-        <w:t>וַ⁠תֵּ֣לְכִ֔י אֶל־עַ֕ם</w:t>
+        <w:t>וַ⁠תֵּ֣לְכִ֔י אֶל־עַ֕ם</w:t>
       </w:r>
     </w:p>
     <w:p>
@@ -14677,7 +14677,7 @@
         <w:rPr>
           <w:lang w:val="ar_AE" w:bidi="ar_AE"/>
         </w:rPr>
-        <w:t>תְּמ֥וֹל שִׁלְשֽׁוֹם</w:t>
+        <w:t>תְּמ֥וֹל שִׁלְשֽׁוֹם</w:t>
       </w:r>
     </w:p>
     <w:p>
@@ -14812,7 +14812,7 @@
         <w:rPr>
           <w:lang w:val="ar_AE" w:bidi="ar_AE"/>
         </w:rPr>
-        <w:t>פָּעֳלֵ֑⁠ךְ</w:t>
+        <w:t>פָּעֳלֵ֑⁠ךְ</w:t>
       </w:r>
     </w:p>
     <w:p>
@@ -14947,7 +14947,7 @@
         <w:rPr>
           <w:lang w:val="ar_AE" w:bidi="ar_AE"/>
         </w:rPr>
-        <w:t>וּ⁠תְהִ֨י מַשְׂכֻּרְתֵּ֜⁠ךְ שְׁלֵמָ֗ה מֵ⁠עִ֤ם יְהוָה֙</w:t>
+        <w:t>וּ⁠תְהִ֨י מַשְׂכֻּרְתֵּ֜⁠ךְ שְׁלֵמָ֗ה מֵ⁠עִ֤ם יְהוָה֙</w:t>
       </w:r>
     </w:p>
     <w:p>
@@ -15069,7 +15069,7 @@
         <w:rPr>
           <w:lang w:val="ar_AE" w:bidi="ar_AE"/>
         </w:rPr>
-        <w:t>אֲשֶׁר־בָּ֖את לַ⁠חֲס֥וֹת תַּֽחַת־כְּנָפָֽי⁠ו</w:t>
+        <w:t>אֲשֶׁר־בָּ֖את לַ⁠חֲס֥וֹת תַּֽחַת־כְּנָפָֽי⁠ו</w:t>
       </w:r>
     </w:p>
     <w:p>
@@ -15204,7 +15204,7 @@
         <w:rPr>
           <w:lang w:val="ar_AE" w:bidi="ar_AE"/>
         </w:rPr>
-        <w:t>אֶמְצָא־חֵ֨ן בְּ⁠עֵינֶ֤י⁠ךָ</w:t>
+        <w:t>אֶמְצָא־חֵ֨ן בְּ⁠עֵינֶ֤י⁠ךָ</w:t>
       </w:r>
     </w:p>
     <w:p>
@@ -15487,7 +15487,7 @@
         <w:rPr>
           <w:lang w:val="ar_AE" w:bidi="ar_AE"/>
         </w:rPr>
-        <w:t>עַל־לֵ֣ב שִׁפְחָתֶ֑⁠ךָ</w:t>
+        <w:t>עַל־לֵ֣ב שִׁפְחָתֶ֑⁠ךָ</w:t>
       </w:r>
     </w:p>
     <w:p>
@@ -15744,7 +15744,7 @@
         <w:rPr>
           <w:lang w:val="ar_AE" w:bidi="ar_AE"/>
         </w:rPr>
-        <w:t>שִׁפְחָתֶ֑⁠ךָ</w:t>
+        <w:t>שִׁפְחָתֶ֑⁠ךָ</w:t>
       </w:r>
     </w:p>
     <w:p>
@@ -15866,7 +15866,7 @@
         <w:rPr>
           <w:lang w:val="ar_AE" w:bidi="ar_AE"/>
         </w:rPr>
-        <w:t>וְ⁠אָנֹכִי֙ לֹ֣א אֶֽהְיֶ֔ה כְּ⁠אַחַ֖ת שִׁפְחֹתֶֽי⁠ךָ</w:t>
+        <w:t>וְ⁠אָנֹכִי֙ לֹ֣א אֶֽהְיֶ֔ה כְּ⁠אַחַ֖ת שִׁפְחֹתֶֽי⁠ךָ</w:t>
       </w:r>
     </w:p>
     <w:p>
@@ -16072,7 +16072,7 @@
         <w:rPr>
           <w:lang w:val="ar_AE" w:bidi="ar_AE"/>
         </w:rPr>
-        <w:t>גֹּ֤שִֽׁי הֲלֹם֙ וְ⁠אָכַ֣לְתְּ מִן־הַ⁠לֶּ֔חֶם וְ⁠טָבַ֥לְתְּ פִּתֵּ֖⁠ךְ בַּ⁠חֹ֑מֶץ</w:t>
+        <w:t>גֹּ֤שִֽׁי הֲלֹם֙ וְ⁠אָכַ֣לְתְּ מִן־הַ⁠לֶּ֔חֶם וְ⁠טָבַ֥לְתְּ פִּתֵּ֖⁠ךְ בַּ⁠חֹ֑מֶץ</w:t>
       </w:r>
     </w:p>
     <w:p>
@@ -16194,7 +16194,7 @@
         <w:rPr>
           <w:lang w:val="ar_AE" w:bidi="ar_AE"/>
         </w:rPr>
-        <w:t>וְ⁠אָכַ֣לְתְּ מִן־הַ⁠לֶּ֔חֶם וְ⁠טָבַ֥לְתְּ פִּתֵּ֖⁠ךְ בַּ⁠חֹ֑מֶץ</w:t>
+        <w:t>וְ⁠אָכַ֣לְתְּ מִן־הַ⁠לֶּ֔חֶם וְ⁠טָבַ֥לְתְּ פִּתֵּ֖⁠ךְ בַּ⁠חֹ֑מֶץ</w:t>
       </w:r>
     </w:p>
     <w:p>
@@ -16316,7 +16316,7 @@
         <w:rPr>
           <w:lang w:val="ar_AE" w:bidi="ar_AE"/>
         </w:rPr>
-        <w:t>וְ⁠טָבַ֥לְתְּ פִּתֵּ֖⁠ךְ בַּ⁠חֹ֑מֶץ</w:t>
+        <w:t>וְ⁠טָבַ֥לְתְּ פִּתֵּ֖⁠ךְ בַּ⁠חֹ֑מֶץ</w:t>
       </w:r>
     </w:p>
     <w:p>
@@ -16416,7 +16416,7 @@
         <w:rPr>
           <w:lang w:val="ar_AE" w:bidi="ar_AE"/>
         </w:rPr>
-        <w:t>וַ⁠יְצַו֩ בֹּ֨עַז אֶת־נְעָרָ֜י⁠ו</w:t>
+        <w:t>וַ⁠יְצַו֩ בֹּ֨עַז אֶת־נְעָרָ֜י⁠ו</w:t>
       </w:r>
     </w:p>
     <w:p>
@@ -16538,7 +16538,7 @@
         <w:rPr>
           <w:lang w:val="ar_AE" w:bidi="ar_AE"/>
         </w:rPr>
-        <w:t>גַּ֣ם בֵּ֧ין הָֽ⁠עֳמָרִ֛ים</w:t>
+        <w:t>גַּ֣ם בֵּ֧ין הָֽ⁠עֳמָרִ֛ים</w:t>
       </w:r>
     </w:p>
     <w:p>
@@ -16957,7 +16957,7 @@
         <w:rPr>
           <w:lang w:val="ar_AE" w:bidi="ar_AE"/>
         </w:rPr>
-        <w:t>וַ⁠תַּחְבֹּט֙</w:t>
+        <w:t>וַ⁠תַּחְבֹּט֙</w:t>
       </w:r>
     </w:p>
     <w:p>
@@ -17057,7 +17057,7 @@
         <w:rPr>
           <w:lang w:val="ar_AE" w:bidi="ar_AE"/>
         </w:rPr>
-        <w:t>כְּ⁠אֵיפָ֥ה</w:t>
+        <w:t>כְּ⁠אֵיפָ֥ה</w:t>
       </w:r>
     </w:p>
     <w:p>
@@ -17192,7 +17192,7 @@
         <w:rPr>
           <w:lang w:val="ar_AE" w:bidi="ar_AE"/>
         </w:rPr>
-        <w:t>וַ⁠תִּשָּׂא֙ וַ⁠תָּב֣וֹא הָ⁠עִ֔יר</w:t>
+        <w:t>וַ⁠תִּשָּׂא֙ וַ⁠תָּב֣וֹא הָ⁠עִ֔יר</w:t>
       </w:r>
     </w:p>
     <w:p>
@@ -17314,7 +17314,7 @@
         <w:rPr>
           <w:lang w:val="ar_AE" w:bidi="ar_AE"/>
         </w:rPr>
-        <w:t>אֵיפֹ֨ה לִקַּ֤טְתְּ הַ⁠יּוֹם֙ וְ⁠אָ֣נָה עָשִׂ֔ית</w:t>
+        <w:t>אֵיפֹ֨ה לִקַּ֤טְתְּ הַ⁠יּוֹם֙ וְ⁠אָ֣נָה עָשִׂ֔ית</w:t>
       </w:r>
     </w:p>
     <w:p>
@@ -17436,7 +17436,7 @@
         <w:rPr>
           <w:lang w:val="ar_AE" w:bidi="ar_AE"/>
         </w:rPr>
-        <w:t>יְהִ֥י מַכִּירֵ֖⁠ךְ בָּר֑וּךְ</w:t>
+        <w:t>יְהִ֥י מַכִּירֵ֖⁠ךְ בָּר֑וּךְ</w:t>
       </w:r>
     </w:p>
     <w:p>
@@ -17558,7 +17558,7 @@
         <w:rPr>
           <w:lang w:val="ar_AE" w:bidi="ar_AE"/>
         </w:rPr>
-        <w:t>יְהִ֥י מַכִּירֵ֖⁠ךְ בָּר֑וּךְ</w:t>
+        <w:t>יְהִ֥י מַכִּירֵ֖⁠ךְ בָּר֑וּךְ</w:t>
       </w:r>
     </w:p>
     <w:p>
@@ -17680,7 +17680,7 @@
         <w:rPr>
           <w:lang w:val="ar_AE" w:bidi="ar_AE"/>
         </w:rPr>
-        <w:t>מַכִּירֵ֖⁠ךְ</w:t>
+        <w:t>מַכִּירֵ֖⁠ךְ</w:t>
       </w:r>
     </w:p>
     <w:p>
@@ -17815,7 +17815,7 @@
         <w:rPr>
           <w:lang w:val="ar_AE" w:bidi="ar_AE"/>
         </w:rPr>
-        <w:t>וַ⁠תַּגֵּ֣ד לַ⁠חֲמוֹתָ֗⁠הּ אֵ֤ת אֲשֶׁר־עָשְׂתָה֙ עִמּ֔⁠וֹ וַ⁠תֹּ֗אמֶר שֵׁ֤ם הָ⁠אִישׁ֙ אֲשֶׁ֨ר עָשִׂ֧יתִי עִמּ֛⁠וֹ הַ⁠יּ֖וֹם בֹּֽעַז</w:t>
+        <w:t>וַ⁠תַּגֵּ֣ד לַ⁠חֲמוֹתָ֗⁠הּ אֵ֤ת אֲשֶׁר־עָשְׂתָה֙ עִמּ֔⁠וֹ וַ⁠תֹּ֗אמֶר שֵׁ֤ם הָ⁠אִישׁ֙ אֲשֶׁ֨ר עָשִׂ֧יתִי עִמּ֛⁠וֹ הַ⁠יּ֖וֹם בֹּֽעַז</w:t>
       </w:r>
     </w:p>
     <w:p>
@@ -17937,7 +17937,7 @@
         <w:rPr>
           <w:lang w:val="ar_AE" w:bidi="ar_AE"/>
         </w:rPr>
-        <w:t>בָּר֥וּךְ הוּא֙ לַ⁠יהוָ֔ה</w:t>
+        <w:t>בָּר֥וּךְ הוּא֙ לַ⁠יהוָ֔ה</w:t>
       </w:r>
     </w:p>
     <w:p>
@@ -18059,7 +18059,7 @@
         <w:rPr>
           <w:lang w:val="ar_AE" w:bidi="ar_AE"/>
         </w:rPr>
-        <w:t>בָּר֥וּךְ הוּא֙ לַ⁠יהוָ֔ה</w:t>
+        <w:t>בָּר֥וּךְ הוּא֙ לַ⁠יהוָ֔ה</w:t>
       </w:r>
     </w:p>
     <w:p>
@@ -18181,7 +18181,7 @@
         <w:rPr>
           <w:lang w:val="ar_AE" w:bidi="ar_AE"/>
         </w:rPr>
-        <w:t>אֲשֶׁר֙ לֹא־עָזַ֣ב</w:t>
+        <w:t>אֲשֶׁר֙ לֹא־עָזַ֣ב</w:t>
       </w:r>
     </w:p>
     <w:p>
@@ -18329,7 +18329,7 @@
         <w:rPr>
           <w:lang w:val="ar_AE" w:bidi="ar_AE"/>
         </w:rPr>
-        <w:t>אֲשֶׁר֙ לֹא־עָזַ֣ב</w:t>
+        <w:t>אֲשֶׁר֙ לֹא־עָזַ֣ב</w:t>
       </w:r>
     </w:p>
     <w:p>
@@ -18464,7 +18464,7 @@
         <w:rPr>
           <w:lang w:val="ar_AE" w:bidi="ar_AE"/>
         </w:rPr>
-        <w:t>אֶת־הַ⁠חַיִּ֖ים</w:t>
+        <w:t>אֶת־הַ⁠חַיִּ֖ים</w:t>
       </w:r>
     </w:p>
     <w:p>
@@ -18599,7 +18599,7 @@
         <w:rPr>
           <w:lang w:val="ar_AE" w:bidi="ar_AE"/>
         </w:rPr>
-        <w:t>וְ⁠אֶת־הַ⁠מֵּתִ֑ים</w:t>
+        <w:t>וְ⁠אֶת־הַ⁠מֵּתִ֑ים</w:t>
       </w:r>
     </w:p>
     <w:p>
@@ -18734,7 +18734,7 @@
         <w:rPr>
           <w:lang w:val="ar_AE" w:bidi="ar_AE"/>
         </w:rPr>
-        <w:t>קָר֥וֹב לָ֨⁠נוּ֙ הָ⁠אִ֔ישׁ מִֽ⁠גֹּאֲלֵ֖⁠נוּ הֽוּא</w:t>
+        <w:t>קָר֥וֹב לָ֨⁠נוּ֙ הָ⁠אִ֔ישׁ מִֽ⁠גֹּאֲלֵ֖⁠נוּ הֽוּא</w:t>
       </w:r>
     </w:p>
     <w:p>
@@ -18856,7 +18856,7 @@
         <w:rPr>
           <w:lang w:val="ar_AE" w:bidi="ar_AE"/>
         </w:rPr>
-        <w:t>מִֽ⁠גֹּאֲלֵ֖⁠נוּ</w:t>
+        <w:t>מִֽ⁠גֹּאֲלֵ֖⁠נוּ</w:t>
       </w:r>
     </w:p>
     <w:p>
@@ -18956,7 +18956,7 @@
         <w:rPr>
           <w:lang w:val="ar_AE" w:bidi="ar_AE"/>
         </w:rPr>
-        <w:t>גַּ֣ם ׀ כִּי־אָמַ֣ר אֵלַ֗⁠י</w:t>
+        <w:t>גַּ֣ם ׀ כִּי־אָמַ֣ר אֵלַ֗⁠י</w:t>
       </w:r>
     </w:p>
     <w:p>
@@ -19078,7 +19078,7 @@
         <w:rPr>
           <w:lang w:val="ar_AE" w:bidi="ar_AE"/>
         </w:rPr>
-        <w:t>אָמַ֣ר אֵלַ֗⁠י עִם־הַ⁠נְּעָרִ֤ים אֲשֶׁר־לִ⁠י֙ תִּדְבָּקִ֔י⁠ן עַ֣ד אִם־כִּלּ֔וּ אֵ֥ת כָּל־הַ⁠קָּצִ֖יר אֲשֶׁר־לִֽ⁠י</w:t>
+        <w:t>אָמַ֣ר אֵלַ֗⁠י עִם־הַ⁠נְּעָרִ֤ים אֲשֶׁר־לִ⁠י֙ תִּדְבָּקִ֔י⁠ן עַ֣ד אִם־כִּלּ֔וּ אֵ֥ת כָּל־הַ⁠קָּצִ֖יר אֲשֶׁר־לִֽ⁠י</w:t>
       </w:r>
     </w:p>
     <w:p>
@@ -19200,7 +19200,7 @@
         <w:rPr>
           <w:lang w:val="ar_AE" w:bidi="ar_AE"/>
         </w:rPr>
-        <w:t>עִם־הַ⁠נְּעָרִ֤ים אֲשֶׁר־לִ⁠י֙ תִּדְבָּקִ֔י⁠ן</w:t>
+        <w:t>עִם־הַ⁠נְּעָרִ֤ים אֲשֶׁר־לִ⁠י֙ תִּדְבָּקִ֔י⁠ן</w:t>
       </w:r>
     </w:p>
     <w:p>
@@ -19406,7 +19406,7 @@
         <w:rPr>
           <w:lang w:val="ar_AE" w:bidi="ar_AE"/>
         </w:rPr>
-        <w:t>וְ⁠לֹ֥א יִפְגְּעוּ־בָ֖⁠ךְ</w:t>
+        <w:t>וְ⁠לֹ֥א יִפְגְּעוּ־בָ֖⁠ךְ</w:t>
       </w:r>
     </w:p>
     <w:p>
@@ -19528,7 +19528,7 @@
         <w:rPr>
           <w:lang w:val="ar_AE" w:bidi="ar_AE"/>
         </w:rPr>
-        <w:t>וַ⁠תִּדְבַּ֞ק</w:t>
+        <w:t>וַ⁠תִּדְבַּ֞ק</w:t>
       </w:r>
     </w:p>
     <w:p>
@@ -19663,7 +19663,7 @@
         <w:rPr>
           <w:lang w:val="ar_AE" w:bidi="ar_AE"/>
         </w:rPr>
-        <w:t>עַד־כְּל֥וֹת קְצִֽיר־הַ⁠שְּׂעֹרִ֖ים וּ⁠קְצִ֣יר הַֽ⁠חִטִּ֑ים</w:t>
+        <w:t>עַד־כְּל֥וֹת קְצִֽיר־הַ⁠שְּׂעֹרִ֖ים וּ⁠קְצִ֣יר הַֽ⁠חִטִּ֑ים</w:t>
       </w:r>
     </w:p>
     <w:p>
@@ -19785,7 +19785,7 @@
         <w:rPr>
           <w:lang w:val="ar_AE" w:bidi="ar_AE"/>
         </w:rPr>
-        <w:t>וַ⁠תֹּ֥אמֶר לָ֖⁠הּ נָעֳמִ֣י חֲמוֹתָ֑⁠הּ</w:t>
+        <w:t>וַ⁠תֹּ֥אמֶר לָ֖⁠הּ נָעֳמִ֣י חֲמוֹתָ֑⁠הּ</w:t>
       </w:r>
     </w:p>
     <w:p>
@@ -20303,7 +20303,7 @@
         <w:rPr>
           <w:lang w:val="ar_AE" w:bidi="ar_AE"/>
         </w:rPr>
-        <w:t>בִּתִּ֞⁠י</w:t>
+        <w:t>בִּתִּ֞⁠י</w:t>
       </w:r>
     </w:p>
     <w:p>
@@ -20438,7 +20438,7 @@
         <w:rPr>
           <w:lang w:val="ar_AE" w:bidi="ar_AE"/>
         </w:rPr>
-        <w:t>הֲ⁠לֹ֧א אֲבַקֶּשׁ־לָ֛⁠ךְ מָנ֖וֹחַ אֲשֶׁ֥ר יִֽיטַב־לָֽ⁠ךְ</w:t>
+        <w:t>הֲ⁠לֹ֧א אֲבַקֶּשׁ־לָ֛⁠ךְ מָנ֖וֹחַ אֲשֶׁ֥ר יִֽיטַב־לָֽ⁠ךְ</w:t>
       </w:r>
     </w:p>
     <w:p>
@@ -20695,7 +20695,7 @@
         <w:rPr>
           <w:lang w:val="ar_AE" w:bidi="ar_AE"/>
         </w:rPr>
-        <w:t>וְ⁠עַתָּ֗ה</w:t>
+        <w:t>וְ⁠עַתָּ֗ה</w:t>
       </w:r>
     </w:p>
     <w:p>
@@ -20853,7 +20853,7 @@
         <w:rPr>
           <w:lang w:val="ar_AE" w:bidi="ar_AE"/>
         </w:rPr>
-        <w:t>הֲ⁠לֹ֥א בֹ֨עַז֙ מֹֽדַעְתָּ֔⁠נוּ אֲשֶׁ֥ר הָיִ֖ית אֶת־נַעֲרוֹתָ֑י⁠ו</w:t>
+        <w:t>הֲ⁠לֹ֥א בֹ֨עַז֙ מֹֽדַעְתָּ֔⁠נוּ אֲשֶׁ֥ר הָיִ֖ית אֶת־נַעֲרוֹתָ֑י⁠ו</w:t>
       </w:r>
     </w:p>
     <w:p>
@@ -20993,7 +20993,7 @@
         <w:rPr>
           <w:lang w:val="ar_AE" w:bidi="ar_AE"/>
         </w:rPr>
-        <w:t>אֲשֶׁ֥ר הָיִ֖ית אֶת־נַעֲרוֹתָ֑י⁠ו</w:t>
+        <w:t>אֲשֶׁ֥ר הָיִ֖ית אֶת־נַעֲרוֹתָ֑י⁠ו</w:t>
       </w:r>
     </w:p>
     <w:p>
@@ -21115,7 +21115,7 @@
         <w:rPr>
           <w:lang w:val="ar_AE" w:bidi="ar_AE"/>
         </w:rPr>
-        <w:t>הִנֵּה</w:t>
+        <w:t>הִנֵּה</w:t>
       </w:r>
     </w:p>
     <w:p>
@@ -21334,7 +21334,7 @@
         <w:rPr>
           <w:lang w:val="ar_AE" w:bidi="ar_AE"/>
         </w:rPr>
-        <w:t>וְיָרַ֣דְתְּ הַ⁠גֹּ֑רֶן</w:t>
+        <w:t>וְיָרַ֣דְתְּ הַ⁠גֹּ֑רֶן</w:t>
       </w:r>
     </w:p>
     <w:p>
@@ -21463,7 +21463,7 @@
         <w:rPr>
           <w:lang w:val="ar_AE" w:bidi="ar_AE"/>
         </w:rPr>
-        <w:t>לֶ⁠אֱכֹ֥ל וְ⁠לִ⁠שְׁתּֽוֹת</w:t>
+        <w:t>לֶ⁠אֱכֹ֥ל וְ⁠לִ⁠שְׁתּֽוֹת</w:t>
       </w:r>
     </w:p>
     <w:p>
@@ -21698,7 +21698,7 @@
         <w:rPr>
           <w:lang w:val="ar_AE" w:bidi="ar_AE"/>
         </w:rPr>
-        <w:t>וְ⁠גִלִּ֥ית מַרְגְּלֹתָ֖י⁠ו</w:t>
+        <w:t>וְ⁠גִלִּ֥ית מַרְגְּלֹתָ֖י⁠ו</w:t>
       </w:r>
     </w:p>
     <w:p>
@@ -21833,7 +21833,7 @@
         <w:rPr>
           <w:lang w:val="ar_AE" w:bidi="ar_AE"/>
         </w:rPr>
-        <w:t>מַרְגְּלֹתָ֖י⁠ו</w:t>
+        <w:t>מַרְגְּלֹתָ֖י⁠ו</w:t>
       </w:r>
     </w:p>
     <w:p>
@@ -21968,7 +21968,7 @@
         <w:rPr>
           <w:lang w:val="ar_AE" w:bidi="ar_AE"/>
         </w:rPr>
-        <w:t>וְ⁠הוּא֙ יַגִּ֣יד לָ֔⁠ךְ אֵ֖ת אֲשֶׁ֥ר תַּעַשִֽׂי⁠ן</w:t>
+        <w:t>וְ⁠הוּא֙ יַגִּ֣יד לָ֔⁠ךְ אֵ֖ת אֲשֶׁ֥ר תַּעַשִֽׂי⁠ן</w:t>
       </w:r>
     </w:p>
     <w:p>
@@ -22068,7 +22068,7 @@
         <w:rPr>
           <w:lang w:val="ar_AE" w:bidi="ar_AE"/>
         </w:rPr>
-        <w:t>וְ⁠הוּא֙ יַגִּ֣יד</w:t>
+        <w:t>וְ⁠הוּא֙ יַגִּ֣יד</w:t>
       </w:r>
     </w:p>
     <w:p>
@@ -22181,7 +22181,7 @@
         <w:rPr>
           <w:lang w:val="ar_AE" w:bidi="ar_AE"/>
         </w:rPr>
-        <w:t>וַ⁠תַּ֕עַשׂ כְּ⁠כֹ֥ל אֲשֶׁר־צִוַּ֖תָּ⁠ה חֲמוֹתָֽ⁠הּ</w:t>
+        <w:t>וַ⁠תַּ֕עַשׂ כְּ⁠כֹ֥ל אֲשֶׁר־צִוַּ֖תָּ⁠ה חֲמוֹתָֽ⁠הּ</w:t>
       </w:r>
     </w:p>
     <w:p>
@@ -22388,7 +22388,7 @@
         <w:rPr>
           <w:lang w:val="ar_AE" w:bidi="ar_AE"/>
         </w:rPr>
-        <w:t>וַ⁠יִּיטַ֣ב לִבּ֔⁠וֹ</w:t>
+        <w:t>וַ⁠יִּיטַ֣ב לִבּ֔⁠וֹ</w:t>
       </w:r>
     </w:p>
     <w:p>
@@ -22744,7 +22744,7 @@
         <w:rPr>
           <w:lang w:val="ar_AE" w:bidi="ar_AE"/>
         </w:rPr>
-        <w:t>וַ⁠יְהִי֙ בַּ⁠חֲצִ֣י הַ⁠לַּ֔יְלָה</w:t>
+        <w:t>וַ⁠יְהִי֙ בַּ⁠חֲצִ֣י הַ⁠לַּ֔יְלָה</w:t>
       </w:r>
     </w:p>
     <w:p>
@@ -22866,7 +22866,7 @@
         <w:rPr>
           <w:lang w:val="ar_AE" w:bidi="ar_AE"/>
         </w:rPr>
-        <w:t>וַ⁠יֶּחֱרַ֥ד הָ⁠אִ֖ישׁ</w:t>
+        <w:t>וַ⁠יֶּחֱרַ֥ד הָ⁠אִ֖ישׁ</w:t>
       </w:r>
     </w:p>
     <w:p>
@@ -23243,7 +23243,7 @@
         <w:rPr>
           <w:lang w:val="ar_AE" w:bidi="ar_AE"/>
         </w:rPr>
-        <w:t>וּ⁠פָרַשְׂתָּ֤ כְנָפֶ֨⁠ךָ֙ עַל־אֲמָ֣תְ⁠ךָ֔</w:t>
+        <w:t>וּ⁠פָרַשְׂתָּ֤ כְנָפֶ֨⁠ךָ֙ עַל־אֲמָ֣תְ⁠ךָ֔</w:t>
       </w:r>
     </w:p>
     <w:p>
@@ -23489,7 +23489,7 @@
         <w:rPr>
           <w:lang w:val="ar_AE" w:bidi="ar_AE"/>
         </w:rPr>
-        <w:t>בְּרוּכָ֨ה אַ֤תְּ לַֽ⁠יהוָה֙</w:t>
+        <w:t>בְּרוּכָ֨ה אַ֤תְּ לַֽ⁠יהוָה֙</w:t>
       </w:r>
     </w:p>
     <w:p>
@@ -23611,7 +23611,7 @@
         <w:rPr>
           <w:lang w:val="ar_AE" w:bidi="ar_AE"/>
         </w:rPr>
-        <w:t>בִּתִּ֔⁠י</w:t>
+        <w:t>בִּתִּ֔⁠י</w:t>
       </w:r>
     </w:p>
     <w:p>
@@ -23764,7 +23764,7 @@
         <w:rPr>
           <w:lang w:val="ar_AE" w:bidi="ar_AE"/>
         </w:rPr>
-        <w:t>הֵיטַ֛בְתְּ חַסְדֵּ֥⁠ךְ הָ⁠אַחֲר֖וֹן מִן־הָ⁠רִאשׁ֑וֹן</w:t>
+        <w:t>הֵיטַ֛בְתְּ חַסְדֵּ֥⁠ךְ הָ⁠אַחֲר֖וֹן מִן־הָ⁠רִאשׁ֑וֹן</w:t>
       </w:r>
     </w:p>
     <w:p>
@@ -24021,7 +24021,7 @@
         <w:rPr>
           <w:lang w:val="ar_AE" w:bidi="ar_AE"/>
         </w:rPr>
-        <w:t>לְ⁠בִלְתִּי־לֶ֗כֶת אַחֲרֵי֙</w:t>
+        <w:t>לְ⁠בִלְתִּי־לֶ֗כֶת אַחֲרֵי֙</w:t>
       </w:r>
     </w:p>
     <w:p>
@@ -24156,7 +24156,7 @@
         <w:rPr>
           <w:lang w:val="ar_AE" w:bidi="ar_AE"/>
         </w:rPr>
-        <w:t>וְ⁠עַתָּ֗ה</w:t>
+        <w:t>וְ⁠עַתָּ֗ה</w:t>
       </w:r>
     </w:p>
     <w:p>
@@ -24309,7 +24309,7 @@
         <w:rPr>
           <w:lang w:val="ar_AE" w:bidi="ar_AE"/>
         </w:rPr>
-        <w:t>בִּתִּ⁠י֙</w:t>
+        <w:t>בִּתִּ⁠י֙</w:t>
       </w:r>
     </w:p>
     <w:p>
@@ -24467,7 +24467,7 @@
         <w:rPr>
           <w:lang w:val="ar_AE" w:bidi="ar_AE"/>
         </w:rPr>
-        <w:t>כָּל־שַׁ֣עַר עַמִּ֔⁠י</w:t>
+        <w:t>כָּל־שַׁ֣עַר עַמִּ֔⁠י</w:t>
       </w:r>
     </w:p>
     <w:p>
@@ -24708,7 +24708,7 @@
         <w:rPr>
           <w:lang w:val="ar_AE" w:bidi="ar_AE"/>
         </w:rPr>
-        <w:t>וְ⁠עַתָּה֙</w:t>
+        <w:t>וְ⁠עַתָּה֙</w:t>
       </w:r>
     </w:p>
     <w:p>
@@ -25032,7 +25032,7 @@
         <w:rPr>
           <w:lang w:val="ar_AE" w:bidi="ar_AE"/>
         </w:rPr>
-        <w:t>גֹאֵ֖ל &amp; גֹּאֵ֖ל</w:t>
+        <w:t>גֹאֵ֖ל &amp; גֹּאֵ֖ל</w:t>
       </w:r>
     </w:p>
     <w:p>
@@ -25334,7 +25334,7 @@
         <w:rPr>
           <w:lang w:val="ar_AE" w:bidi="ar_AE"/>
         </w:rPr>
-        <w:t>וּ⁠גְאַלְתִּ֥י⁠ךְ אָנֹ֖כִי</w:t>
+        <w:t>וּ⁠גְאַלְתִּ֥י⁠ךְ אָנֹ֖כִי</w:t>
       </w:r>
     </w:p>
     <w:p>
@@ -25566,7 +25566,7 @@
         <w:rPr>
           <w:lang w:val="ar_AE" w:bidi="ar_AE"/>
         </w:rPr>
-        <w:t>וַ⁠תִּשְׁכַּ֤ב מַרְגְּלוֹתָיו֙</w:t>
+        <w:t>וַ⁠תִּשְׁכַּ֤ב מַרְגְּלוֹתָיו֙</w:t>
       </w:r>
     </w:p>
     <w:p>
@@ -25701,7 +25701,7 @@
         <w:rPr>
           <w:lang w:val="ar_AE" w:bidi="ar_AE"/>
         </w:rPr>
-        <w:t>בְּטֶ֛רֶם יַכִּ֥יר אִ֖ישׁ אֶת־רֵעֵ֑⁠הוּ</w:t>
+        <w:t>בְּטֶ֛רֶם יַכִּ֥יר אִ֖ישׁ אֶת־רֵעֵ֑⁠הוּ</w:t>
       </w:r>
     </w:p>
     <w:p>
@@ -25836,7 +25836,7 @@
         <w:rPr>
           <w:lang w:val="ar_AE" w:bidi="ar_AE"/>
         </w:rPr>
-        <w:t>וַ⁠יֹּ֨אמֶר֙</w:t>
+        <w:t>וַ⁠יֹּ֨אמֶר֙</w:t>
       </w:r>
     </w:p>
     <w:p>
@@ -25958,7 +25958,7 @@
         <w:rPr>
           <w:lang w:val="ar_AE" w:bidi="ar_AE"/>
         </w:rPr>
-        <w:t>אַל־יִוָּדַ֔ע</w:t>
+        <w:t>אַל־יִוָּדַ֔ע</w:t>
       </w:r>
     </w:p>
     <w:p>
@@ -26080,7 +26080,7 @@
         <w:rPr>
           <w:lang w:val="ar_AE" w:bidi="ar_AE"/>
         </w:rPr>
-        <w:t>הַ⁠מִּטְפַּ֧חַת</w:t>
+        <w:t>הַ⁠מִּטְפַּ֧חַת</w:t>
       </w:r>
     </w:p>
     <w:p>
@@ -26215,7 +26215,7 @@
         <w:rPr>
           <w:lang w:val="ar_AE" w:bidi="ar_AE"/>
         </w:rPr>
-        <w:t>שֵׁשׁ־שְׂעֹרִים֙</w:t>
+        <w:t>שֵׁשׁ־שְׂעֹרִים֙</w:t>
       </w:r>
     </w:p>
     <w:p>
@@ -26337,7 +26337,7 @@
         <w:rPr>
           <w:lang w:val="ar_AE" w:bidi="ar_AE"/>
         </w:rPr>
-        <w:t>וַ⁠יָּ֣שֶׁת עָלֶ֔י⁠הָ</w:t>
+        <w:t>וַ⁠יָּ֣שֶׁת עָלֶ֔י⁠הָ</w:t>
       </w:r>
     </w:p>
     <w:p>
@@ -26459,7 +26459,7 @@
         <w:rPr>
           <w:lang w:val="ar_AE" w:bidi="ar_AE"/>
         </w:rPr>
-        <w:t>וַ⁠יָּבֹ֖א הָ⁠עִֽיר</w:t>
+        <w:t>וַ⁠יָּבֹ֖א הָ⁠עִֽיר</w:t>
       </w:r>
     </w:p>
     <w:p>
@@ -26607,7 +26607,7 @@
         <w:rPr>
           <w:lang w:val="ar_AE" w:bidi="ar_AE"/>
         </w:rPr>
-        <w:t>מִי־אַ֣תְּ</w:t>
+        <w:t>מִי־אַ֣תְּ</w:t>
       </w:r>
     </w:p>
     <w:p>
@@ -26756,7 +26756,7 @@
         <w:rPr>
           <w:lang w:val="ar_AE" w:bidi="ar_AE"/>
         </w:rPr>
-        <w:t>בִּתִּ֑⁠י</w:t>
+        <w:t>בִּתִּ֑⁠י</w:t>
       </w:r>
     </w:p>
     <w:p>
@@ -26891,7 +26891,7 @@
         <w:rPr>
           <w:lang w:val="ar_AE" w:bidi="ar_AE"/>
         </w:rPr>
-        <w:t>אֵ֛ת כָּל־אֲשֶׁ֥ר עָֽשָׂה־לָ֖⁠הּ הָ⁠אִֽישׁ</w:t>
+        <w:t>אֵ֛ת כָּל־אֲשֶׁ֥ר עָֽשָׂה־לָ֖⁠הּ הָ⁠אִֽישׁ</w:t>
       </w:r>
     </w:p>
     <w:p>
@@ -27150,7 +27150,7 @@
         <w:rPr>
           <w:lang w:val="ar_AE" w:bidi="ar_AE"/>
         </w:rPr>
-        <w:t>כִּ֚י אָמַ֣ר אַל־תָּב֥וֹאִי רֵיקָ֖ם אֶל־חֲמוֹתֵֽ⁠ךְ</w:t>
+        <w:t>כִּ֚י אָמַ֣ר אַל־תָּב֥וֹאִי רֵיקָ֖ם אֶל־חֲמוֹתֵֽ⁠ךְ</w:t>
       </w:r>
     </w:p>
     <w:p>
@@ -27378,7 +27378,7 @@
         <w:rPr>
           <w:lang w:val="ar_AE" w:bidi="ar_AE"/>
         </w:rPr>
-        <w:t>שְׁבִ֣י</w:t>
+        <w:t>שְׁבִ֣י</w:t>
       </w:r>
     </w:p>
     <w:p>
@@ -27619,7 +27619,7 @@
         <w:rPr>
           <w:lang w:val="ar_AE" w:bidi="ar_AE"/>
         </w:rPr>
-        <w:t>אֵ֖יךְ יִפֹּ֣ל דָּבָ֑ר</w:t>
+        <w:t>אֵ֖יךְ יִפֹּ֣ל דָּבָ֑ר</w:t>
       </w:r>
     </w:p>
     <w:p>
@@ -27754,7 +27754,7 @@
         <w:rPr>
           <w:lang w:val="ar_AE" w:bidi="ar_AE"/>
         </w:rPr>
-        <w:t>לֹ֤א יִשְׁקֹט֙ הָ⁠אִ֔ישׁ כִּֽי־אִם</w:t>
+        <w:t>לֹ֤א יִשְׁקֹט֙ הָ⁠אִ֔ישׁ כִּֽי־אִם</w:t>
       </w:r>
     </w:p>
     <w:p>
@@ -28021,7 +28021,7 @@
         <w:rPr>
           <w:lang w:val="ar_AE" w:bidi="ar_AE"/>
         </w:rPr>
-        <w:t>וּ⁠בֹ֨עַז עָלָ֣ה הַ⁠שַּׁעַר֮</w:t>
+        <w:t>וּ⁠בֹ֨עַז עָלָ֣ה הַ⁠שַּׁעַר֮</w:t>
       </w:r>
     </w:p>
     <w:p>
@@ -28143,7 +28143,7 @@
         <w:rPr>
           <w:lang w:val="ar_AE" w:bidi="ar_AE"/>
         </w:rPr>
-        <w:t>הַ⁠שַּׁעַר֮</w:t>
+        <w:t>הַ⁠שַּׁעַר֮</w:t>
       </w:r>
     </w:p>
     <w:p>
@@ -28397,7 +28397,7 @@
         <w:rPr>
           <w:lang w:val="ar_AE" w:bidi="ar_AE"/>
         </w:rPr>
-        <w:t>הַ⁠גֹּאֵ֤ל</w:t>
+        <w:t>הַ⁠גֹּאֵ֤ל</w:t>
       </w:r>
     </w:p>
     <w:p>
@@ -28563,7 +28563,7 @@
         <w:rPr>
           <w:lang w:val="ar_AE" w:bidi="ar_AE"/>
         </w:rPr>
-        <w:t>וַ⁠יֹּ֛אמֶר ס֥וּרָ⁠ה שְׁבָ⁠ה־פֹּ֖ה פְּלֹנִ֣י אַלְמֹנִ֑י</w:t>
+        <w:t>וַ⁠יֹּ֛אמֶר ס֥וּרָ⁠ה שְׁבָ⁠ה־פֹּ֖ה פְּלֹנִ֣י אַלְמֹנִ֑י</w:t>
       </w:r>
     </w:p>
     <w:p>
@@ -28698,7 +28698,7 @@
         <w:rPr>
           <w:lang w:val="ar_AE" w:bidi="ar_AE"/>
         </w:rPr>
-        <w:t>פְּלֹנִ֣י אַלְמֹנִ֑י</w:t>
+        <w:t>פְּלֹנִ֣י אַלְמֹנִ֑י</w:t>
       </w:r>
     </w:p>
     <w:p>
@@ -29052,7 +29052,7 @@
         <w:rPr>
           <w:lang w:val="ar_AE" w:bidi="ar_AE"/>
         </w:rPr>
-        <w:t>אָמַ֜רְתִּי</w:t>
+        <w:t>אָמַ֜רְתִּי</w:t>
       </w:r>
     </w:p>
     <w:p>
@@ -29309,7 +29309,7 @@
         <w:rPr>
           <w:lang w:val="ar_AE" w:bidi="ar_AE"/>
         </w:rPr>
-        <w:t>נֶ֥גֶד הַֽ⁠יֹּשְׁבִים֮</w:t>
+        <w:t>נֶ֥גֶד הַֽ⁠יֹּשְׁבִים֮</w:t>
       </w:r>
     </w:p>
     <w:p>
@@ -29772,7 +29772,7 @@
         <w:rPr>
           <w:lang w:val="ar_AE" w:bidi="ar_AE"/>
         </w:rPr>
-        <w:t>בְּ⁠יוֹם</w:t>
+        <w:t>בְּ⁠יוֹם</w:t>
       </w:r>
     </w:p>
     <w:p>
@@ -29907,7 +29907,7 @@
         <w:rPr>
           <w:lang w:val="ar_AE" w:bidi="ar_AE"/>
         </w:rPr>
-        <w:t>מִ⁠יַּ֣ד נָעֳמִ֑י</w:t>
+        <w:t>מִ⁠יַּ֣ד נָעֳמִ֑י</w:t>
       </w:r>
     </w:p>
     <w:p>
@@ -30261,7 +30261,7 @@
         <w:rPr>
           <w:lang w:val="ar_AE" w:bidi="ar_AE"/>
         </w:rPr>
-        <w:t>לְ⁠הָקִ֥ים שֵׁם־הַ⁠מֵּ֖ת עַל־נַחֲלָתֽ⁠וֹ</w:t>
+        <w:t>לְ⁠הָקִ֥ים שֵׁם־הַ⁠מֵּ֖ת עַל־נַחֲלָתֽ⁠וֹ</w:t>
       </w:r>
     </w:p>
     <w:p>
@@ -30396,7 +30396,7 @@
         <w:rPr>
           <w:lang w:val="ar_AE" w:bidi="ar_AE"/>
         </w:rPr>
-        <w:t>הַ⁠מֵּת֙ &amp; הַ⁠מֵּ֖ת</w:t>
+        <w:t>הַ⁠מֵּת֙ &amp; הַ⁠מֵּ֖ת</w:t>
       </w:r>
     </w:p>
     <w:p>
@@ -30545,7 +30545,7 @@
         <w:rPr>
           <w:lang w:val="ar_AE" w:bidi="ar_AE"/>
         </w:rPr>
-        <w:t>אַשְׁחִ֖ית אֶת־נַחֲלָתִ֑⁠י</w:t>
+        <w:t>אַשְׁחִ֖ית אֶת־נַחֲלָתִ֑⁠י</w:t>
       </w:r>
     </w:p>
     <w:p>
@@ -30680,7 +30680,7 @@
         <w:rPr>
           <w:lang w:val="ar_AE" w:bidi="ar_AE"/>
         </w:rPr>
-        <w:t>גְּאַל־לְ⁠ךָ֤ אַתָּה֙ אֶת־גְּאֻלָּתִ֔⁠י</w:t>
+        <w:t>גְּאַל־לְ⁠ךָ֤ אַתָּה֙ אֶת־גְּאֻלָּתִ֔⁠י</w:t>
       </w:r>
     </w:p>
     <w:p>
@@ -31341,7 +31341,7 @@
         <w:rPr>
           <w:lang w:val="ar_AE" w:bidi="ar_AE"/>
         </w:rPr>
-        <w:t>וַ⁠יֹּ֧אמֶר הַ⁠גֹּאֵ֛ל לְ⁠בֹ֖עַז קְנֵה־לָ֑⁠ךְ וַ⁠יִּשְׁלֹ֖ף נַעֲלֽ⁠וֹ</w:t>
+        <w:t>וַ⁠יֹּ֧אמֶר הַ⁠גֹּאֵ֛ל לְ⁠בֹ֖עַז קְנֵה־לָ֑⁠ךְ וַ⁠יִּשְׁלֹ֖ף נַעֲלֽ⁠וֹ</w:t>
       </w:r>
     </w:p>
     <w:p>
@@ -31463,7 +31463,7 @@
         <w:rPr>
           <w:lang w:val="ar_AE" w:bidi="ar_AE"/>
         </w:rPr>
-        <w:t>וַ⁠יֹּ֧אמֶר הַ⁠גֹּאֵ֛ל לְ⁠בֹ֖עַז קְנֵה־לָ֑⁠ךְ וַ⁠יִּשְׁלֹ֖ף נַעֲלֽ⁠וֹ</w:t>
+        <w:t>וַ⁠יֹּ֧אמֶר הַ⁠גֹּאֵ֛ל לְ⁠בֹ֖עַז קְנֵה־לָ֑⁠ךְ וַ⁠יִּשְׁלֹ֖ף נַעֲלֽ⁠וֹ</w:t>
       </w:r>
     </w:p>
     <w:p>
@@ -31598,7 +31598,7 @@
         <w:rPr>
           <w:lang w:val="ar_AE" w:bidi="ar_AE"/>
         </w:rPr>
-        <w:t>וַ⁠יִּשְׁלֹ֖ף נַעֲלֽ⁠וֹ</w:t>
+        <w:t>וַ⁠יִּשְׁלֹ֖ף נַעֲלֽ⁠וֹ</w:t>
       </w:r>
     </w:p>
     <w:p>
@@ -31720,7 +31720,7 @@
         <w:rPr>
           <w:lang w:val="ar_AE" w:bidi="ar_AE"/>
         </w:rPr>
-        <w:t>לַ⁠זְּקֵנִ֜ים וְ⁠כָל־הָ⁠עָ֗ם</w:t>
+        <w:t>לַ⁠זְּקֵנִ֜ים וְ⁠כָל־הָ⁠עָ֗ם</w:t>
       </w:r>
     </w:p>
     <w:p>
@@ -31855,7 +31855,7 @@
         <w:rPr>
           <w:lang w:val="ar_AE" w:bidi="ar_AE"/>
         </w:rPr>
-        <w:t>מִ⁠יַּ֖ד נָעֳמִֽי</w:t>
+        <w:t>מִ⁠יַּ֖ד נָעֳמִֽי</w:t>
       </w:r>
     </w:p>
     <w:p>
@@ -32196,7 +32196,7 @@
         <w:rPr>
           <w:lang w:val="ar_AE" w:bidi="ar_AE"/>
         </w:rPr>
-        <w:t>לְ⁠הָקִ֤ים שֵׁם־הַ⁠מֵּת֙ עַל־נַ֣חֲלָת֔⁠וֹ</w:t>
+        <w:t>לְ⁠הָקִ֤ים שֵׁם־הַ⁠מֵּת֙ עַל־נַ֣חֲלָת֔⁠וֹ</w:t>
       </w:r>
     </w:p>
     <w:p>
@@ -32314,7 +32314,7 @@
         <w:rPr>
           <w:lang w:val="ar_AE" w:bidi="ar_AE"/>
         </w:rPr>
-        <w:t>הַ⁠מֵּת֙ &amp; הַ⁠מֵּ֛ת</w:t>
+        <w:t>הַ⁠מֵּת֙ &amp; הַ⁠מֵּ֛ת</w:t>
       </w:r>
     </w:p>
     <w:p>
@@ -32481,7 +32481,7 @@
         <w:rPr>
           <w:lang w:val="ar_AE" w:bidi="ar_AE"/>
         </w:rPr>
-        <w:t>וְ⁠לֹא־יִכָּרֵ֧ת שֵׁם־הַ⁠מֵּ֛ת מֵ⁠עִ֥ם אֶחָ֖י⁠ו וּ⁠מִ⁠שַּׁ֣עַר מְקוֹמ֑⁠וֹ</w:t>
+        <w:t>וְ⁠לֹא־יִכָּרֵ֧ת שֵׁם־הַ⁠מֵּ֛ת מֵ⁠עִ֥ם אֶחָ֖י⁠ו וּ⁠מִ⁠שַּׁ֣עַר מְקוֹמ֑⁠וֹ</w:t>
       </w:r>
     </w:p>
     <w:p>
@@ -32603,7 +32603,7 @@
         <w:rPr>
           <w:lang w:val="ar_AE" w:bidi="ar_AE"/>
         </w:rPr>
-        <w:t>וְ⁠לֹא־יִכָּרֵ֧ת שֵׁם־הַ⁠מֵּ֛ת מֵ⁠עִ֥ם אֶחָ֖י⁠ו וּ⁠מִ⁠שַּׁ֣עַר מְקוֹמ֑⁠וֹ</w:t>
+        <w:t>וְ⁠לֹא־יִכָּרֵ֧ת שֵׁם־הַ⁠מֵּ֛ת מֵ⁠עִ֥ם אֶחָ֖י⁠ו וּ⁠מִ⁠שַּׁ֣עַר מְקוֹמ֑⁠וֹ</w:t>
       </w:r>
     </w:p>
     <w:p>
@@ -32751,7 +32751,7 @@
         <w:rPr>
           <w:lang w:val="ar_AE" w:bidi="ar_AE"/>
         </w:rPr>
-        <w:t>וּ⁠מִ⁠שַּׁ֣עַר מְקוֹמ֑⁠וֹ</w:t>
+        <w:t>וּ⁠מִ⁠שַּׁ֣עַר מְקוֹמ֑⁠וֹ</w:t>
       </w:r>
     </w:p>
     <w:p>
@@ -32983,7 +32983,7 @@
         <w:rPr>
           <w:lang w:val="ar_AE" w:bidi="ar_AE"/>
         </w:rPr>
-        <w:t>הָ⁠עָ֧ם אֲשֶׁר־בַּ⁠שַּׁ֛עַר</w:t>
+        <w:t>הָ⁠עָ֧ם אֲשֶׁר־בַּ⁠שַּׁ֛עַר</w:t>
       </w:r>
     </w:p>
     <w:p>
@@ -33118,7 +33118,7 @@
         <w:rPr>
           <w:lang w:val="ar_AE" w:bidi="ar_AE"/>
         </w:rPr>
-        <w:t>הַ⁠בָּאָ֣ה אֶל־בֵּיתֶ֗⁠ךָ</w:t>
+        <w:t>הַ⁠בָּאָ֣ה אֶל־בֵּיתֶ֗⁠ךָ</w:t>
       </w:r>
     </w:p>
     <w:p>
@@ -33240,7 +33240,7 @@
         <w:rPr>
           <w:lang w:val="ar_AE" w:bidi="ar_AE"/>
         </w:rPr>
-        <w:t>יִתֵּן֩ יְהוָ֨ה אֶֽת־הָ⁠אִשָּׁ֜ה הַ⁠בָּאָ֣ה אֶל־בֵּיתֶ֗⁠ךָ כְּ⁠רָחֵ֤ל ׀ וּ⁠כְ⁠לֵאָה֙ אֲשֶׁ֨ר בָּנ֤וּ שְׁתֵּי⁠הֶם֙ אֶת־בֵּ֣ית יִשְׂרָאֵ֔ל</w:t>
+        <w:t>יִתֵּן֩ יְהוָ֨ה אֶֽת־הָ⁠אִשָּׁ֜ה הַ⁠בָּאָ֣ה אֶל־בֵּיתֶ֗⁠ךָ כְּ⁠רָחֵ֤ל ׀ וּ⁠כְ⁠לֵאָה֙ אֲשֶׁ֨ר בָּנ֤וּ שְׁתֵּי⁠הֶם֙ אֶת־בֵּ֣ית יִשְׂרָאֵ֔ל</w:t>
       </w:r>
     </w:p>
     <w:p>
@@ -33362,7 +33362,7 @@
         <w:rPr>
           <w:lang w:val="ar_AE" w:bidi="ar_AE"/>
         </w:rPr>
-        <w:t>כְּ⁠רָחֵ֤ל ׀ וּ⁠כְ⁠לֵאָה֙ אֲשֶׁ֨ר בָּנ֤וּ שְׁתֵּי⁠הֶם֙ אֶת־בֵּ֣ית יִשְׂרָאֵ֔ל</w:t>
+        <w:t>כְּ⁠רָחֵ֤ל ׀ וּ⁠כְ⁠לֵאָה֙ אֲשֶׁ֨ר בָּנ֤וּ שְׁתֵּי⁠הֶם֙ אֶת־בֵּ֣ית יִשְׂרָאֵ֔ל</w:t>
       </w:r>
     </w:p>
     <w:p>
@@ -33504,7 +33504,7 @@
         <w:rPr>
           <w:lang w:val="ar_AE" w:bidi="ar_AE"/>
         </w:rPr>
-        <w:t>בָּנ֤וּ &amp; אֶת־בֵּ֣ית יִשְׂרָאֵ֔ל</w:t>
+        <w:t>בָּנ֤וּ &amp; אֶת־בֵּ֣ית יִשְׂרָאֵ֔ל</w:t>
       </w:r>
     </w:p>
     <w:p>
@@ -33652,7 +33652,7 @@
         <w:rPr>
           <w:lang w:val="ar_AE" w:bidi="ar_AE"/>
         </w:rPr>
-        <w:t>וַ⁠עֲשֵׂה־חַ֣יִל בְּ⁠אֶפְרָ֔תָה וּ⁠קְרָא־שֵׁ֖ם בְּ⁠בֵ֥ית לָֽחֶם</w:t>
+        <w:t>וַ⁠עֲשֵׂה־חַ֣יִל בְּ⁠אֶפְרָ֔תָה וּ⁠קְרָא־שֵׁ֖ם בְּ⁠בֵ֥ית לָֽחֶם</w:t>
       </w:r>
     </w:p>
     <w:p>
@@ -33787,7 +33787,7 @@
         <w:rPr>
           <w:lang w:val="ar_AE" w:bidi="ar_AE"/>
         </w:rPr>
-        <w:t>וַ⁠עֲשֵׂה־חַ֣יִל בְּ⁠אֶפְרָ֔תָה וּ⁠קְרָא־שֵׁ֖ם בְּ⁠בֵ֥ית לָֽחֶם</w:t>
+        <w:t>וַ⁠עֲשֵׂה־חַ֣יִל בְּ⁠אֶפְרָ֔תָה וּ⁠קְרָא־שֵׁ֖ם בְּ⁠בֵ֥ית לָֽחֶם</w:t>
       </w:r>
     </w:p>
     <w:p>
@@ -33909,7 +33909,7 @@
         <w:rPr>
           <w:lang w:val="ar_AE" w:bidi="ar_AE"/>
         </w:rPr>
-        <w:t>וִ⁠יהִ֤י בֵֽיתְ⁠ךָ֙ כְּ⁠בֵ֣ית פֶּ֔רֶץ</w:t>
+        <w:t>וִ⁠יהִ֤י בֵֽיתְ⁠ךָ֙ כְּ⁠בֵ֣ית פֶּ֔רֶץ</w:t>
       </w:r>
     </w:p>
     <w:p>
@@ -34044,7 +34044,7 @@
         <w:rPr>
           <w:lang w:val="ar_AE" w:bidi="ar_AE"/>
         </w:rPr>
-        <w:t>מִן־הַ⁠זֶּ֗רַע אֲשֶׁ֨ר יִתֵּ֤ן יְהוָה֙ לְ⁠ךָ֔</w:t>
+        <w:t>מִן־הַ⁠זֶּ֗רַע אֲשֶׁ֨ר יִתֵּ֤ן יְהוָה֙ לְ⁠ךָ֔</w:t>
       </w:r>
     </w:p>
     <w:p>
@@ -34166,7 +34166,7 @@
         <w:rPr>
           <w:lang w:val="ar_AE" w:bidi="ar_AE"/>
         </w:rPr>
-        <w:t>וַ⁠יִּקַּ֨ח בֹּ֤עַז אֶת־רוּת֙ וַ⁠תְּהִי־ל֣⁠וֹ לְ⁠אִשָּׁ֔ה</w:t>
+        <w:t>וַ⁠יִּקַּ֨ח בֹּ֤עַז אֶת־רוּת֙ וַ⁠תְּהִי־ל֣⁠וֹ לְ⁠אִשָּׁ֔ה</w:t>
       </w:r>
     </w:p>
     <w:p>
@@ -34288,7 +34288,7 @@
         <w:rPr>
           <w:lang w:val="ar_AE" w:bidi="ar_AE"/>
         </w:rPr>
-        <w:t>וַ⁠יִּקַּ֨ח בֹּ֤עַז אֶת־רוּת֙</w:t>
+        <w:t>וַ⁠יִּקַּ֨ח בֹּ֤עַז אֶת־רוּת֙</w:t>
       </w:r>
     </w:p>
     <w:p>
@@ -34459,7 +34459,7 @@
         <w:rPr>
           <w:lang w:val="ar_AE" w:bidi="ar_AE"/>
         </w:rPr>
-        <w:t>וַ⁠יָּבֹ֖א אֵלֶ֑י⁠הָ</w:t>
+        <w:t>וַ⁠יָּבֹ֖א אֵלֶ֑י⁠הָ</w:t>
       </w:r>
     </w:p>
     <w:p>
@@ -34594,7 +34594,7 @@
         <w:rPr>
           <w:lang w:val="ar_AE" w:bidi="ar_AE"/>
         </w:rPr>
-        <w:t>הַ⁠נָּשִׁים֙</w:t>
+        <w:t>הַ⁠נָּשִׁים֙</w:t>
       </w:r>
     </w:p>
     <w:p>
@@ -34747,7 +34747,7 @@
         <w:rPr>
           <w:lang w:val="ar_AE" w:bidi="ar_AE"/>
         </w:rPr>
-        <w:t>בָּר֣וּךְ יְהוָ֔ה</w:t>
+        <w:t>בָּר֣וּךְ יְהוָ֔ה</w:t>
       </w:r>
     </w:p>
     <w:p>
@@ -34869,7 +34869,7 @@
         <w:rPr>
           <w:lang w:val="ar_AE" w:bidi="ar_AE"/>
         </w:rPr>
-        <w:t>לֹ֣א הִשְׁבִּ֥ית לָ֛⁠ךְ גֹּאֵ֖ל הַ⁠יּ֑וֹם</w:t>
+        <w:t>לֹ֣א הִשְׁבִּ֥ית לָ֛⁠ךְ גֹּאֵ֖ל הַ⁠יּ֑וֹם</w:t>
       </w:r>
     </w:p>
     <w:p>
@@ -35017,7 +35017,7 @@
         <w:rPr>
           <w:lang w:val="ar_AE" w:bidi="ar_AE"/>
         </w:rPr>
-        <w:t>וְ⁠יִקָּרֵ֥א שְׁמ֖⁠וֹ</w:t>
+        <w:t>וְ⁠יִקָּרֵ֥א שְׁמ֖⁠וֹ</w:t>
       </w:r>
     </w:p>
     <w:p>
@@ -35139,7 +35139,7 @@
         <w:rPr>
           <w:lang w:val="ar_AE" w:bidi="ar_AE"/>
         </w:rPr>
-        <w:t>וְ⁠יִקָּרֵ֥א שְׁמ֖⁠וֹ בְּ⁠יִשְׂרָאֵֽל</w:t>
+        <w:t>וְ⁠יִקָּרֵ֥א שְׁמ֖⁠וֹ בְּ⁠יִשְׂרָאֵֽל</w:t>
       </w:r>
     </w:p>
     <w:p>
@@ -35274,7 +35274,7 @@
         <w:rPr>
           <w:lang w:val="ar_AE" w:bidi="ar_AE"/>
         </w:rPr>
-        <w:t>לְ⁠מֵשִׁ֣יב נֶ֔פֶשׁ</w:t>
+        <w:t>לְ⁠מֵשִׁ֣יב נֶ֔פֶשׁ</w:t>
       </w:r>
     </w:p>
     <w:p>
@@ -35409,7 +35409,7 @@
         <w:rPr>
           <w:lang w:val="ar_AE" w:bidi="ar_AE"/>
         </w:rPr>
-        <w:t>וּ⁠לְ⁠כַלְכֵּ֖ל אֶת־שֵׂיבָתֵ֑⁠ךְ</w:t>
+        <w:t>וּ⁠לְ⁠כַלְכֵּ֖ל אֶת־שֵׂיבָתֵ֑⁠ךְ</w:t>
       </w:r>
     </w:p>
     <w:p>
@@ -35544,7 +35544,7 @@
         <w:rPr>
           <w:lang w:val="ar_AE" w:bidi="ar_AE"/>
         </w:rPr>
-        <w:t>כִּ֣י</w:t>
+        <w:t>כִּ֣י</w:t>
       </w:r>
     </w:p>
     <w:p>
@@ -35679,7 +35679,7 @@
         <w:rPr>
           <w:lang w:val="ar_AE" w:bidi="ar_AE"/>
         </w:rPr>
-        <w:t>ט֣וֹבָה לָ֔⁠ךְ מִ⁠שִּׁבְעָ֖ה בָּנִֽים</w:t>
+        <w:t>ט֣וֹבָה לָ֔⁠ךְ מִ⁠שִּׁבְעָ֖ה בָּנִֽים</w:t>
       </w:r>
     </w:p>
     <w:p>
@@ -35800,7 +35800,7 @@
         <w:rPr>
           <w:lang w:val="ar_AE" w:bidi="ar_AE"/>
         </w:rPr>
-        <w:t>וַ⁠תִּקַּ֨ח נָעֳמִ֤י אֶת־הַ⁠יֶּ֨לֶד֙</w:t>
+        <w:t>וַ⁠תִּקַּ֨ח נָעֳמִ֤י אֶת־הַ⁠יֶּ֨לֶד֙</w:t>
       </w:r>
     </w:p>
     <w:p>
@@ -36019,7 +36019,7 @@
         <w:rPr>
           <w:lang w:val="ar_AE" w:bidi="ar_AE"/>
         </w:rPr>
-        <w:t>וַ⁠תִּקְרֶאנָה֩ ל֨⁠וֹ הַ⁠שְּׁכֵנ֥וֹת שֵׁם֙ לֵ⁠אמֹ֔ר &amp; וַ⁠תִּקְרֶ֤אנָֽה שְׁמ⁠וֹ֙ עוֹבֵ֔ד</w:t>
+        <w:t>וַ⁠תִּקְרֶאנָה֩ ל֨⁠וֹ הַ⁠שְּׁכֵנ֥וֹת שֵׁם֙ לֵ⁠אמֹ֔ר &amp; וַ⁠תִּקְרֶ֤אנָֽה שְׁמ⁠וֹ֙ עוֹבֵ֔ד</w:t>
       </w:r>
     </w:p>
     <w:p>
@@ -36155,7 +36155,7 @@
         <w:rPr>
           <w:lang w:val="ar_AE" w:bidi="ar_AE"/>
         </w:rPr>
-        <w:t>יֻלַּד־בֵּ֖ן לְ⁠נָעֳמִ֑י</w:t>
+        <w:t>יֻלַּד־בֵּ֖ן לְ⁠נָעֳמִ֑י</w:t>
       </w:r>
     </w:p>
     <w:p>
@@ -36284,7 +36284,7 @@
         <w:rPr>
           <w:lang w:val="ar_AE" w:bidi="ar_AE"/>
         </w:rPr>
-        <w:t>וַ⁠תִּקְרֶ֤אנָֽה שְׁמ⁠וֹ֙ עוֹבֵ֔ד</w:t>
+        <w:t>וַ⁠תִּקְרֶ֤אנָֽה שְׁמ⁠וֹ֙ עוֹבֵ֔ד</w:t>
       </w:r>
     </w:p>
     <w:p>
@@ -36419,7 +36419,7 @@
         <w:rPr>
           <w:lang w:val="ar_AE" w:bidi="ar_AE"/>
         </w:rPr>
-        <w:t>ה֥וּא אֲבִי־יִשַׁ֖י</w:t>
+        <w:t>ה֥וּא אֲבִי־יִשַׁ֖י</w:t>
       </w:r>
     </w:p>
     <w:p>
@@ -36673,7 +36673,7 @@
         <w:rPr>
           <w:lang w:val="ar_AE" w:bidi="ar_AE"/>
         </w:rPr>
-        <w:t>תּוֹלְד֣וֹת פָּ֔רֶץ</w:t>
+        <w:t>תּוֹלְד֣וֹת פָּ֔רֶץ</w:t>
       </w:r>
     </w:p>
     <w:p>
@@ -36831,7 +36831,7 @@
         <w:rPr>
           <w:lang w:val="ar_AE" w:bidi="ar_AE"/>
         </w:rPr>
-        <w:t>פֶּ֖רֶץ הוֹלִ֥יד אֶת־חֶצְרֽוֹן</w:t>
+        <w:t>פֶּ֖רֶץ הוֹלִ֥יד אֶת־חֶצְרֽוֹן</w:t>
       </w:r>
     </w:p>
     <w:p>
@@ -36973,7 +36973,7 @@
         <w:rPr>
           <w:lang w:val="ar_AE" w:bidi="ar_AE"/>
         </w:rPr>
-        <w:t>וְ⁠חֶצְרוֹן֙ &amp; אֶת־רָ֔ם &amp; אֶת־עַמִּֽינָדָֽב</w:t>
+        <w:t>וְ⁠חֶצְרוֹן֙ &amp; אֶת־רָ֔ם &amp; אֶת־עַמִּֽינָדָֽב</w:t>
       </w:r>
     </w:p>
     <w:p>
@@ -37141,6 +37141,22 @@
         <w:rPr>
           <w:lang w:val="ar_AE" w:bidi="ar_AE"/>
         </w:rPr>
+      </w:r>
+    </w:p>
+    <w:p>
+      <w:pPr>
+        <w:bidi/>
+      </w:pPr>
+      <w:r>
+        <w:rPr>
+          <w:lang w:val="ar_AE" w:bidi="ar_AE"/>
+        </w:rPr>
+      </w:r>
+      <w:r>
+        <w:rPr>
+          <w:lang w:val="ar_AE" w:bidi="ar_AE"/>
+        </w:rPr>
+        <w:t>וְ⁠עַמִּֽינָדָב֙ &amp; וְ⁠נַחְשׁ֖וֹן &amp; אֶת־שַׂלְמָֽה</w:t>
       </w:r>
     </w:p>
     <w:p>

</xml_diff>

<commit_message>
Update Arabic translation notes data for 2026-07-30
</commit_message>
<xml_diff>
--- a/arb/docx/08.content.docx
+++ b/arb/docx/08.content.docx
@@ -768,6 +768,200 @@
         <w:rPr>
           <w:lang w:val="ar_AE" w:bidi="ar_AE"/>
         </w:rPr>
+        <w:t>مقدمة راعوث - أصحاح 1</w:t>
+      </w:r>
+      <w:r>
+        <w:rPr>
+          <w:lang w:val="ar_AE" w:bidi="ar_AE"/>
+        </w:rPr>
+      </w:r>
+    </w:p>
+    <w:p>
+      <w:pPr>
+        <w:pStyle w:val="Heading3"/>
+        <w:bidi/>
+      </w:pPr>
+      <w:r>
+        <w:rPr>
+          <w:lang w:val="ar_AE" w:bidi="ar_AE"/>
+        </w:rPr>
+        <w:t>البنية والصياغة</w:t>
+      </w:r>
+    </w:p>
+    <w:p>
+      <w:pPr>
+        <w:pStyle w:val="Heading4"/>
+        <w:bidi/>
+      </w:pPr>
+      <w:r>
+        <w:rPr>
+          <w:b/>
+          <w:lang w:val="ar_AE" w:bidi="ar_AE"/>
+        </w:rPr>
+        <w:t>حَدَثَ فِي أَيَّامِ حُكْمِ ٱلْقُضَاةِ</w:t>
+      </w:r>
+    </w:p>
+    <w:p>
+      <w:pPr>
+        <w:bidi/>
+      </w:pPr>
+      <w:r>
+        <w:rPr>
+          <w:lang w:val="ar_AE" w:bidi="ar_AE"/>
+        </w:rPr>
+      </w:r>
+      <w:r>
+        <w:rPr>
+          <w:lang w:val="ar_AE" w:bidi="ar_AE"/>
+        </w:rPr>
+        <w:t>تجري أحداث هذا السفر خلال فترة حُكم القضاة، ويتزامن هذا السفر مع سفر القضاة. لفهم الخلفية التاريخية للسفر، قد يَوَد المترجم مراجعة سفر القضاة.</w:t>
+      </w:r>
+    </w:p>
+    <w:p>
+      <w:pPr>
+        <w:pStyle w:val="Heading3"/>
+        <w:bidi/>
+      </w:pPr>
+      <w:r>
+        <w:rPr>
+          <w:lang w:val="ar_AE" w:bidi="ar_AE"/>
+        </w:rPr>
+        <w:t>المفاهيم الخاصة في هذا الإصحاح</w:t>
+      </w:r>
+    </w:p>
+    <w:p>
+      <w:pPr>
+        <w:pStyle w:val="Heading4"/>
+        <w:bidi/>
+      </w:pPr>
+      <w:r>
+        <w:rPr>
+          <w:lang w:val="ar_AE" w:bidi="ar_AE"/>
+        </w:rPr>
+        <w:t>نساء بدون أزواج أو أبناء</w:t>
+      </w:r>
+    </w:p>
+    <w:p>
+      <w:pPr>
+        <w:bidi/>
+      </w:pPr>
+      <w:r>
+        <w:rPr>
+          <w:lang w:val="ar_AE" w:bidi="ar_AE"/>
+        </w:rPr>
+      </w:r>
+      <w:r>
+        <w:rPr>
+          <w:lang w:val="ar_AE" w:bidi="ar_AE"/>
+        </w:rPr>
+        <w:t xml:space="preserve">في الشرق الأدنى القديم، كانت المرأة تُعتبر في وضع حرج إذا لم يكن لها زوج أو أبناء. حيث أنها لم تكن قادرة على إعالة نفسها. لهذا السبب نصحت نعمي </w:t>
+      </w:r>
+      <w:r>
+        <w:rPr>
+          <w:lang w:val="ar_AE" w:bidi="ar_AE"/>
+        </w:rPr>
+        <w:t xml:space="preserve">كَنَّتَيْهَا </w:t>
+      </w:r>
+      <w:r>
+        <w:rPr>
+          <w:lang w:val="ar_AE" w:bidi="ar_AE"/>
+        </w:rPr>
+        <w:t>بالزواج مرة أخرى.</w:t>
+      </w:r>
+    </w:p>
+    <w:p>
+      <w:pPr>
+        <w:pStyle w:val="Heading3"/>
+        <w:bidi/>
+      </w:pPr>
+      <w:r>
+        <w:rPr>
+          <w:lang w:val="ar_AE" w:bidi="ar_AE"/>
+        </w:rPr>
+        <w:t>صعوبات الترجمة الأخرى المحتملة في هذا الإصحاح</w:t>
+      </w:r>
+    </w:p>
+    <w:p>
+      <w:pPr>
+        <w:pStyle w:val="Heading4"/>
+        <w:bidi/>
+      </w:pPr>
+      <w:r>
+        <w:rPr>
+          <w:lang w:val="ar_AE" w:bidi="ar_AE"/>
+        </w:rPr>
+        <w:t>التناقض</w:t>
+      </w:r>
+    </w:p>
+    <w:p>
+      <w:pPr>
+        <w:bidi/>
+      </w:pPr>
+      <w:r>
+        <w:rPr>
+          <w:lang w:val="ar_AE" w:bidi="ar_AE"/>
+        </w:rPr>
+      </w:r>
+      <w:r>
+        <w:rPr>
+          <w:lang w:val="ar_AE" w:bidi="ar_AE"/>
+        </w:rPr>
+        <w:t xml:space="preserve">تُظهر أفعال راعوث الموآبية تناقضًا مع أفعال نعمي اليهودية. فبينما تُبدي راعوث إيمانًا كبيرًا بإله نعمي، لم تكن نعمى تثق بالرب. (انظر: </w:t>
+      </w:r>
+      <w:r>
+        <w:rPr>
+          <w:lang w:val="ar_AE" w:bidi="ar_AE"/>
+        </w:rPr>
+        <w:t>الإيمان</w:t>
+      </w:r>
+      <w:r>
+        <w:rPr>
+          <w:lang w:val="ar_AE" w:bidi="ar_AE"/>
+        </w:rPr>
+        <w:t xml:space="preserve"> و</w:t>
+      </w:r>
+      <w:r>
+        <w:rPr>
+          <w:lang w:val="ar_AE" w:bidi="ar_AE"/>
+        </w:rPr>
+        <w:t>الثقة</w:t>
+      </w:r>
+      <w:r>
+        <w:rPr>
+          <w:lang w:val="ar_AE" w:bidi="ar_AE"/>
+        </w:rPr>
+        <w:t>)</w:t>
+      </w:r>
+      <w:r>
+        <w:rPr>
+          <w:lang w:val="ar_AE" w:bidi="ar_AE"/>
+        </w:rPr>
+      </w:r>
+      <w:r>
+        <w:rPr>
+          <w:lang w:val="ar_AE" w:bidi="ar_AE"/>
+        </w:rPr>
+      </w:r>
+    </w:p>
+    <w:p>
+      <w:pPr>
+        <w:bidi/>
+      </w:pPr>
+      <w:r>
+        <w:rPr>
+          <w:lang w:val="ar_AE" w:bidi="ar_AE"/>
+        </w:rPr>
+      </w:r>
+    </w:p>
+    <w:p>
+      <w:pPr>
+        <w:pStyle w:val="Heading2"/>
+        <w:bidi/>
+      </w:pPr>
+      <w:r>
+        <w:rPr>
+          <w:lang w:val="ar_AE" w:bidi="ar_AE"/>
+        </w:rPr>
         <w:t>راعوث 1: 1 (#1)</w:t>
       </w:r>
       <w:r>
@@ -9963,6 +10157,215 @@
         <w:rPr>
           <w:lang w:val="ar_AE" w:bidi="ar_AE"/>
         </w:rPr>
+        <w:t>مقدمة سفر راعوث - أصحاح 2</w:t>
+      </w:r>
+      <w:r>
+        <w:rPr>
+          <w:lang w:val="ar_AE" w:bidi="ar_AE"/>
+        </w:rPr>
+      </w:r>
+    </w:p>
+    <w:p>
+      <w:pPr>
+        <w:bidi/>
+      </w:pPr>
+      <w:r>
+        <w:rPr>
+          <w:lang w:val="ar_AE" w:bidi="ar_AE"/>
+        </w:rPr>
+      </w:r>
+      <w:r>
+        <w:rPr>
+          <w:lang w:val="ar_AE" w:bidi="ar_AE"/>
+        </w:rPr>
+        <w:t>"# ملاحظات عامة على راعوث 2</w:t>
+      </w:r>
+    </w:p>
+    <w:p>
+      <w:pPr>
+        <w:pStyle w:val="Heading3"/>
+        <w:bidi/>
+      </w:pPr>
+      <w:r>
+        <w:rPr>
+          <w:lang w:val="ar_AE" w:bidi="ar_AE"/>
+        </w:rPr>
+        <w:t>صعوبات الترجمة المحتملة في هذا الإصحاح</w:t>
+      </w:r>
+    </w:p>
+    <w:p>
+      <w:pPr>
+        <w:pStyle w:val="Heading4"/>
+        <w:bidi/>
+      </w:pPr>
+      <w:r>
+        <w:rPr>
+          <w:lang w:val="ar_AE" w:bidi="ar_AE"/>
+        </w:rPr>
+        <w:t>“</w:t>
+      </w:r>
+      <w:r>
+        <w:rPr>
+          <w:lang w:val="ar_AE" w:bidi="ar_AE"/>
+        </w:rPr>
+        <w:t>جَبَّارُ بَأْسٍ</w:t>
+      </w:r>
+      <w:r>
+        <w:rPr>
+          <w:lang w:val="ar_AE" w:bidi="ar_AE"/>
+        </w:rPr>
+        <w:t>” (2:1)</w:t>
+      </w:r>
+    </w:p>
+    <w:p>
+      <w:pPr>
+        <w:bidi/>
+      </w:pPr>
+      <w:r>
+        <w:rPr>
+          <w:lang w:val="ar_AE" w:bidi="ar_AE"/>
+        </w:rPr>
+      </w:r>
+      <w:r>
+        <w:rPr>
+          <w:lang w:val="ar_AE" w:bidi="ar_AE"/>
+        </w:rPr>
+        <w:t>تصف هذه العبارة بوعز بأنه يتمتع بصفات حميدة، ولكن بشكل عام جدًا. حيث أن هذه العبارة يمكن أن تصف شخصًا قويًا وقادرًا من الناحية الجسدية، أو ثريًا، أو صالحًا وتقيًا، أو تصف جميع هذه الصفات معًا. من سياق القصة، نرى أن بوعز يمتلك أرضًا وخدمًا يحترمونه، ويعيش حياة تُرضي الله، لذا يبدو أن هذه العبارة تصف ثروته وشخصيته الفاضلة. فكر في كيفية وصف شخص كهذا في لغتك.</w:t>
+      </w:r>
+    </w:p>
+    <w:p>
+      <w:pPr>
+        <w:pStyle w:val="Heading4"/>
+        <w:bidi/>
+      </w:pPr>
+      <w:r>
+        <w:rPr>
+          <w:lang w:val="ar_AE" w:bidi="ar_AE"/>
+        </w:rPr>
+        <w:t>«</w:t>
+      </w:r>
+      <w:r>
+        <w:rPr>
+          <w:lang w:val="ar_AE" w:bidi="ar_AE"/>
+        </w:rPr>
+        <w:t>لَا تَذْهَبِي لِتَلْتَقِطِي فِي حَقْلِ آخَرَ</w:t>
+      </w:r>
+      <w:r>
+        <w:rPr>
+          <w:lang w:val="ar_AE" w:bidi="ar_AE"/>
+        </w:rPr>
+        <w:t>» (2:8)</w:t>
+      </w:r>
+    </w:p>
+    <w:p>
+      <w:pPr>
+        <w:bidi/>
+      </w:pPr>
+      <w:r>
+        <w:rPr>
+          <w:lang w:val="ar_AE" w:bidi="ar_AE"/>
+        </w:rPr>
+      </w:r>
+      <w:r>
+        <w:rPr>
+          <w:lang w:val="ar_AE" w:bidi="ar_AE"/>
+        </w:rPr>
+        <w:t xml:space="preserve">قال بوعز هذا لأنه لم يكن قادرًا على ضمان سلامة راعوث في حقل شخص آخر. يبدو أن ليس الجميع كانوا بمثل لطف بوعز وطاعته لشريعة موسى. (انظر: </w:t>
+      </w:r>
+      <w:r>
+        <w:rPr>
+          <w:lang w:val="ar_AE" w:bidi="ar_AE"/>
+        </w:rPr>
+        <w:t>النعمة</w:t>
+      </w:r>
+      <w:r>
+        <w:rPr>
+          <w:lang w:val="ar_AE" w:bidi="ar_AE"/>
+        </w:rPr>
+        <w:t xml:space="preserve"> و</w:t>
+      </w:r>
+      <w:r>
+        <w:rPr>
+          <w:lang w:val="ar_AE" w:bidi="ar_AE"/>
+        </w:rPr>
+        <w:t>شريعة موسى</w:t>
+      </w:r>
+      <w:r>
+        <w:rPr>
+          <w:lang w:val="ar_AE" w:bidi="ar_AE"/>
+        </w:rPr>
+        <w:t>)</w:t>
+      </w:r>
+    </w:p>
+    <w:p>
+      <w:pPr>
+        <w:pStyle w:val="Heading4"/>
+        <w:bidi/>
+      </w:pPr>
+      <w:r>
+        <w:rPr>
+          <w:lang w:val="ar_AE" w:bidi="ar_AE"/>
+        </w:rPr>
+        <w:t>“</w:t>
+      </w:r>
+      <w:r>
+        <w:rPr>
+          <w:lang w:val="ar_AE" w:bidi="ar_AE"/>
+        </w:rPr>
+        <w:t>وَلِيِّنَا</w:t>
+      </w:r>
+      <w:r>
+        <w:rPr>
+          <w:lang w:val="ar_AE" w:bidi="ar_AE"/>
+        </w:rPr>
+        <w:t>” (2:20)</w:t>
+      </w:r>
+    </w:p>
+    <w:p>
+      <w:pPr>
+        <w:bidi/>
+      </w:pPr>
+      <w:r>
+        <w:rPr>
+          <w:lang w:val="ar_AE" w:bidi="ar_AE"/>
+        </w:rPr>
+      </w:r>
+      <w:r>
+        <w:rPr>
+          <w:lang w:val="ar_AE" w:bidi="ar_AE"/>
+        </w:rPr>
+        <w:t>كان "الوليّ" هو قريبًا ذكرًا مسؤولًا عن إعالة أي فرد من أفراد نفس العشيرة يحتاج إلى مساعدة، وعن الوفاء بالتزامات زواج الأخ من أرملة أخيه، وعن إعادة شراء الأراضي المُباعة خارج العائلة، وإعادتها إليها. انظر مقدمة السفر لمزيد من المعلومات.</w:t>
+      </w:r>
+      <w:r>
+        <w:rPr>
+          <w:lang w:val="ar_AE" w:bidi="ar_AE"/>
+        </w:rPr>
+      </w:r>
+      <w:r>
+        <w:rPr>
+          <w:lang w:val="ar_AE" w:bidi="ar_AE"/>
+        </w:rPr>
+      </w:r>
+    </w:p>
+    <w:p>
+      <w:pPr>
+        <w:bidi/>
+      </w:pPr>
+      <w:r>
+        <w:rPr>
+          <w:lang w:val="ar_AE" w:bidi="ar_AE"/>
+        </w:rPr>
+      </w:r>
+    </w:p>
+    <w:p>
+      <w:pPr>
+        <w:pStyle w:val="Heading2"/>
+        <w:bidi/>
+      </w:pPr>
+      <w:r>
+        <w:rPr>
+          <w:lang w:val="ar_AE" w:bidi="ar_AE"/>
+        </w:rPr>
         <w:t>راعوث 2: 1 (#1)</w:t>
       </w:r>
       <w:r>
@@ -19733,6 +20136,135 @@
           <w:lang w:val="ar_AE" w:bidi="ar_AE"/>
         </w:rPr>
         <w:t>المبني للمعلوم أو المبني للمجهول</w:t>
+      </w:r>
+      <w:r>
+        <w:rPr>
+          <w:lang w:val="ar_AE" w:bidi="ar_AE"/>
+        </w:rPr>
+      </w:r>
+      <w:r>
+        <w:rPr>
+          <w:lang w:val="ar_AE" w:bidi="ar_AE"/>
+        </w:rPr>
+      </w:r>
+    </w:p>
+    <w:p>
+      <w:pPr>
+        <w:bidi/>
+      </w:pPr>
+      <w:r>
+        <w:rPr>
+          <w:lang w:val="ar_AE" w:bidi="ar_AE"/>
+        </w:rPr>
+      </w:r>
+    </w:p>
+    <w:p>
+      <w:pPr>
+        <w:pStyle w:val="Heading2"/>
+        <w:bidi/>
+      </w:pPr>
+      <w:r>
+        <w:rPr>
+          <w:lang w:val="ar_AE" w:bidi="ar_AE"/>
+        </w:rPr>
+        <w:t>مقدمة سفر راعوث - أصحاح 3</w:t>
+      </w:r>
+      <w:r>
+        <w:rPr>
+          <w:lang w:val="ar_AE" w:bidi="ar_AE"/>
+        </w:rPr>
+      </w:r>
+    </w:p>
+    <w:p>
+      <w:pPr>
+        <w:pStyle w:val="Heading3"/>
+        <w:bidi/>
+      </w:pPr>
+      <w:r>
+        <w:rPr>
+          <w:lang w:val="ar_AE" w:bidi="ar_AE"/>
+        </w:rPr>
+        <w:t>المفاهيم الخاصة في هذا الاصحاح</w:t>
+      </w:r>
+    </w:p>
+    <w:p>
+      <w:pPr>
+        <w:pStyle w:val="Heading4"/>
+        <w:bidi/>
+      </w:pPr>
+      <w:r>
+        <w:rPr>
+          <w:lang w:val="ar_AE" w:bidi="ar_AE"/>
+        </w:rPr>
+        <w:t>نزاهة بوعز</w:t>
+      </w:r>
+    </w:p>
+    <w:p>
+      <w:pPr>
+        <w:bidi/>
+      </w:pPr>
+      <w:r>
+        <w:rPr>
+          <w:lang w:val="ar_AE" w:bidi="ar_AE"/>
+        </w:rPr>
+      </w:r>
+      <w:r>
+        <w:rPr>
+          <w:lang w:val="ar_AE" w:bidi="ar_AE"/>
+        </w:rPr>
+        <w:t>أظهر بوعز نزاهة كبيرة في هذا الأصحاح بعدم إقامته لأي علاقة جنسية مع راعوث حتى يتزوجا. كما كان حريصًا على الحفاظ على سمعة راعوث الطيبة. ويُعد إظهار حُسن أخلاق بوعز نقطة مهمة في هذا الأصحاح.</w:t>
+      </w:r>
+    </w:p>
+    <w:p>
+      <w:pPr>
+        <w:pStyle w:val="Heading3"/>
+        <w:bidi/>
+      </w:pPr>
+      <w:r>
+        <w:rPr>
+          <w:lang w:val="ar_AE" w:bidi="ar_AE"/>
+        </w:rPr>
+        <w:t>صعوبات الترجمة الأخرى المحتملة في هذا الاصحاح</w:t>
+      </w:r>
+    </w:p>
+    <w:p>
+      <w:pPr>
+        <w:pStyle w:val="Heading4"/>
+        <w:bidi/>
+      </w:pPr>
+      <w:r>
+        <w:rPr>
+          <w:lang w:val="ar_AE" w:bidi="ar_AE"/>
+        </w:rPr>
+        <w:t>لِيَكُونَ لَكِ خَيْرٌ</w:t>
+      </w:r>
+    </w:p>
+    <w:p>
+      <w:pPr>
+        <w:bidi/>
+      </w:pPr>
+      <w:r>
+        <w:rPr>
+          <w:lang w:val="ar_AE" w:bidi="ar_AE"/>
+        </w:rPr>
+      </w:r>
+      <w:r>
+        <w:rPr>
+          <w:lang w:val="ar_AE" w:bidi="ar_AE"/>
+        </w:rPr>
+        <w:t xml:space="preserve">كانت نعمي ترغب في أن يكون لراعوث بيت آمن مع زوج صالح يعتني بها. وقد رأت أن بوعز سيكون أفضل زوج لها. كما اعتقدت أن بوعز، بصفته ولياً لهم، كان مُلزم بالزواج منها. قد يكون هذا صحيحاً لأنه، على الرغم من أن راعوث كانت أممية المولد، إلا أنها أصبحت جزءاً من عائلة نعمي وجزءاً من أمة إسرائيل. (انظر: </w:t>
+      </w:r>
+      <w:r>
+        <w:rPr>
+          <w:lang w:val="ar_AE" w:bidi="ar_AE"/>
+        </w:rPr>
+        <w:t>المعرفة المفترضة والمعلومات الضمنية</w:t>
+      </w:r>
+      <w:r>
+        <w:rPr>
+          <w:lang w:val="ar_AE" w:bidi="ar_AE"/>
+        </w:rPr>
+        <w:t>)</w:t>
       </w:r>
       <w:r>
         <w:rPr>
@@ -28000,6 +28532,191 @@
         <w:rPr>
           <w:lang w:val="ar_AE" w:bidi="ar_AE"/>
         </w:rPr>
+        <w:t>مقدمة سفر راعوث - أصحاح 4</w:t>
+      </w:r>
+      <w:r>
+        <w:rPr>
+          <w:lang w:val="ar_AE" w:bidi="ar_AE"/>
+        </w:rPr>
+      </w:r>
+    </w:p>
+    <w:p>
+      <w:pPr>
+        <w:bidi/>
+      </w:pPr>
+      <w:r>
+        <w:rPr>
+          <w:lang w:val="ar_AE" w:bidi="ar_AE"/>
+        </w:rPr>
+      </w:r>
+      <w:r>
+        <w:rPr>
+          <w:lang w:val="ar_AE" w:bidi="ar_AE"/>
+        </w:rPr>
+        <w:t>"# ملاحظات عامة على راعوث 4</w:t>
+      </w:r>
+    </w:p>
+    <w:p>
+      <w:pPr>
+        <w:pStyle w:val="Heading3"/>
+        <w:bidi/>
+      </w:pPr>
+      <w:r>
+        <w:rPr>
+          <w:lang w:val="ar_AE" w:bidi="ar_AE"/>
+        </w:rPr>
+        <w:t>المفاهيم الخاصة في هذا الاصحاح</w:t>
+      </w:r>
+    </w:p>
+    <w:p>
+      <w:pPr>
+        <w:pStyle w:val="Heading4"/>
+        <w:bidi/>
+      </w:pPr>
+      <w:r>
+        <w:rPr>
+          <w:lang w:val="ar_AE" w:bidi="ar_AE"/>
+        </w:rPr>
+        <w:t>الملك داوود</w:t>
+      </w:r>
+    </w:p>
+    <w:p>
+      <w:pPr>
+        <w:bidi/>
+      </w:pPr>
+      <w:r>
+        <w:rPr>
+          <w:lang w:val="ar_AE" w:bidi="ar_AE"/>
+        </w:rPr>
+      </w:r>
+      <w:r>
+        <w:rPr>
+          <w:lang w:val="ar_AE" w:bidi="ar_AE"/>
+        </w:rPr>
+        <w:t>على الرغم من كون راعوث موآبية، إلا أنها أصبحت جدة لداود، الذي هو أعظم ملوك إسرائيل. قد يكون الأمر مُستغربًا أن تصبح امرأة غير يهودية جزءًا من سلالة مهمة كهذه، لكن هذا يذكرنا بأن الله يحب جميع الناس. لقد كان لدى راعوث إيمان عظيم بالرب، وهذا يظهر لنا أن الله يرحب بكل من يؤمن به.</w:t>
+      </w:r>
+    </w:p>
+    <w:p>
+      <w:pPr>
+        <w:pStyle w:val="Heading4"/>
+        <w:bidi/>
+      </w:pPr>
+      <w:r>
+        <w:rPr>
+          <w:lang w:val="ar_AE" w:bidi="ar_AE"/>
+        </w:rPr>
+        <w:t>"</w:t>
+      </w:r>
+      <w:r>
+        <w:rPr>
+          <w:lang w:val="ar_AE" w:bidi="ar_AE"/>
+        </w:rPr>
+        <w:t>تَشْتَرِي أَيْضًا مِنْ يَدِ رَاعُوثَ ٱلْمُوآبِيَّةِ</w:t>
+      </w:r>
+      <w:r>
+        <w:rPr>
+          <w:lang w:val="ar_AE" w:bidi="ar_AE"/>
+        </w:rPr>
+        <w:t>"</w:t>
+      </w:r>
+    </w:p>
+    <w:p>
+      <w:pPr>
+        <w:bidi/>
+      </w:pPr>
+      <w:r>
+        <w:rPr>
+          <w:lang w:val="ar_AE" w:bidi="ar_AE"/>
+        </w:rPr>
+      </w:r>
+      <w:r>
+        <w:rPr>
+          <w:lang w:val="ar_AE" w:bidi="ar_AE"/>
+        </w:rPr>
+        <w:t>جاءت مسؤولية رعاية أرامل العائلة مع امتياز استخدام أرض العائلة . لذلك، كان على القريب الذي يريد استخدام أرض نعمي أن يساعد أيضًا راعوث في إنجاب ابن يحمل اسم العائلة وميراثها وأن يعولها.</w:t>
+      </w:r>
+    </w:p>
+    <w:p>
+      <w:pPr>
+        <w:pStyle w:val="Heading3"/>
+        <w:bidi/>
+      </w:pPr>
+      <w:r>
+        <w:rPr>
+          <w:lang w:val="ar_AE" w:bidi="ar_AE"/>
+        </w:rPr>
+        <w:t>صعوبات الترجمة الأخرى المحتملة في هذا الأصحاح</w:t>
+      </w:r>
+    </w:p>
+    <w:p>
+      <w:pPr>
+        <w:pStyle w:val="Heading4"/>
+        <w:bidi/>
+      </w:pPr>
+      <w:r>
+        <w:rPr>
+          <w:lang w:val="ar_AE" w:bidi="ar_AE"/>
+        </w:rPr>
+        <w:t>"</w:t>
+      </w:r>
+      <w:r>
+        <w:rPr>
+          <w:lang w:val="ar_AE" w:bidi="ar_AE"/>
+        </w:rPr>
+        <w:t>سَابِقًا فِي إِسْرَائِيلَ</w:t>
+      </w:r>
+      <w:r>
+        <w:rPr>
+          <w:lang w:val="ar_AE" w:bidi="ar_AE"/>
+        </w:rPr>
+        <w:t>"</w:t>
+      </w:r>
+    </w:p>
+    <w:p>
+      <w:pPr>
+        <w:bidi/>
+      </w:pPr>
+      <w:r>
+        <w:rPr>
+          <w:lang w:val="ar_AE" w:bidi="ar_AE"/>
+        </w:rPr>
+      </w:r>
+      <w:r>
+        <w:rPr>
+          <w:lang w:val="ar_AE" w:bidi="ar_AE"/>
+        </w:rPr>
+        <w:t>الآية السابعة من الإصحاح الرابع هي تعليق أضافه كاتب النص. وهذا يشير إلى وجود فترة طويلة بين زمن وقوع الأحداث وزمن كتابتها، بحيث كانت العادات قد تغيرت. فكِّر كيف تشير إلى أن هذه العبارة هي تعليق على القصة وليست جزءًا منها.</w:t>
+      </w:r>
+      <w:r>
+        <w:rPr>
+          <w:lang w:val="ar_AE" w:bidi="ar_AE"/>
+        </w:rPr>
+      </w:r>
+      <w:r>
+        <w:rPr>
+          <w:lang w:val="ar_AE" w:bidi="ar_AE"/>
+        </w:rPr>
+      </w:r>
+    </w:p>
+    <w:p>
+      <w:pPr>
+        <w:bidi/>
+      </w:pPr>
+      <w:r>
+        <w:rPr>
+          <w:lang w:val="ar_AE" w:bidi="ar_AE"/>
+        </w:rPr>
+      </w:r>
+    </w:p>
+    <w:p>
+      <w:pPr>
+        <w:pStyle w:val="Heading2"/>
+        <w:bidi/>
+      </w:pPr>
+      <w:r>
+        <w:rPr>
+          <w:lang w:val="ar_AE" w:bidi="ar_AE"/>
+        </w:rPr>
         <w:t>راعوث 4: 1 (#1)</w:t>
       </w:r>
       <w:r>
@@ -37403,723 +38120,6 @@
           <w:lang w:val="ar_AE" w:bidi="ar_AE"/>
         </w:rPr>
         <w:t>المعرفة المفترضة والمعلومات الضمنية</w:t>
-      </w:r>
-      <w:r>
-        <w:rPr>
-          <w:lang w:val="ar_AE" w:bidi="ar_AE"/>
-        </w:rPr>
-      </w:r>
-      <w:r>
-        <w:rPr>
-          <w:lang w:val="ar_AE" w:bidi="ar_AE"/>
-        </w:rPr>
-      </w:r>
-    </w:p>
-    <w:p>
-      <w:pPr>
-        <w:bidi/>
-      </w:pPr>
-      <w:r>
-        <w:rPr>
-          <w:lang w:val="ar_AE" w:bidi="ar_AE"/>
-        </w:rPr>
-      </w:r>
-    </w:p>
-    <w:p>
-      <w:pPr>
-        <w:pStyle w:val="Heading2"/>
-        <w:bidi/>
-      </w:pPr>
-      <w:r>
-        <w:rPr>
-          <w:lang w:val="ar_AE" w:bidi="ar_AE"/>
-        </w:rPr>
-        <w:t>مقدمة راعوث - أصحاح 1</w:t>
-      </w:r>
-      <w:r>
-        <w:rPr>
-          <w:lang w:val="ar_AE" w:bidi="ar_AE"/>
-        </w:rPr>
-      </w:r>
-    </w:p>
-    <w:p>
-      <w:pPr>
-        <w:pStyle w:val="Heading3"/>
-        <w:bidi/>
-      </w:pPr>
-      <w:r>
-        <w:rPr>
-          <w:lang w:val="ar_AE" w:bidi="ar_AE"/>
-        </w:rPr>
-        <w:t>البنية والصياغة</w:t>
-      </w:r>
-    </w:p>
-    <w:p>
-      <w:pPr>
-        <w:pStyle w:val="Heading4"/>
-        <w:bidi/>
-      </w:pPr>
-      <w:r>
-        <w:rPr>
-          <w:b/>
-          <w:lang w:val="ar_AE" w:bidi="ar_AE"/>
-        </w:rPr>
-        <w:t>حَدَثَ فِي أَيَّامِ حُكْمِ ٱلْقُضَاةِ</w:t>
-      </w:r>
-    </w:p>
-    <w:p>
-      <w:pPr>
-        <w:bidi/>
-      </w:pPr>
-      <w:r>
-        <w:rPr>
-          <w:lang w:val="ar_AE" w:bidi="ar_AE"/>
-        </w:rPr>
-      </w:r>
-      <w:r>
-        <w:rPr>
-          <w:lang w:val="ar_AE" w:bidi="ar_AE"/>
-        </w:rPr>
-        <w:t>تجري أحداث هذا السفر خلال فترة حُكم القضاة، ويتزامن هذا السفر مع سفر القضاة. لفهم الخلفية التاريخية للسفر، قد يَوَد المترجم مراجعة سفر القضاة.</w:t>
-      </w:r>
-    </w:p>
-    <w:p>
-      <w:pPr>
-        <w:pStyle w:val="Heading3"/>
-        <w:bidi/>
-      </w:pPr>
-      <w:r>
-        <w:rPr>
-          <w:lang w:val="ar_AE" w:bidi="ar_AE"/>
-        </w:rPr>
-        <w:t>المفاهيم الخاصة في هذا الإصحاح</w:t>
-      </w:r>
-    </w:p>
-    <w:p>
-      <w:pPr>
-        <w:pStyle w:val="Heading4"/>
-        <w:bidi/>
-      </w:pPr>
-      <w:r>
-        <w:rPr>
-          <w:lang w:val="ar_AE" w:bidi="ar_AE"/>
-        </w:rPr>
-        <w:t>نساء بدون أزواج أو أبناء</w:t>
-      </w:r>
-    </w:p>
-    <w:p>
-      <w:pPr>
-        <w:bidi/>
-      </w:pPr>
-      <w:r>
-        <w:rPr>
-          <w:lang w:val="ar_AE" w:bidi="ar_AE"/>
-        </w:rPr>
-      </w:r>
-      <w:r>
-        <w:rPr>
-          <w:lang w:val="ar_AE" w:bidi="ar_AE"/>
-        </w:rPr>
-        <w:t xml:space="preserve">في الشرق الأدنى القديم، كانت المرأة تُعتبر في وضع حرج إذا لم يكن لها زوج أو أبناء. حيث أنها لم تكن قادرة على إعالة نفسها. لهذا السبب نصحت نعمي </w:t>
-      </w:r>
-      <w:r>
-        <w:rPr>
-          <w:lang w:val="ar_AE" w:bidi="ar_AE"/>
-        </w:rPr>
-        <w:t xml:space="preserve">كَنَّتَيْهَا </w:t>
-      </w:r>
-      <w:r>
-        <w:rPr>
-          <w:lang w:val="ar_AE" w:bidi="ar_AE"/>
-        </w:rPr>
-        <w:t>بالزواج مرة أخرى.</w:t>
-      </w:r>
-    </w:p>
-    <w:p>
-      <w:pPr>
-        <w:pStyle w:val="Heading3"/>
-        <w:bidi/>
-      </w:pPr>
-      <w:r>
-        <w:rPr>
-          <w:lang w:val="ar_AE" w:bidi="ar_AE"/>
-        </w:rPr>
-        <w:t>صعوبات الترجمة الأخرى المحتملة في هذا الإصحاح</w:t>
-      </w:r>
-    </w:p>
-    <w:p>
-      <w:pPr>
-        <w:pStyle w:val="Heading4"/>
-        <w:bidi/>
-      </w:pPr>
-      <w:r>
-        <w:rPr>
-          <w:lang w:val="ar_AE" w:bidi="ar_AE"/>
-        </w:rPr>
-        <w:t>التناقض</w:t>
-      </w:r>
-    </w:p>
-    <w:p>
-      <w:pPr>
-        <w:bidi/>
-      </w:pPr>
-      <w:r>
-        <w:rPr>
-          <w:lang w:val="ar_AE" w:bidi="ar_AE"/>
-        </w:rPr>
-      </w:r>
-      <w:r>
-        <w:rPr>
-          <w:lang w:val="ar_AE" w:bidi="ar_AE"/>
-        </w:rPr>
-        <w:t xml:space="preserve">تُظهر أفعال راعوث الموآبية تناقضًا مع أفعال نعمي اليهودية. فبينما تُبدي راعوث إيمانًا كبيرًا بإله نعمي، لم تكن نعمى تثق بالرب. (انظر: </w:t>
-      </w:r>
-      <w:r>
-        <w:rPr>
-          <w:lang w:val="ar_AE" w:bidi="ar_AE"/>
-        </w:rPr>
-        <w:t>الإيمان</w:t>
-      </w:r>
-      <w:r>
-        <w:rPr>
-          <w:lang w:val="ar_AE" w:bidi="ar_AE"/>
-        </w:rPr>
-        <w:t xml:space="preserve"> و</w:t>
-      </w:r>
-      <w:r>
-        <w:rPr>
-          <w:lang w:val="ar_AE" w:bidi="ar_AE"/>
-        </w:rPr>
-        <w:t>الثقة</w:t>
-      </w:r>
-      <w:r>
-        <w:rPr>
-          <w:lang w:val="ar_AE" w:bidi="ar_AE"/>
-        </w:rPr>
-        <w:t>)</w:t>
-      </w:r>
-      <w:r>
-        <w:rPr>
-          <w:lang w:val="ar_AE" w:bidi="ar_AE"/>
-        </w:rPr>
-      </w:r>
-      <w:r>
-        <w:rPr>
-          <w:lang w:val="ar_AE" w:bidi="ar_AE"/>
-        </w:rPr>
-      </w:r>
-    </w:p>
-    <w:p>
-      <w:pPr>
-        <w:bidi/>
-      </w:pPr>
-      <w:r>
-        <w:rPr>
-          <w:lang w:val="ar_AE" w:bidi="ar_AE"/>
-        </w:rPr>
-      </w:r>
-    </w:p>
-    <w:p>
-      <w:pPr>
-        <w:pStyle w:val="Heading2"/>
-        <w:bidi/>
-      </w:pPr>
-      <w:r>
-        <w:rPr>
-          <w:lang w:val="ar_AE" w:bidi="ar_AE"/>
-        </w:rPr>
-        <w:t>مقدمة سفر راعوث - أصحاح 2</w:t>
-      </w:r>
-      <w:r>
-        <w:rPr>
-          <w:lang w:val="ar_AE" w:bidi="ar_AE"/>
-        </w:rPr>
-      </w:r>
-    </w:p>
-    <w:p>
-      <w:pPr>
-        <w:bidi/>
-      </w:pPr>
-      <w:r>
-        <w:rPr>
-          <w:lang w:val="ar_AE" w:bidi="ar_AE"/>
-        </w:rPr>
-      </w:r>
-      <w:r>
-        <w:rPr>
-          <w:lang w:val="ar_AE" w:bidi="ar_AE"/>
-        </w:rPr>
-        <w:t>"# ملاحظات عامة على راعوث 2</w:t>
-      </w:r>
-    </w:p>
-    <w:p>
-      <w:pPr>
-        <w:pStyle w:val="Heading3"/>
-        <w:bidi/>
-      </w:pPr>
-      <w:r>
-        <w:rPr>
-          <w:lang w:val="ar_AE" w:bidi="ar_AE"/>
-        </w:rPr>
-        <w:t>صعوبات الترجمة المحتملة في هذا الإصحاح</w:t>
-      </w:r>
-    </w:p>
-    <w:p>
-      <w:pPr>
-        <w:pStyle w:val="Heading4"/>
-        <w:bidi/>
-      </w:pPr>
-      <w:r>
-        <w:rPr>
-          <w:lang w:val="ar_AE" w:bidi="ar_AE"/>
-        </w:rPr>
-        <w:t>“</w:t>
-      </w:r>
-      <w:r>
-        <w:rPr>
-          <w:lang w:val="ar_AE" w:bidi="ar_AE"/>
-        </w:rPr>
-        <w:t>جَبَّارُ بَأْسٍ</w:t>
-      </w:r>
-      <w:r>
-        <w:rPr>
-          <w:lang w:val="ar_AE" w:bidi="ar_AE"/>
-        </w:rPr>
-        <w:t>” (2:1)</w:t>
-      </w:r>
-    </w:p>
-    <w:p>
-      <w:pPr>
-        <w:bidi/>
-      </w:pPr>
-      <w:r>
-        <w:rPr>
-          <w:lang w:val="ar_AE" w:bidi="ar_AE"/>
-        </w:rPr>
-      </w:r>
-      <w:r>
-        <w:rPr>
-          <w:lang w:val="ar_AE" w:bidi="ar_AE"/>
-        </w:rPr>
-        <w:t>تصف هذه العبارة بوعز بأنه يتمتع بصفات حميدة، ولكن بشكل عام جدًا. حيث أن هذه العبارة يمكن أن تصف شخصًا قويًا وقادرًا من الناحية الجسدية، أو ثريًا، أو صالحًا وتقيًا، أو تصف جميع هذه الصفات معًا. من سياق القصة، نرى أن بوعز يمتلك أرضًا وخدمًا يحترمونه، ويعيش حياة تُرضي الله، لذا يبدو أن هذه العبارة تصف ثروته وشخصيته الفاضلة. فكر في كيفية وصف شخص كهذا في لغتك.</w:t>
-      </w:r>
-    </w:p>
-    <w:p>
-      <w:pPr>
-        <w:pStyle w:val="Heading4"/>
-        <w:bidi/>
-      </w:pPr>
-      <w:r>
-        <w:rPr>
-          <w:lang w:val="ar_AE" w:bidi="ar_AE"/>
-        </w:rPr>
-        <w:t>«</w:t>
-      </w:r>
-      <w:r>
-        <w:rPr>
-          <w:lang w:val="ar_AE" w:bidi="ar_AE"/>
-        </w:rPr>
-        <w:t>لَا تَذْهَبِي لِتَلْتَقِطِي فِي حَقْلِ آخَرَ</w:t>
-      </w:r>
-      <w:r>
-        <w:rPr>
-          <w:lang w:val="ar_AE" w:bidi="ar_AE"/>
-        </w:rPr>
-        <w:t>» (2:8)</w:t>
-      </w:r>
-    </w:p>
-    <w:p>
-      <w:pPr>
-        <w:bidi/>
-      </w:pPr>
-      <w:r>
-        <w:rPr>
-          <w:lang w:val="ar_AE" w:bidi="ar_AE"/>
-        </w:rPr>
-      </w:r>
-      <w:r>
-        <w:rPr>
-          <w:lang w:val="ar_AE" w:bidi="ar_AE"/>
-        </w:rPr>
-        <w:t xml:space="preserve">قال بوعز هذا لأنه لم يكن قادرًا على ضمان سلامة راعوث في حقل شخص آخر. يبدو أن ليس الجميع كانوا بمثل لطف بوعز وطاعته لشريعة موسى. (انظر: </w:t>
-      </w:r>
-      <w:r>
-        <w:rPr>
-          <w:lang w:val="ar_AE" w:bidi="ar_AE"/>
-        </w:rPr>
-        <w:t>النعمة</w:t>
-      </w:r>
-      <w:r>
-        <w:rPr>
-          <w:lang w:val="ar_AE" w:bidi="ar_AE"/>
-        </w:rPr>
-        <w:t xml:space="preserve"> و</w:t>
-      </w:r>
-      <w:r>
-        <w:rPr>
-          <w:lang w:val="ar_AE" w:bidi="ar_AE"/>
-        </w:rPr>
-        <w:t>شريعة موسى</w:t>
-      </w:r>
-      <w:r>
-        <w:rPr>
-          <w:lang w:val="ar_AE" w:bidi="ar_AE"/>
-        </w:rPr>
-        <w:t>)</w:t>
-      </w:r>
-    </w:p>
-    <w:p>
-      <w:pPr>
-        <w:pStyle w:val="Heading4"/>
-        <w:bidi/>
-      </w:pPr>
-      <w:r>
-        <w:rPr>
-          <w:lang w:val="ar_AE" w:bidi="ar_AE"/>
-        </w:rPr>
-        <w:t>“</w:t>
-      </w:r>
-      <w:r>
-        <w:rPr>
-          <w:lang w:val="ar_AE" w:bidi="ar_AE"/>
-        </w:rPr>
-        <w:t>وَلِيِّنَا</w:t>
-      </w:r>
-      <w:r>
-        <w:rPr>
-          <w:lang w:val="ar_AE" w:bidi="ar_AE"/>
-        </w:rPr>
-        <w:t>” (2:20)</w:t>
-      </w:r>
-    </w:p>
-    <w:p>
-      <w:pPr>
-        <w:bidi/>
-      </w:pPr>
-      <w:r>
-        <w:rPr>
-          <w:lang w:val="ar_AE" w:bidi="ar_AE"/>
-        </w:rPr>
-      </w:r>
-      <w:r>
-        <w:rPr>
-          <w:lang w:val="ar_AE" w:bidi="ar_AE"/>
-        </w:rPr>
-        <w:t>كان "الوليّ" هو قريبًا ذكرًا مسؤولًا عن إعالة أي فرد من أفراد نفس العشيرة يحتاج إلى مساعدة، وعن الوفاء بالتزامات زواج الأخ من أرملة أخيه، وعن إعادة شراء الأراضي المُباعة خارج العائلة، وإعادتها إليها. انظر مقدمة السفر لمزيد من المعلومات.</w:t>
-      </w:r>
-      <w:r>
-        <w:rPr>
-          <w:lang w:val="ar_AE" w:bidi="ar_AE"/>
-        </w:rPr>
-      </w:r>
-      <w:r>
-        <w:rPr>
-          <w:lang w:val="ar_AE" w:bidi="ar_AE"/>
-        </w:rPr>
-      </w:r>
-    </w:p>
-    <w:p>
-      <w:pPr>
-        <w:bidi/>
-      </w:pPr>
-      <w:r>
-        <w:rPr>
-          <w:lang w:val="ar_AE" w:bidi="ar_AE"/>
-        </w:rPr>
-      </w:r>
-    </w:p>
-    <w:p>
-      <w:pPr>
-        <w:pStyle w:val="Heading2"/>
-        <w:bidi/>
-      </w:pPr>
-      <w:r>
-        <w:rPr>
-          <w:lang w:val="ar_AE" w:bidi="ar_AE"/>
-        </w:rPr>
-        <w:t>مقدمة سفر راعوث - أصحاح 3</w:t>
-      </w:r>
-      <w:r>
-        <w:rPr>
-          <w:lang w:val="ar_AE" w:bidi="ar_AE"/>
-        </w:rPr>
-      </w:r>
-    </w:p>
-    <w:p>
-      <w:pPr>
-        <w:pStyle w:val="Heading3"/>
-        <w:bidi/>
-      </w:pPr>
-      <w:r>
-        <w:rPr>
-          <w:lang w:val="ar_AE" w:bidi="ar_AE"/>
-        </w:rPr>
-        <w:t>المفاهيم الخاصة في هذا الاصحاح</w:t>
-      </w:r>
-    </w:p>
-    <w:p>
-      <w:pPr>
-        <w:pStyle w:val="Heading4"/>
-        <w:bidi/>
-      </w:pPr>
-      <w:r>
-        <w:rPr>
-          <w:lang w:val="ar_AE" w:bidi="ar_AE"/>
-        </w:rPr>
-        <w:t>نزاهة بوعز</w:t>
-      </w:r>
-    </w:p>
-    <w:p>
-      <w:pPr>
-        <w:bidi/>
-      </w:pPr>
-      <w:r>
-        <w:rPr>
-          <w:lang w:val="ar_AE" w:bidi="ar_AE"/>
-        </w:rPr>
-      </w:r>
-      <w:r>
-        <w:rPr>
-          <w:lang w:val="ar_AE" w:bidi="ar_AE"/>
-        </w:rPr>
-        <w:t>أظهر بوعز نزاهة كبيرة في هذا الأصحاح بعدم إقامته لأي علاقة جنسية مع راعوث حتى يتزوجا. كما كان حريصًا على الحفاظ على سمعة راعوث الطيبة. ويُعد إظهار حُسن أخلاق بوعز نقطة مهمة في هذا الأصحاح.</w:t>
-      </w:r>
-    </w:p>
-    <w:p>
-      <w:pPr>
-        <w:pStyle w:val="Heading3"/>
-        <w:bidi/>
-      </w:pPr>
-      <w:r>
-        <w:rPr>
-          <w:lang w:val="ar_AE" w:bidi="ar_AE"/>
-        </w:rPr>
-        <w:t>صعوبات الترجمة الأخرى المحتملة في هذا الاصحاح</w:t>
-      </w:r>
-    </w:p>
-    <w:p>
-      <w:pPr>
-        <w:pStyle w:val="Heading4"/>
-        <w:bidi/>
-      </w:pPr>
-      <w:r>
-        <w:rPr>
-          <w:lang w:val="ar_AE" w:bidi="ar_AE"/>
-        </w:rPr>
-        <w:t>لِيَكُونَ لَكِ خَيْرٌ</w:t>
-      </w:r>
-    </w:p>
-    <w:p>
-      <w:pPr>
-        <w:bidi/>
-      </w:pPr>
-      <w:r>
-        <w:rPr>
-          <w:lang w:val="ar_AE" w:bidi="ar_AE"/>
-        </w:rPr>
-      </w:r>
-      <w:r>
-        <w:rPr>
-          <w:lang w:val="ar_AE" w:bidi="ar_AE"/>
-        </w:rPr>
-        <w:t xml:space="preserve">كانت نعمي ترغب في أن يكون لراعوث بيت آمن مع زوج صالح يعتني بها. وقد رأت أن بوعز سيكون أفضل زوج لها. كما اعتقدت أن بوعز، بصفته ولياً لهم، كان مُلزم بالزواج منها. قد يكون هذا صحيحاً لأنه، على الرغم من أن راعوث كانت أممية المولد، إلا أنها أصبحت جزءاً من عائلة نعمي وجزءاً من أمة إسرائيل. (انظر: </w:t>
-      </w:r>
-      <w:r>
-        <w:rPr>
-          <w:lang w:val="ar_AE" w:bidi="ar_AE"/>
-        </w:rPr>
-        <w:t>المعرفة المفترضة والمعلومات الضمنية</w:t>
-      </w:r>
-      <w:r>
-        <w:rPr>
-          <w:lang w:val="ar_AE" w:bidi="ar_AE"/>
-        </w:rPr>
-        <w:t>)</w:t>
-      </w:r>
-      <w:r>
-        <w:rPr>
-          <w:lang w:val="ar_AE" w:bidi="ar_AE"/>
-        </w:rPr>
-      </w:r>
-      <w:r>
-        <w:rPr>
-          <w:lang w:val="ar_AE" w:bidi="ar_AE"/>
-        </w:rPr>
-      </w:r>
-    </w:p>
-    <w:p>
-      <w:pPr>
-        <w:bidi/>
-      </w:pPr>
-      <w:r>
-        <w:rPr>
-          <w:lang w:val="ar_AE" w:bidi="ar_AE"/>
-        </w:rPr>
-      </w:r>
-    </w:p>
-    <w:p>
-      <w:pPr>
-        <w:pStyle w:val="Heading2"/>
-        <w:bidi/>
-      </w:pPr>
-      <w:r>
-        <w:rPr>
-          <w:lang w:val="ar_AE" w:bidi="ar_AE"/>
-        </w:rPr>
-        <w:t>مقدمة سفر راعوث - أصحاح 4</w:t>
-      </w:r>
-      <w:r>
-        <w:rPr>
-          <w:lang w:val="ar_AE" w:bidi="ar_AE"/>
-        </w:rPr>
-      </w:r>
-    </w:p>
-    <w:p>
-      <w:pPr>
-        <w:bidi/>
-      </w:pPr>
-      <w:r>
-        <w:rPr>
-          <w:lang w:val="ar_AE" w:bidi="ar_AE"/>
-        </w:rPr>
-      </w:r>
-      <w:r>
-        <w:rPr>
-          <w:lang w:val="ar_AE" w:bidi="ar_AE"/>
-        </w:rPr>
-        <w:t>"# ملاحظات عامة على راعوث 4</w:t>
-      </w:r>
-    </w:p>
-    <w:p>
-      <w:pPr>
-        <w:pStyle w:val="Heading3"/>
-        <w:bidi/>
-      </w:pPr>
-      <w:r>
-        <w:rPr>
-          <w:lang w:val="ar_AE" w:bidi="ar_AE"/>
-        </w:rPr>
-        <w:t>المفاهيم الخاصة في هذا الاصحاح</w:t>
-      </w:r>
-    </w:p>
-    <w:p>
-      <w:pPr>
-        <w:pStyle w:val="Heading4"/>
-        <w:bidi/>
-      </w:pPr>
-      <w:r>
-        <w:rPr>
-          <w:lang w:val="ar_AE" w:bidi="ar_AE"/>
-        </w:rPr>
-        <w:t>الملك داوود</w:t>
-      </w:r>
-    </w:p>
-    <w:p>
-      <w:pPr>
-        <w:bidi/>
-      </w:pPr>
-      <w:r>
-        <w:rPr>
-          <w:lang w:val="ar_AE" w:bidi="ar_AE"/>
-        </w:rPr>
-      </w:r>
-      <w:r>
-        <w:rPr>
-          <w:lang w:val="ar_AE" w:bidi="ar_AE"/>
-        </w:rPr>
-        <w:t>على الرغم من كون راعوث موآبية، إلا أنها أصبحت جدة لداود، الذي هو أعظم ملوك إسرائيل. قد يكون الأمر مُستغربًا أن تصبح امرأة غير يهودية جزءًا من سلالة مهمة كهذه، لكن هذا يذكرنا بأن الله يحب جميع الناس. لقد كان لدى راعوث إيمان عظيم بالرب، وهذا يظهر لنا أن الله يرحب بكل من يؤمن به.</w:t>
-      </w:r>
-    </w:p>
-    <w:p>
-      <w:pPr>
-        <w:pStyle w:val="Heading4"/>
-        <w:bidi/>
-      </w:pPr>
-      <w:r>
-        <w:rPr>
-          <w:lang w:val="ar_AE" w:bidi="ar_AE"/>
-        </w:rPr>
-        <w:t>"</w:t>
-      </w:r>
-      <w:r>
-        <w:rPr>
-          <w:lang w:val="ar_AE" w:bidi="ar_AE"/>
-        </w:rPr>
-        <w:t>تَشْتَرِي أَيْضًا مِنْ يَدِ رَاعُوثَ ٱلْمُوآبِيَّةِ</w:t>
-      </w:r>
-      <w:r>
-        <w:rPr>
-          <w:lang w:val="ar_AE" w:bidi="ar_AE"/>
-        </w:rPr>
-        <w:t>"</w:t>
-      </w:r>
-    </w:p>
-    <w:p>
-      <w:pPr>
-        <w:bidi/>
-      </w:pPr>
-      <w:r>
-        <w:rPr>
-          <w:lang w:val="ar_AE" w:bidi="ar_AE"/>
-        </w:rPr>
-      </w:r>
-      <w:r>
-        <w:rPr>
-          <w:lang w:val="ar_AE" w:bidi="ar_AE"/>
-        </w:rPr>
-        <w:t>جاءت مسؤولية رعاية أرامل العائلة مع امتياز استخدام أرض العائلة . لذلك، كان على القريب الذي يريد استخدام أرض نعمي أن يساعد أيضًا راعوث في إنجاب ابن يحمل اسم العائلة وميراثها وأن يعولها.</w:t>
-      </w:r>
-    </w:p>
-    <w:p>
-      <w:pPr>
-        <w:pStyle w:val="Heading3"/>
-        <w:bidi/>
-      </w:pPr>
-      <w:r>
-        <w:rPr>
-          <w:lang w:val="ar_AE" w:bidi="ar_AE"/>
-        </w:rPr>
-        <w:t>صعوبات الترجمة الأخرى المحتملة في هذا الأصحاح</w:t>
-      </w:r>
-    </w:p>
-    <w:p>
-      <w:pPr>
-        <w:pStyle w:val="Heading4"/>
-        <w:bidi/>
-      </w:pPr>
-      <w:r>
-        <w:rPr>
-          <w:lang w:val="ar_AE" w:bidi="ar_AE"/>
-        </w:rPr>
-        <w:t>"</w:t>
-      </w:r>
-      <w:r>
-        <w:rPr>
-          <w:lang w:val="ar_AE" w:bidi="ar_AE"/>
-        </w:rPr>
-        <w:t>سَابِقًا فِي إِسْرَائِيلَ</w:t>
-      </w:r>
-      <w:r>
-        <w:rPr>
-          <w:lang w:val="ar_AE" w:bidi="ar_AE"/>
-        </w:rPr>
-        <w:t>"</w:t>
-      </w:r>
-    </w:p>
-    <w:p>
-      <w:pPr>
-        <w:bidi/>
-      </w:pPr>
-      <w:r>
-        <w:rPr>
-          <w:lang w:val="ar_AE" w:bidi="ar_AE"/>
-        </w:rPr>
-      </w:r>
-      <w:r>
-        <w:rPr>
-          <w:lang w:val="ar_AE" w:bidi="ar_AE"/>
-        </w:rPr>
-        <w:t>الآية السابعة من الإصحاح الرابع هي تعليق أضافه كاتب النص. وهذا يشير إلى وجود فترة طويلة بين زمن وقوع الأحداث وزمن كتابتها، بحيث كانت العادات قد تغيرت. فكِّر كيف تشير إلى أن هذه العبارة هي تعليق على القصة وليست جزءًا منها.</w:t>
       </w:r>
       <w:r>
         <w:rPr>

</xml_diff>

<commit_message>
Update arb docx content for 2026-08-04 release
</commit_message>
<xml_diff>
--- a/arb/docx/08.content.docx
+++ b/arb/docx/08.content.docx
@@ -1614,6 +1614,22 @@
       </w:r>
       <w:r>
         <w:rPr>
+          <w:lang w:val="ar_AE" w:bidi="ar_AE"/>
+        </w:rPr>
+        <w:t>וַ⁠תִּשָּׁאֵ֥ר הִ֖יא וּ⁠שְׁנֵ֥י בָנֶֽי⁠הָ</w:t>
+      </w:r>
+    </w:p>
+    <w:p>
+      <w:pPr>
+        <w:bidi/>
+      </w:pPr>
+      <w:r>
+        <w:rPr>
+          <w:lang w:val="ar_AE" w:bidi="ar_AE"/>
+        </w:rPr>
+      </w:r>
+      <w:r>
+        <w:rPr>
           <w:b/>
           <w:lang w:val="ar_AE" w:bidi="ar_AE"/>
         </w:rPr>
@@ -1706,6 +1722,22 @@
       </w:r>
       <w:r>
         <w:rPr>
+          <w:lang w:val="ar_AE" w:bidi="ar_AE"/>
+        </w:rPr>
+        <w:t>וַ⁠יִּשְׂא֣וּ לָ⁠הֶ֗ם נָשִׁים֙</w:t>
+      </w:r>
+    </w:p>
+    <w:p>
+      <w:pPr>
+        <w:bidi/>
+      </w:pPr>
+      <w:r>
+        <w:rPr>
+          <w:lang w:val="ar_AE" w:bidi="ar_AE"/>
+        </w:rPr>
+      </w:r>
+      <w:r>
+        <w:rPr>
           <w:b/>
           <w:lang w:val="ar_AE" w:bidi="ar_AE"/>
         </w:rPr>
@@ -1825,6 +1857,22 @@
       </w:r>
       <w:r>
         <w:rPr>
+          <w:lang w:val="ar_AE" w:bidi="ar_AE"/>
+        </w:rPr>
+        <w:t>שֵׁ֤ם הָֽ⁠אַחַת֙ עָרְפָּ֔ה וְ⁠שֵׁ֥ם הַ⁠שֵּׁנִ֖ית ר֑וּת</w:t>
+      </w:r>
+    </w:p>
+    <w:p>
+      <w:pPr>
+        <w:bidi/>
+      </w:pPr>
+      <w:r>
+        <w:rPr>
+          <w:lang w:val="ar_AE" w:bidi="ar_AE"/>
+        </w:rPr>
+      </w:r>
+      <w:r>
+        <w:rPr>
           <w:b/>
           <w:lang w:val="ar_AE" w:bidi="ar_AE"/>
         </w:rPr>
@@ -1909,6 +1957,22 @@
       </w:r>
       <w:r>
         <w:rPr>
+          <w:lang w:val="ar_AE" w:bidi="ar_AE"/>
+        </w:rPr>
+        <w:t>וַ⁠תִּשָּׁאֵר֙ הָֽ⁠אִשָּׁ֔ה מִ⁠שְּׁנֵ֥י יְלָדֶ֖י⁠הָ וּ⁠מֵ⁠אִישָֽׁ⁠הּ</w:t>
+      </w:r>
+    </w:p>
+    <w:p>
+      <w:pPr>
+        <w:bidi/>
+      </w:pPr>
+      <w:r>
+        <w:rPr>
+          <w:lang w:val="ar_AE" w:bidi="ar_AE"/>
+        </w:rPr>
+      </w:r>
+      <w:r>
+        <w:rPr>
           <w:b/>
           <w:lang w:val="ar_AE" w:bidi="ar_AE"/>
         </w:rPr>
@@ -2015,6 +2079,22 @@
       </w:r>
       <w:r>
         <w:rPr>
+          <w:lang w:val="ar_AE" w:bidi="ar_AE"/>
+        </w:rPr>
+        <w:t>וַ⁠תָּ֤קָם הִיא֙ וְ⁠כַלֹּתֶ֔י⁠הָ וַ⁠תָּ֖שָׁב</w:t>
+      </w:r>
+    </w:p>
+    <w:p>
+      <w:pPr>
+        <w:bidi/>
+      </w:pPr>
+      <w:r>
+        <w:rPr>
+          <w:lang w:val="ar_AE" w:bidi="ar_AE"/>
+        </w:rPr>
+      </w:r>
+      <w:r>
+        <w:rPr>
           <w:b/>
           <w:lang w:val="ar_AE" w:bidi="ar_AE"/>
         </w:rPr>
@@ -2269,6 +2349,22 @@
       </w:r>
       <w:r>
         <w:rPr>
+          <w:lang w:val="ar_AE" w:bidi="ar_AE"/>
+        </w:rPr>
+        <w:t>וְ⁠כַלֹּתֶ֔י⁠הָ</w:t>
+      </w:r>
+    </w:p>
+    <w:p>
+      <w:pPr>
+        <w:bidi/>
+      </w:pPr>
+      <w:r>
+        <w:rPr>
+          <w:lang w:val="ar_AE" w:bidi="ar_AE"/>
+        </w:rPr>
+      </w:r>
+      <w:r>
+        <w:rPr>
           <w:b/>
           <w:lang w:val="ar_AE" w:bidi="ar_AE"/>
         </w:rPr>
@@ -2353,6 +2449,22 @@
       </w:r>
       <w:r>
         <w:rPr>
+          <w:lang w:val="ar_AE" w:bidi="ar_AE"/>
+        </w:rPr>
+        <w:t>כִּ֤י שָֽׁמְעָה֙ בִּ⁠שְׂדֵ֣ה מוֹאָ֔ב כִּֽי־פָקַ֤ד יְהוָה֙ אֶת־עַמּ֔⁠וֹ לָ⁠תֵ֥ת לָ⁠הֶ֖ם לָֽחֶם</w:t>
+      </w:r>
+    </w:p>
+    <w:p>
+      <w:pPr>
+        <w:bidi/>
+      </w:pPr>
+      <w:r>
+        <w:rPr>
+          <w:lang w:val="ar_AE" w:bidi="ar_AE"/>
+        </w:rPr>
+      </w:r>
+      <w:r>
+        <w:rPr>
           <w:b/>
           <w:lang w:val="ar_AE" w:bidi="ar_AE"/>
         </w:rPr>
@@ -2459,6 +2571,22 @@
       </w:r>
       <w:r>
         <w:rPr>
+          <w:lang w:val="ar_AE" w:bidi="ar_AE"/>
+        </w:rPr>
+        <w:t>שָֽׁמְעָה֙ בִּ⁠שְׂדֵ֣ה מוֹאָ֔ב</w:t>
+      </w:r>
+    </w:p>
+    <w:p>
+      <w:pPr>
+        <w:bidi/>
+      </w:pPr>
+      <w:r>
+        <w:rPr>
+          <w:lang w:val="ar_AE" w:bidi="ar_AE"/>
+        </w:rPr>
+      </w:r>
+      <w:r>
+        <w:rPr>
           <w:b/>
           <w:lang w:val="ar_AE" w:bidi="ar_AE"/>
         </w:rPr>
@@ -2848,6 +2976,22 @@
       </w:r>
       <w:r>
         <w:rPr>
+          <w:lang w:val="ar_AE" w:bidi="ar_AE"/>
+        </w:rPr>
+        <w:t>וַ⁠תֵּלַ֣כְנָה בַ⁠דֶּ֔רֶךְ</w:t>
+      </w:r>
+    </w:p>
+    <w:p>
+      <w:pPr>
+        <w:bidi/>
+      </w:pPr>
+      <w:r>
+        <w:rPr>
+          <w:lang w:val="ar_AE" w:bidi="ar_AE"/>
+        </w:rPr>
+      </w:r>
+      <w:r>
+        <w:rPr>
           <w:b/>
           <w:lang w:val="ar_AE" w:bidi="ar_AE"/>
         </w:rPr>
@@ -2932,6 +3076,22 @@
       </w:r>
       <w:r>
         <w:rPr>
+          <w:lang w:val="ar_AE" w:bidi="ar_AE"/>
+        </w:rPr>
+        <w:t>לִ⁠שְׁתֵּ֣י כַלֹּתֶ֔י⁠הָ</w:t>
+      </w:r>
+    </w:p>
+    <w:p>
+      <w:pPr>
+        <w:bidi/>
+      </w:pPr>
+      <w:r>
+        <w:rPr>
+          <w:lang w:val="ar_AE" w:bidi="ar_AE"/>
+        </w:rPr>
+      </w:r>
+      <w:r>
+        <w:rPr>
           <w:b/>
           <w:lang w:val="ar_AE" w:bidi="ar_AE"/>
         </w:rPr>
@@ -3016,6 +3176,22 @@
       </w:r>
       <w:r>
         <w:rPr>
+          <w:lang w:val="ar_AE" w:bidi="ar_AE"/>
+        </w:rPr>
+        <w:t>לֵ֣כְנָה שֹּׁ֔בְנָה אִשָּׁ֖ה</w:t>
+      </w:r>
+    </w:p>
+    <w:p>
+      <w:pPr>
+        <w:bidi/>
+      </w:pPr>
+      <w:r>
+        <w:rPr>
+          <w:lang w:val="ar_AE" w:bidi="ar_AE"/>
+        </w:rPr>
+      </w:r>
+      <w:r>
+        <w:rPr>
           <w:b/>
           <w:lang w:val="ar_AE" w:bidi="ar_AE"/>
         </w:rPr>
@@ -3122,6 +3298,22 @@
       </w:r>
       <w:r>
         <w:rPr>
+          <w:lang w:val="ar_AE" w:bidi="ar_AE"/>
+        </w:rPr>
+        <w:t>לֵ֣כְנָה שֹּׁ֔בְנָה אִשָּׁ֖ה לְ⁠בֵ֣ית אִמָּ֑⁠הּ</w:t>
+      </w:r>
+    </w:p>
+    <w:p>
+      <w:pPr>
+        <w:bidi/>
+      </w:pPr>
+      <w:r>
+        <w:rPr>
+          <w:lang w:val="ar_AE" w:bidi="ar_AE"/>
+        </w:rPr>
+      </w:r>
+      <w:r>
+        <w:rPr>
           <w:b/>
           <w:lang w:val="ar_AE" w:bidi="ar_AE"/>
         </w:rPr>
@@ -3206,6 +3398,22 @@
       </w:r>
       <w:r>
         <w:rPr>
+          <w:lang w:val="ar_AE" w:bidi="ar_AE"/>
+        </w:rPr>
+        <w:t>לְ⁠בֵ֣ית אִמָּ֑⁠הּ</w:t>
+      </w:r>
+    </w:p>
+    <w:p>
+      <w:pPr>
+        <w:bidi/>
+      </w:pPr>
+      <w:r>
+        <w:rPr>
+          <w:lang w:val="ar_AE" w:bidi="ar_AE"/>
+        </w:rPr>
+      </w:r>
+      <w:r>
+        <w:rPr>
           <w:b/>
           <w:lang w:val="ar_AE" w:bidi="ar_AE"/>
         </w:rPr>
@@ -3290,6 +3498,22 @@
       </w:r>
       <w:r>
         <w:rPr>
+          <w:lang w:val="ar_AE" w:bidi="ar_AE"/>
+        </w:rPr>
+        <w:t>יעשה יְהוָ֤ה עִמָּ⁠כֶם֙ חֶ֔סֶד כַּ⁠אֲשֶׁ֧ר עֲשִׂיתֶ֛ם עִם־הַ⁠מֵּתִ֖ים וְ⁠עִמָּדִֽ⁠י</w:t>
+      </w:r>
+    </w:p>
+    <w:p>
+      <w:pPr>
+        <w:bidi/>
+      </w:pPr>
+      <w:r>
+        <w:rPr>
+          <w:lang w:val="ar_AE" w:bidi="ar_AE"/>
+        </w:rPr>
+      </w:r>
+      <w:r>
+        <w:rPr>
           <w:b/>
           <w:lang w:val="ar_AE" w:bidi="ar_AE"/>
         </w:rPr>
@@ -3666,6 +3890,22 @@
       </w:r>
       <w:r>
         <w:rPr>
+          <w:lang w:val="ar_AE" w:bidi="ar_AE"/>
+        </w:rPr>
+        <w:t>יִתֵּ֤ן יְהוָה֙ לָ⁠כֶ֔ם וּ⁠מְצֶ֣אןָ</w:t>
+      </w:r>
+    </w:p>
+    <w:p>
+      <w:pPr>
+        <w:bidi/>
+      </w:pPr>
+      <w:r>
+        <w:rPr>
+          <w:lang w:val="ar_AE" w:bidi="ar_AE"/>
+        </w:rPr>
+      </w:r>
+      <w:r>
+        <w:rPr>
           <w:b/>
           <w:lang w:val="ar_AE" w:bidi="ar_AE"/>
         </w:rPr>
@@ -4042,6 +4282,22 @@
       </w:r>
       <w:r>
         <w:rPr>
+          <w:lang w:val="ar_AE" w:bidi="ar_AE"/>
+        </w:rPr>
+        <w:t>וַ⁠תִּשֶּׂ֥אנָה קוֹלָ֖⁠ן וַ⁠תִּבְכֶּֽינָה</w:t>
+      </w:r>
+    </w:p>
+    <w:p>
+      <w:pPr>
+        <w:bidi/>
+      </w:pPr>
+      <w:r>
+        <w:rPr>
+          <w:lang w:val="ar_AE" w:bidi="ar_AE"/>
+        </w:rPr>
+      </w:r>
+      <w:r>
+        <w:rPr>
           <w:b/>
           <w:lang w:val="ar_AE" w:bidi="ar_AE"/>
         </w:rPr>
@@ -4565,6 +4821,22 @@
       </w:r>
       <w:r>
         <w:rPr>
+          <w:lang w:val="ar_AE" w:bidi="ar_AE"/>
+        </w:rPr>
+        <w:t>אִתָּ֥⁠ךְ</w:t>
+      </w:r>
+    </w:p>
+    <w:p>
+      <w:pPr>
+        <w:bidi/>
+      </w:pPr>
+      <w:r>
+        <w:rPr>
+          <w:lang w:val="ar_AE" w:bidi="ar_AE"/>
+        </w:rPr>
+      </w:r>
+      <w:r>
+        <w:rPr>
           <w:b/>
           <w:lang w:val="ar_AE" w:bidi="ar_AE"/>
         </w:rPr>
@@ -5080,6 +5352,22 @@
       </w:r>
       <w:r>
         <w:rPr>
+          <w:lang w:val="ar_AE" w:bidi="ar_AE"/>
+        </w:rPr>
+        <w:t>הַֽ⁠עֽוֹד־לִ֤⁠י בָנִים֙ בְּֽ⁠מֵעַ֔⁠י וְ⁠הָי֥וּ לָ⁠כֶ֖ם לַ⁠אֲנָשִֽׁים</w:t>
+      </w:r>
+    </w:p>
+    <w:p>
+      <w:pPr>
+        <w:bidi/>
+      </w:pPr>
+      <w:r>
+        <w:rPr>
+          <w:lang w:val="ar_AE" w:bidi="ar_AE"/>
+        </w:rPr>
+      </w:r>
+      <w:r>
+        <w:rPr>
           <w:b/>
           <w:lang w:val="ar_AE" w:bidi="ar_AE"/>
         </w:rPr>
@@ -5308,6 +5596,22 @@
       </w:r>
       <w:r>
         <w:rPr>
+          <w:lang w:val="ar_AE" w:bidi="ar_AE"/>
+        </w:rPr>
+        <w:t>כִּ֤י אָמַ֨רְתִּי֙ יֶשׁ־לִ֣⁠י תִקְוָ֔ה גַּ֣ם הָיִ֤יתִי הַ⁠לַּ֨יְלָה֙ לְ⁠אִ֔ישׁ וְ⁠גַ֖ם יָלַ֥דְתִּי בָנִֽים</w:t>
+      </w:r>
+    </w:p>
+    <w:p>
+      <w:pPr>
+        <w:bidi/>
+      </w:pPr>
+      <w:r>
+        <w:rPr>
+          <w:lang w:val="ar_AE" w:bidi="ar_AE"/>
+        </w:rPr>
+      </w:r>
+      <w:r>
+        <w:rPr>
           <w:b/>
           <w:lang w:val="ar_AE" w:bidi="ar_AE"/>
         </w:rPr>
@@ -5414,6 +5718,22 @@
       </w:r>
       <w:r>
         <w:rPr>
+          <w:lang w:val="ar_AE" w:bidi="ar_AE"/>
+        </w:rPr>
+        <w:t>יָלַ֥דְתִּי בָנִֽים</w:t>
+      </w:r>
+    </w:p>
+    <w:p>
+      <w:pPr>
+        <w:bidi/>
+      </w:pPr>
+      <w:r>
+        <w:rPr>
+          <w:lang w:val="ar_AE" w:bidi="ar_AE"/>
+        </w:rPr>
+      </w:r>
+      <w:r>
+        <w:rPr>
           <w:b/>
           <w:lang w:val="ar_AE" w:bidi="ar_AE"/>
         </w:rPr>
@@ -5498,6 +5818,22 @@
       </w:r>
       <w:r>
         <w:rPr>
+          <w:lang w:val="ar_AE" w:bidi="ar_AE"/>
+        </w:rPr>
+        <w:t>הֲ⁠לָהֵ֣ן ׀ תְּשַׂבֵּ֗רְנָה עַ֚ד אֲשֶׁ֣ר יִגְדָּ֔לוּ הֲ⁠לָהֵן֙ תֵּֽעָגֵ֔נָה לְ⁠בִלְתִּ֖י הֱי֣וֹת לְ⁠אִ֑ישׁ</w:t>
+      </w:r>
+    </w:p>
+    <w:p>
+      <w:pPr>
+        <w:bidi/>
+      </w:pPr>
+      <w:r>
+        <w:rPr>
+          <w:lang w:val="ar_AE" w:bidi="ar_AE"/>
+        </w:rPr>
+      </w:r>
+      <w:r>
+        <w:rPr>
           <w:b/>
           <w:lang w:val="ar_AE" w:bidi="ar_AE"/>
         </w:rPr>
@@ -5604,6 +5940,22 @@
       </w:r>
       <w:r>
         <w:rPr>
+          <w:lang w:val="ar_AE" w:bidi="ar_AE"/>
+        </w:rPr>
+        <w:t>הֲ⁠לָהֵ֣ן ׀ תְּשַׂבֵּ֗רְנָה עַ֚ד אֲשֶׁ֣ר יִגְדָּ֔לוּ הֲ⁠לָהֵן֙ תֵּֽעָגֵ֔נָה לְ⁠בִלְתִּ֖י הֱי֣וֹת לְ⁠אִ֑ישׁ</w:t>
+      </w:r>
+    </w:p>
+    <w:p>
+      <w:pPr>
+        <w:bidi/>
+      </w:pPr>
+      <w:r>
+        <w:rPr>
+          <w:lang w:val="ar_AE" w:bidi="ar_AE"/>
+        </w:rPr>
+      </w:r>
+      <w:r>
+        <w:rPr>
           <w:b/>
           <w:lang w:val="ar_AE" w:bidi="ar_AE"/>
         </w:rPr>
@@ -5688,6 +6040,22 @@
       </w:r>
       <w:r>
         <w:rPr>
+          <w:lang w:val="ar_AE" w:bidi="ar_AE"/>
+        </w:rPr>
+        <w:t>מַר־לִ֤⁠י מְאֹד֙</w:t>
+      </w:r>
+    </w:p>
+    <w:p>
+      <w:pPr>
+        <w:bidi/>
+      </w:pPr>
+      <w:r>
+        <w:rPr>
+          <w:lang w:val="ar_AE" w:bidi="ar_AE"/>
+        </w:rPr>
+      </w:r>
+      <w:r>
+        <w:rPr>
           <w:b/>
           <w:lang w:val="ar_AE" w:bidi="ar_AE"/>
         </w:rPr>
@@ -5929,6 +6297,22 @@
       </w:r>
       <w:r>
         <w:rPr>
+          <w:lang w:val="ar_AE" w:bidi="ar_AE"/>
+        </w:rPr>
+        <w:t>יָצְאָ֥ה בִ֖⁠י יַד־יְהוָֽה</w:t>
+      </w:r>
+    </w:p>
+    <w:p>
+      <w:pPr>
+        <w:bidi/>
+      </w:pPr>
+      <w:r>
+        <w:rPr>
+          <w:lang w:val="ar_AE" w:bidi="ar_AE"/>
+        </w:rPr>
+      </w:r>
+      <w:r>
+        <w:rPr>
           <w:b/>
           <w:lang w:val="ar_AE" w:bidi="ar_AE"/>
         </w:rPr>
@@ -7224,6 +7608,22 @@
       </w:r>
       <w:r>
         <w:rPr>
+          <w:lang w:val="ar_AE" w:bidi="ar_AE"/>
+        </w:rPr>
+        <w:t>עַמֵּ֣⁠ךְ עַמִּ֔⁠י וֵ⁠אלֹהַ֖יִ⁠ךְ אֱלֹהָֽ⁠י</w:t>
+      </w:r>
+    </w:p>
+    <w:p>
+      <w:pPr>
+        <w:bidi/>
+      </w:pPr>
+      <w:r>
+        <w:rPr>
+          <w:lang w:val="ar_AE" w:bidi="ar_AE"/>
+        </w:rPr>
+      </w:r>
+      <w:r>
+        <w:rPr>
           <w:b/>
           <w:lang w:val="ar_AE" w:bidi="ar_AE"/>
         </w:rPr>
@@ -7696,6 +8096,22 @@
       </w:r>
       <w:r>
         <w:rPr>
+          <w:lang w:val="ar_AE" w:bidi="ar_AE"/>
+        </w:rPr>
+        <w:t>וַ⁠תֶּחְדַּ֖ל לְ⁠דַבֵּ֥ר אֵלֶֽי⁠הָ</w:t>
+      </w:r>
+    </w:p>
+    <w:p>
+      <w:pPr>
+        <w:bidi/>
+      </w:pPr>
+      <w:r>
+        <w:rPr>
+          <w:lang w:val="ar_AE" w:bidi="ar_AE"/>
+        </w:rPr>
+      </w:r>
+      <w:r>
+        <w:rPr>
           <w:b/>
           <w:lang w:val="ar_AE" w:bidi="ar_AE"/>
         </w:rPr>
@@ -8856,6 +9272,22 @@
       </w:r>
       <w:r>
         <w:rPr>
+          <w:lang w:val="ar_AE" w:bidi="ar_AE"/>
+        </w:rPr>
+        <w:t>אֲנִי֙ מְלֵאָ֣ה הָלַ֔כְתִּי וְ⁠רֵיקָ֖ם הֱשִׁיבַ֣⁠נִי יְהוָ֑ה</w:t>
+      </w:r>
+    </w:p>
+    <w:p>
+      <w:pPr>
+        <w:bidi/>
+      </w:pPr>
+      <w:r>
+        <w:rPr>
+          <w:lang w:val="ar_AE" w:bidi="ar_AE"/>
+        </w:rPr>
+      </w:r>
+      <w:r>
+        <w:rPr>
           <w:b/>
           <w:lang w:val="ar_AE" w:bidi="ar_AE"/>
         </w:rPr>
@@ -9110,6 +9542,22 @@
       </w:r>
       <w:r>
         <w:rPr>
+          <w:lang w:val="ar_AE" w:bidi="ar_AE"/>
+        </w:rPr>
+        <w:t>וַֽ⁠יהוָה֙ עָ֣נָה בִ֔⁠י וְ⁠שַׁדַּ֖י הֵ֥רַֽע לִֽ⁠י</w:t>
+      </w:r>
+    </w:p>
+    <w:p>
+      <w:pPr>
+        <w:bidi/>
+      </w:pPr>
+      <w:r>
+        <w:rPr>
+          <w:lang w:val="ar_AE" w:bidi="ar_AE"/>
+        </w:rPr>
+      </w:r>
+      <w:r>
+        <w:rPr>
           <w:b/>
           <w:lang w:val="ar_AE" w:bidi="ar_AE"/>
         </w:rPr>
@@ -9377,6 +9825,22 @@
       </w:r>
       <w:r>
         <w:rPr>
+          <w:lang w:val="ar_AE" w:bidi="ar_AE"/>
+        </w:rPr>
+        <w:t>הֵ֥רַֽע לִֽ⁠י</w:t>
+      </w:r>
+    </w:p>
+    <w:p>
+      <w:pPr>
+        <w:bidi/>
+      </w:pPr>
+      <w:r>
+        <w:rPr>
+          <w:lang w:val="ar_AE" w:bidi="ar_AE"/>
+        </w:rPr>
+      </w:r>
+      <w:r>
+        <w:rPr>
           <w:b/>
           <w:lang w:val="ar_AE" w:bidi="ar_AE"/>
         </w:rPr>
@@ -9461,6 +9925,22 @@
       </w:r>
       <w:r>
         <w:rPr>
+          <w:lang w:val="ar_AE" w:bidi="ar_AE"/>
+        </w:rPr>
+        <w:t>וַ⁠תָּ֣שָׁב נָעֳמִ֗י וְ⁠ר֨וּת הַ⁠מּוֹאֲבִיָּ֤ה כַלָּתָ⁠הּ֙ עִמָּ֔⁠הּ הַ⁠שָּׁ֖בָה מִ⁠שְּׂדֵ֣י מוֹאָ֑ב</w:t>
+      </w:r>
+    </w:p>
+    <w:p>
+      <w:pPr>
+        <w:bidi/>
+      </w:pPr>
+      <w:r>
+        <w:rPr>
+          <w:lang w:val="ar_AE" w:bidi="ar_AE"/>
+        </w:rPr>
+      </w:r>
+      <w:r>
+        <w:rPr>
           <w:b/>
           <w:lang w:val="ar_AE" w:bidi="ar_AE"/>
         </w:rPr>
@@ -9567,6 +10047,22 @@
       </w:r>
       <w:r>
         <w:rPr>
+          <w:lang w:val="ar_AE" w:bidi="ar_AE"/>
+        </w:rPr>
+        <w:t>וְ⁠הֵ֗מָּה בָּ֚אוּ בֵּ֣ית לֶ֔חֶם בִּ⁠תְחִלַּ֖ת קְצִ֥יר שְׂעֹרִֽים</w:t>
+      </w:r>
+    </w:p>
+    <w:p>
+      <w:pPr>
+        <w:bidi/>
+      </w:pPr>
+      <w:r>
+        <w:rPr>
+          <w:lang w:val="ar_AE" w:bidi="ar_AE"/>
+        </w:rPr>
+      </w:r>
+      <w:r>
+        <w:rPr>
           <w:b/>
           <w:lang w:val="ar_AE" w:bidi="ar_AE"/>
         </w:rPr>
@@ -9673,6 +10169,22 @@
       </w:r>
       <w:r>
         <w:rPr>
+          <w:lang w:val="ar_AE" w:bidi="ar_AE"/>
+        </w:rPr>
+        <w:t>בִּ⁠תְחִלַּ֖ת קְצִ֥יר שְׂעֹרִֽים</w:t>
+      </w:r>
+    </w:p>
+    <w:p>
+      <w:pPr>
+        <w:bidi/>
+      </w:pPr>
+      <w:r>
+        <w:rPr>
+          <w:lang w:val="ar_AE" w:bidi="ar_AE"/>
+        </w:rPr>
+      </w:r>
+      <w:r>
+        <w:rPr>
           <w:b/>
           <w:lang w:val="ar_AE" w:bidi="ar_AE"/>
         </w:rPr>
@@ -10001,6 +10513,22 @@
       </w:r>
       <w:r>
         <w:rPr>
+          <w:lang w:val="ar_AE" w:bidi="ar_AE"/>
+        </w:rPr>
+        <w:t>וּֽ⁠לְ⁠נָעֳמִ֞י מוֹדַ֣ע לְ⁠אִישָׁ֗⁠הּ</w:t>
+      </w:r>
+    </w:p>
+    <w:p>
+      <w:pPr>
+        <w:bidi/>
+      </w:pPr>
+      <w:r>
+        <w:rPr>
+          <w:lang w:val="ar_AE" w:bidi="ar_AE"/>
+        </w:rPr>
+      </w:r>
+      <w:r>
+        <w:rPr>
           <w:b/>
           <w:lang w:val="ar_AE" w:bidi="ar_AE"/>
         </w:rPr>
@@ -10107,6 +10635,22 @@
       </w:r>
       <w:r>
         <w:rPr>
+          <w:lang w:val="ar_AE" w:bidi="ar_AE"/>
+        </w:rPr>
+        <w:t>וּֽ⁠לְ⁠נָעֳמִ֞י מוֹדַ֣ע לְ⁠אִישָׁ֗⁠הּ</w:t>
+      </w:r>
+    </w:p>
+    <w:p>
+      <w:pPr>
+        <w:bidi/>
+      </w:pPr>
+      <w:r>
+        <w:rPr>
+          <w:lang w:val="ar_AE" w:bidi="ar_AE"/>
+        </w:rPr>
+      </w:r>
+      <w:r>
+        <w:rPr>
           <w:b/>
           <w:lang w:val="ar_AE" w:bidi="ar_AE"/>
         </w:rPr>
@@ -10618,6 +11162,22 @@
       </w:r>
       <w:r>
         <w:rPr>
+          <w:lang w:val="ar_AE" w:bidi="ar_AE"/>
+        </w:rPr>
+        <w:t>הַ⁠מּוֹאֲבִיָּ֜ה</w:t>
+      </w:r>
+    </w:p>
+    <w:p>
+      <w:pPr>
+        <w:bidi/>
+      </w:pPr>
+      <w:r>
+        <w:rPr>
+          <w:lang w:val="ar_AE" w:bidi="ar_AE"/>
+        </w:rPr>
+      </w:r>
+      <w:r>
+        <w:rPr>
           <w:b/>
           <w:lang w:val="ar_AE" w:bidi="ar_AE"/>
         </w:rPr>
@@ -11851,6 +12411,22 @@
       </w:r>
       <w:r>
         <w:rPr>
+          <w:lang w:val="ar_AE" w:bidi="ar_AE"/>
+        </w:rPr>
+        <w:t>לְ⁠מִ֖י הַ⁠נַּעֲרָ֥ה הַ⁠זֹּֽאת</w:t>
+      </w:r>
+    </w:p>
+    <w:p>
+      <w:pPr>
+        <w:bidi/>
+      </w:pPr>
+      <w:r>
+        <w:rPr>
+          <w:lang w:val="ar_AE" w:bidi="ar_AE"/>
+        </w:rPr>
+      </w:r>
+      <w:r>
+        <w:rPr>
           <w:b/>
           <w:lang w:val="ar_AE" w:bidi="ar_AE"/>
         </w:rPr>
@@ -12119,6 +12695,22 @@
       </w:r>
       <w:r>
         <w:rPr>
+          <w:lang w:val="ar_AE" w:bidi="ar_AE"/>
+        </w:rPr>
+        <w:t>וַ⁠תֹּ֗אמֶר אֲלַקֳטָה־נָּא֙ וְ⁠אָסַפְתִּ֣י בָֽ⁠עֳמָרִ֔ים אַחֲרֵ֖י הַ⁠קּוֹצְרִ֑ים</w:t>
+      </w:r>
+    </w:p>
+    <w:p>
+      <w:pPr>
+        <w:bidi/>
+      </w:pPr>
+      <w:r>
+        <w:rPr>
+          <w:lang w:val="ar_AE" w:bidi="ar_AE"/>
+        </w:rPr>
+      </w:r>
+      <w:r>
+        <w:rPr>
           <w:b/>
           <w:lang w:val="ar_AE" w:bidi="ar_AE"/>
         </w:rPr>
@@ -13392,6 +13984,22 @@
       </w:r>
       <w:r>
         <w:rPr>
+          <w:lang w:val="ar_AE" w:bidi="ar_AE"/>
+        </w:rPr>
+        <w:t>מֵ⁠אֲשֶׁ֥ר יִשְׁאֲב֖וּ⁠ן הַ⁠נְּעָרִֽים</w:t>
+      </w:r>
+    </w:p>
+    <w:p>
+      <w:pPr>
+        <w:bidi/>
+      </w:pPr>
+      <w:r>
+        <w:rPr>
+          <w:lang w:val="ar_AE" w:bidi="ar_AE"/>
+        </w:rPr>
+      </w:r>
+      <w:r>
+        <w:rPr>
           <w:b/>
           <w:lang w:val="ar_AE" w:bidi="ar_AE"/>
         </w:rPr>
@@ -13476,6 +14084,22 @@
       </w:r>
       <w:r>
         <w:rPr>
+          <w:lang w:val="ar_AE" w:bidi="ar_AE"/>
+        </w:rPr>
+        <w:t>וַ⁠תִּפֹּל֙ עַל־פָּנֶ֔י⁠הָ וַ⁠תִּשְׁתַּ֖חוּ אָ֑רְצָ⁠ה</w:t>
+      </w:r>
+    </w:p>
+    <w:p>
+      <w:pPr>
+        <w:bidi/>
+      </w:pPr>
+      <w:r>
+        <w:rPr>
+          <w:lang w:val="ar_AE" w:bidi="ar_AE"/>
+        </w:rPr>
+      </w:r>
+      <w:r>
+        <w:rPr>
           <w:b/>
           <w:lang w:val="ar_AE" w:bidi="ar_AE"/>
         </w:rPr>
@@ -13730,6 +14354,22 @@
       </w:r>
       <w:r>
         <w:rPr>
+          <w:lang w:val="ar_AE" w:bidi="ar_AE"/>
+        </w:rPr>
+        <w:t>וַ⁠תִּפֹּל֙ עַל־פָּנֶ֔י⁠הָ וַ⁠תִּשְׁתַּ֖חוּ אָ֑רְצָ⁠ה</w:t>
+      </w:r>
+    </w:p>
+    <w:p>
+      <w:pPr>
+        <w:bidi/>
+      </w:pPr>
+      <w:r>
+        <w:rPr>
+          <w:lang w:val="ar_AE" w:bidi="ar_AE"/>
+        </w:rPr>
+      </w:r>
+      <w:r>
+        <w:rPr>
           <w:b/>
           <w:lang w:val="ar_AE" w:bidi="ar_AE"/>
         </w:rPr>
@@ -13849,6 +14489,22 @@
       </w:r>
       <w:r>
         <w:rPr>
+          <w:lang w:val="ar_AE" w:bidi="ar_AE"/>
+        </w:rPr>
+        <w:t>מַדּוּעַ֩ מָצָ֨אתִי חֵ֤ן בְּ⁠עֵינֶ֨י⁠ךָ֙ לְ⁠הַכִּירֵ֔⁠נִי וְ⁠אָּנֹכִ֖י נָכְרִיָּֽה</w:t>
+      </w:r>
+    </w:p>
+    <w:p>
+      <w:pPr>
+        <w:bidi/>
+      </w:pPr>
+      <w:r>
+        <w:rPr>
+          <w:lang w:val="ar_AE" w:bidi="ar_AE"/>
+        </w:rPr>
+      </w:r>
+      <w:r>
+        <w:rPr>
           <w:b/>
           <w:lang w:val="ar_AE" w:bidi="ar_AE"/>
         </w:rPr>
@@ -15440,6 +16096,22 @@
       </w:r>
       <w:r>
         <w:rPr>
+          <w:lang w:val="ar_AE" w:bidi="ar_AE"/>
+        </w:rPr>
+        <w:t>עַל־לֵ֣ב שִׁפְחָתֶ֑⁠ךָ</w:t>
+      </w:r>
+    </w:p>
+    <w:p>
+      <w:pPr>
+        <w:bidi/>
+      </w:pPr>
+      <w:r>
+        <w:rPr>
+          <w:lang w:val="ar_AE" w:bidi="ar_AE"/>
+        </w:rPr>
+      </w:r>
+      <w:r>
+        <w:rPr>
           <w:b/>
           <w:lang w:val="ar_AE" w:bidi="ar_AE"/>
         </w:rPr>
@@ -15925,6 +16597,22 @@
       </w:r>
       <w:r>
         <w:rPr>
+          <w:lang w:val="ar_AE" w:bidi="ar_AE"/>
+        </w:rPr>
+        <w:t>לְ⁠עֵ֣ת הָ⁠אֹ֗כֶל</w:t>
+      </w:r>
+    </w:p>
+    <w:p>
+      <w:pPr>
+        <w:bidi/>
+      </w:pPr>
+      <w:r>
+        <w:rPr>
+          <w:lang w:val="ar_AE" w:bidi="ar_AE"/>
+        </w:rPr>
+      </w:r>
+      <w:r>
+        <w:rPr>
           <w:b/>
           <w:lang w:val="ar_AE" w:bidi="ar_AE"/>
         </w:rPr>
@@ -16009,6 +16697,22 @@
       </w:r>
       <w:r>
         <w:rPr>
+          <w:lang w:val="ar_AE" w:bidi="ar_AE"/>
+        </w:rPr>
+        <w:t>גֹּ֤שִֽׁי הֲלֹם֙ וְ⁠אָכַ֣לְתְּ מִן־הַ⁠לֶּ֔חֶם וְ⁠טָבַ֥לְתְּ פִּתֵּ֖⁠ךְ בַּ⁠חֹ֑מֶץ</w:t>
+      </w:r>
+    </w:p>
+    <w:p>
+      <w:pPr>
+        <w:bidi/>
+      </w:pPr>
+      <w:r>
+        <w:rPr>
+          <w:lang w:val="ar_AE" w:bidi="ar_AE"/>
+        </w:rPr>
+      </w:r>
+      <w:r>
+        <w:rPr>
           <w:b/>
           <w:lang w:val="ar_AE" w:bidi="ar_AE"/>
         </w:rPr>
@@ -16115,6 +16819,22 @@
       </w:r>
       <w:r>
         <w:rPr>
+          <w:lang w:val="ar_AE" w:bidi="ar_AE"/>
+        </w:rPr>
+        <w:t>וְ⁠אָכַ֣לְתְּ מִן־הַ⁠לֶּ֔חֶם וְ⁠טָבַ֥לְתְּ פִּתֵּ֖⁠ךְ בַּ⁠חֹ֑מֶץ</w:t>
+      </w:r>
+    </w:p>
+    <w:p>
+      <w:pPr>
+        <w:bidi/>
+      </w:pPr>
+      <w:r>
+        <w:rPr>
+          <w:lang w:val="ar_AE" w:bidi="ar_AE"/>
+        </w:rPr>
+      </w:r>
+      <w:r>
+        <w:rPr>
           <w:b/>
           <w:lang w:val="ar_AE" w:bidi="ar_AE"/>
         </w:rPr>
@@ -16778,6 +17498,22 @@
       </w:r>
       <w:r>
         <w:rPr>
+          <w:lang w:val="ar_AE" w:bidi="ar_AE"/>
+        </w:rPr>
+        <w:t>וְ⁠לֹ֥א תִגְעֲרוּ־בָֽ⁠הּ</w:t>
+      </w:r>
+    </w:p>
+    <w:p>
+      <w:pPr>
+        <w:bidi/>
+      </w:pPr>
+      <w:r>
+        <w:rPr>
+          <w:lang w:val="ar_AE" w:bidi="ar_AE"/>
+        </w:rPr>
+      </w:r>
+      <w:r>
+        <w:rPr>
           <w:b/>
           <w:lang w:val="ar_AE" w:bidi="ar_AE"/>
         </w:rPr>
@@ -17097,6 +17833,22 @@
       </w:r>
       <w:r>
         <w:rPr>
+          <w:lang w:val="ar_AE" w:bidi="ar_AE"/>
+        </w:rPr>
+        <w:t>וַ⁠תִּשָּׂא֙ וַ⁠תָּב֣וֹא הָ⁠עִ֔יר</w:t>
+      </w:r>
+    </w:p>
+    <w:p>
+      <w:pPr>
+        <w:bidi/>
+      </w:pPr>
+      <w:r>
+        <w:rPr>
+          <w:lang w:val="ar_AE" w:bidi="ar_AE"/>
+        </w:rPr>
+      </w:r>
+      <w:r>
+        <w:rPr>
           <w:b/>
           <w:lang w:val="ar_AE" w:bidi="ar_AE"/>
         </w:rPr>
@@ -17325,6 +18077,22 @@
       </w:r>
       <w:r>
         <w:rPr>
+          <w:lang w:val="ar_AE" w:bidi="ar_AE"/>
+        </w:rPr>
+        <w:t>יְהִ֥י מַכִּירֵ֖⁠ךְ בָּר֑וּךְ</w:t>
+      </w:r>
+    </w:p>
+    <w:p>
+      <w:pPr>
+        <w:bidi/>
+      </w:pPr>
+      <w:r>
+        <w:rPr>
+          <w:lang w:val="ar_AE" w:bidi="ar_AE"/>
+        </w:rPr>
+      </w:r>
+      <w:r>
+        <w:rPr>
           <w:b/>
           <w:lang w:val="ar_AE" w:bidi="ar_AE"/>
         </w:rPr>
@@ -17431,6 +18199,22 @@
       </w:r>
       <w:r>
         <w:rPr>
+          <w:lang w:val="ar_AE" w:bidi="ar_AE"/>
+        </w:rPr>
+        <w:t>יְהִ֥י מַכִּירֵ֖⁠ךְ בָּר֑וּךְ</w:t>
+      </w:r>
+    </w:p>
+    <w:p>
+      <w:pPr>
+        <w:bidi/>
+      </w:pPr>
+      <w:r>
+        <w:rPr>
+          <w:lang w:val="ar_AE" w:bidi="ar_AE"/>
+        </w:rPr>
+      </w:r>
+      <w:r>
+        <w:rPr>
           <w:b/>
           <w:lang w:val="ar_AE" w:bidi="ar_AE"/>
         </w:rPr>
@@ -17672,6 +18456,22 @@
       </w:r>
       <w:r>
         <w:rPr>
+          <w:lang w:val="ar_AE" w:bidi="ar_AE"/>
+        </w:rPr>
+        <w:t>וַ⁠תַּגֵּ֣ד לַ⁠חֲמוֹתָ֗⁠הּ אֵ֤ת אֲשֶׁר־עָשְׂתָה֙ עִמּ֔⁠וֹ וַ⁠תֹּ֗אמֶר שֵׁ֤ם הָ⁠אִישׁ֙ אֲשֶׁ֨ר עָשִׂ֧יתִי עִמּ֛⁠וֹ הַ⁠יּ֖וֹם בֹּֽעַז</w:t>
+      </w:r>
+    </w:p>
+    <w:p>
+      <w:pPr>
+        <w:bidi/>
+      </w:pPr>
+      <w:r>
+        <w:rPr>
+          <w:lang w:val="ar_AE" w:bidi="ar_AE"/>
+        </w:rPr>
+      </w:r>
+      <w:r>
+        <w:rPr>
           <w:b/>
           <w:lang w:val="ar_AE" w:bidi="ar_AE"/>
         </w:rPr>
@@ -18919,6 +19719,22 @@
       </w:r>
       <w:r>
         <w:rPr>
+          <w:lang w:val="ar_AE" w:bidi="ar_AE"/>
+        </w:rPr>
+        <w:t>אָמַ֣ר אֵלַ֗⁠י עִם־הַ⁠נְּעָרִ֤ים אֲשֶׁר־לִ⁠י֙ תִּדְבָּקִ֔י⁠ן עַ֣ד אִם־כִּלּ֔וּ אֵ֥ת כָּל־הַ⁠קָּצִ֖יר אֲשֶׁר־לִֽ⁠י</w:t>
+      </w:r>
+    </w:p>
+    <w:p>
+      <w:pPr>
+        <w:bidi/>
+      </w:pPr>
+      <w:r>
+        <w:rPr>
+          <w:lang w:val="ar_AE" w:bidi="ar_AE"/>
+        </w:rPr>
+      </w:r>
+      <w:r>
+        <w:rPr>
           <w:b/>
           <w:lang w:val="ar_AE" w:bidi="ar_AE"/>
         </w:rPr>
@@ -19025,6 +19841,22 @@
       </w:r>
       <w:r>
         <w:rPr>
+          <w:lang w:val="ar_AE" w:bidi="ar_AE"/>
+        </w:rPr>
+        <w:t>עִם־הַ⁠נְּעָרִ֤ים אֲשֶׁר־לִ⁠י֙ תִּדְבָּקִ֔י⁠ן</w:t>
+      </w:r>
+    </w:p>
+    <w:p>
+      <w:pPr>
+        <w:bidi/>
+      </w:pPr>
+      <w:r>
+        <w:rPr>
+          <w:lang w:val="ar_AE" w:bidi="ar_AE"/>
+        </w:rPr>
+      </w:r>
+      <w:r>
+        <w:rPr>
           <w:b/>
           <w:lang w:val="ar_AE" w:bidi="ar_AE"/>
         </w:rPr>
@@ -19131,6 +19963,22 @@
       </w:r>
       <w:r>
         <w:rPr>
+          <w:lang w:val="ar_AE" w:bidi="ar_AE"/>
+        </w:rPr>
+        <w:t>תֵֽצְאִי֙ עִם</w:t>
+      </w:r>
+    </w:p>
+    <w:p>
+      <w:pPr>
+        <w:bidi/>
+      </w:pPr>
+      <w:r>
+        <w:rPr>
+          <w:lang w:val="ar_AE" w:bidi="ar_AE"/>
+        </w:rPr>
+      </w:r>
+      <w:r>
+        <w:rPr>
           <w:b/>
           <w:lang w:val="ar_AE" w:bidi="ar_AE"/>
         </w:rPr>
@@ -19215,6 +20063,22 @@
       </w:r>
       <w:r>
         <w:rPr>
+          <w:lang w:val="ar_AE" w:bidi="ar_AE"/>
+        </w:rPr>
+        <w:t>וְ⁠לֹ֥א יִפְגְּעוּ־בָ֖⁠ךְ</w:t>
+      </w:r>
+    </w:p>
+    <w:p>
+      <w:pPr>
+        <w:bidi/>
+      </w:pPr>
+      <w:r>
+        <w:rPr>
+          <w:lang w:val="ar_AE" w:bidi="ar_AE"/>
+        </w:rPr>
+      </w:r>
+      <w:r>
+        <w:rPr>
           <w:b/>
           <w:lang w:val="ar_AE" w:bidi="ar_AE"/>
         </w:rPr>
@@ -19456,6 +20320,22 @@
       </w:r>
       <w:r>
         <w:rPr>
+          <w:lang w:val="ar_AE" w:bidi="ar_AE"/>
+        </w:rPr>
+        <w:t>עַד־כְּל֥וֹת קְצִֽיר־הַ⁠שְּׂעֹרִ֖ים וּ⁠קְצִ֣יר הַֽ⁠חִטִּ֑ים</w:t>
+      </w:r>
+    </w:p>
+    <w:p>
+      <w:pPr>
+        <w:bidi/>
+      </w:pPr>
+      <w:r>
+        <w:rPr>
+          <w:lang w:val="ar_AE" w:bidi="ar_AE"/>
+        </w:rPr>
+      </w:r>
+      <w:r>
+        <w:rPr>
           <w:b/>
           <w:lang w:val="ar_AE" w:bidi="ar_AE"/>
         </w:rPr>
@@ -20090,6 +20970,22 @@
         <w:rPr>
           <w:lang w:val="ar_AE" w:bidi="ar_AE"/>
         </w:rPr>
+      </w:r>
+    </w:p>
+    <w:p>
+      <w:pPr>
+        <w:bidi/>
+      </w:pPr>
+      <w:r>
+        <w:rPr>
+          <w:lang w:val="ar_AE" w:bidi="ar_AE"/>
+        </w:rPr>
+      </w:r>
+      <w:r>
+        <w:rPr>
+          <w:lang w:val="ar_AE" w:bidi="ar_AE"/>
+        </w:rPr>
+        <w:t>חֲמוֹתָ֑⁠הּ</w:t>
       </w:r>
     </w:p>
     <w:p>
@@ -20759,6 +21655,22 @@
       </w:r>
       <w:r>
         <w:rPr>
+          <w:lang w:val="ar_AE" w:bidi="ar_AE"/>
+        </w:rPr>
+        <w:t>הֲ⁠לֹ֥א בֹ֨עַז֙ מֹֽדַעְתָּ֔⁠נוּ אֲשֶׁ֥ר הָיִ֖ית אֶת־נַעֲרוֹתָ֑י⁠ו</w:t>
+      </w:r>
+    </w:p>
+    <w:p>
+      <w:pPr>
+        <w:bidi/>
+      </w:pPr>
+      <w:r>
+        <w:rPr>
+          <w:lang w:val="ar_AE" w:bidi="ar_AE"/>
+        </w:rPr>
+      </w:r>
+      <w:r>
+        <w:rPr>
           <w:b/>
           <w:lang w:val="ar_AE" w:bidi="ar_AE"/>
         </w:rPr>
@@ -20883,6 +21795,22 @@
       </w:r>
       <w:r>
         <w:rPr>
+          <w:lang w:val="ar_AE" w:bidi="ar_AE"/>
+        </w:rPr>
+        <w:t>אֲשֶׁ֥ר הָיִ֖ית אֶת־נַעֲרוֹתָ֑י⁠ו</w:t>
+      </w:r>
+    </w:p>
+    <w:p>
+      <w:pPr>
+        <w:bidi/>
+      </w:pPr>
+      <w:r>
+        <w:rPr>
+          <w:lang w:val="ar_AE" w:bidi="ar_AE"/>
+        </w:rPr>
+      </w:r>
+      <w:r>
+        <w:rPr>
           <w:b/>
           <w:lang w:val="ar_AE" w:bidi="ar_AE"/>
         </w:rPr>
@@ -21124,6 +22052,22 @@
       </w:r>
       <w:r>
         <w:rPr>
+          <w:lang w:val="ar_AE" w:bidi="ar_AE"/>
+        </w:rPr>
+        <w:t>וָ⁠סַ֗כְתְּ</w:t>
+      </w:r>
+    </w:p>
+    <w:p>
+      <w:pPr>
+        <w:bidi/>
+      </w:pPr>
+      <w:r>
+        <w:rPr>
+          <w:lang w:val="ar_AE" w:bidi="ar_AE"/>
+        </w:rPr>
+      </w:r>
+      <w:r>
+        <w:rPr>
           <w:b/>
           <w:lang w:val="ar_AE" w:bidi="ar_AE"/>
         </w:rPr>
@@ -21842,6 +22786,22 @@
       </w:r>
       <w:r>
         <w:rPr>
+          <w:lang w:val="ar_AE" w:bidi="ar_AE"/>
+        </w:rPr>
+        <w:t>וְ⁠הוּא֙ יַגִּ֣יד לָ֔⁠ךְ אֵ֖ת אֲשֶׁ֥ר תַּעַשִֽׂי⁠ן</w:t>
+      </w:r>
+    </w:p>
+    <w:p>
+      <w:pPr>
+        <w:bidi/>
+      </w:pPr>
+      <w:r>
+        <w:rPr>
+          <w:lang w:val="ar_AE" w:bidi="ar_AE"/>
+        </w:rPr>
+      </w:r>
+      <w:r>
+        <w:rPr>
           <w:b/>
           <w:lang w:val="ar_AE" w:bidi="ar_AE"/>
         </w:rPr>
@@ -22026,6 +22986,22 @@
         <w:rPr>
           <w:lang w:val="ar_AE" w:bidi="ar_AE"/>
         </w:rPr>
+      </w:r>
+    </w:p>
+    <w:p>
+      <w:pPr>
+        <w:bidi/>
+      </w:pPr>
+      <w:r>
+        <w:rPr>
+          <w:lang w:val="ar_AE" w:bidi="ar_AE"/>
+        </w:rPr>
+      </w:r>
+      <w:r>
+        <w:rPr>
+          <w:lang w:val="ar_AE" w:bidi="ar_AE"/>
+        </w:rPr>
+        <w:t>וַ⁠תַּ֕עַשׂ כְּ⁠כֹ֥ל אֲשֶׁר־צִוַּ֖תָּ⁠ה חֲמוֹתָֽ⁠הּ</w:t>
       </w:r>
     </w:p>
     <w:p>
@@ -22365,6 +23341,22 @@
       </w:r>
       <w:r>
         <w:rPr>
+          <w:lang w:val="ar_AE" w:bidi="ar_AE"/>
+        </w:rPr>
+        <w:t>וַ⁠תָּבֹ֣א בַ⁠לָּ֔ט</w:t>
+      </w:r>
+    </w:p>
+    <w:p>
+      <w:pPr>
+        <w:bidi/>
+      </w:pPr>
+      <w:r>
+        <w:rPr>
+          <w:lang w:val="ar_AE" w:bidi="ar_AE"/>
+        </w:rPr>
+      </w:r>
+      <w:r>
+        <w:rPr>
           <w:b/>
           <w:lang w:val="ar_AE" w:bidi="ar_AE"/>
         </w:rPr>
@@ -22436,6 +23428,22 @@
         <w:rPr>
           <w:lang w:val="ar_AE" w:bidi="ar_AE"/>
         </w:rPr>
+      </w:r>
+    </w:p>
+    <w:p>
+      <w:pPr>
+        <w:bidi/>
+      </w:pPr>
+      <w:r>
+        <w:rPr>
+          <w:lang w:val="ar_AE" w:bidi="ar_AE"/>
+        </w:rPr>
+      </w:r>
+      <w:r>
+        <w:rPr>
+          <w:lang w:val="ar_AE" w:bidi="ar_AE"/>
+        </w:rPr>
+        <w:t>וַ⁠תְּגַ֥ל מַרְגְּלֹתָ֖י⁠ו</w:t>
       </w:r>
     </w:p>
     <w:p>
@@ -22586,6 +23594,22 @@
       </w:r>
       <w:r>
         <w:rPr>
+          <w:lang w:val="ar_AE" w:bidi="ar_AE"/>
+        </w:rPr>
+        <w:t>וַ⁠יְהִי֙ בַּ⁠חֲצִ֣י הַ⁠לַּ֔יְלָה</w:t>
+      </w:r>
+    </w:p>
+    <w:p>
+      <w:pPr>
+        <w:bidi/>
+      </w:pPr>
+      <w:r>
+        <w:rPr>
+          <w:lang w:val="ar_AE" w:bidi="ar_AE"/>
+        </w:rPr>
+      </w:r>
+      <w:r>
+        <w:rPr>
           <w:b/>
           <w:lang w:val="ar_AE" w:bidi="ar_AE"/>
         </w:rPr>
@@ -23085,6 +24109,22 @@
       </w:r>
       <w:r>
         <w:rPr>
+          <w:lang w:val="ar_AE" w:bidi="ar_AE"/>
+        </w:rPr>
+        <w:t>וּ⁠פָרַשְׂתָּ֤ כְנָפֶ֨⁠ךָ֙ עַל־אֲמָ֣תְ⁠ךָ֔</w:t>
+      </w:r>
+    </w:p>
+    <w:p>
+      <w:pPr>
+        <w:bidi/>
+      </w:pPr>
+      <w:r>
+        <w:rPr>
+          <w:lang w:val="ar_AE" w:bidi="ar_AE"/>
+        </w:rPr>
+      </w:r>
+      <w:r>
+        <w:rPr>
           <w:b/>
           <w:lang w:val="ar_AE" w:bidi="ar_AE"/>
         </w:rPr>
@@ -23178,6 +24218,22 @@
         <w:rPr>
           <w:lang w:val="ar_AE" w:bidi="ar_AE"/>
         </w:rPr>
+      </w:r>
+    </w:p>
+    <w:p>
+      <w:pPr>
+        <w:bidi/>
+      </w:pPr>
+      <w:r>
+        <w:rPr>
+          <w:lang w:val="ar_AE" w:bidi="ar_AE"/>
+        </w:rPr>
+      </w:r>
+      <w:r>
+        <w:rPr>
+          <w:lang w:val="ar_AE" w:bidi="ar_AE"/>
+        </w:rPr>
+        <w:t>גֹאֵ֖ל</w:t>
       </w:r>
     </w:p>
     <w:p>
@@ -23315,6 +24371,22 @@
       </w:r>
       <w:r>
         <w:rPr>
+          <w:lang w:val="ar_AE" w:bidi="ar_AE"/>
+        </w:rPr>
+        <w:t>בְּרוּכָ֨ה אַ֤תְּ לַֽ⁠יהוָה֙</w:t>
+      </w:r>
+    </w:p>
+    <w:p>
+      <w:pPr>
+        <w:bidi/>
+      </w:pPr>
+      <w:r>
+        <w:rPr>
+          <w:lang w:val="ar_AE" w:bidi="ar_AE"/>
+        </w:rPr>
+      </w:r>
+      <w:r>
+        <w:rPr>
           <w:b/>
           <w:lang w:val="ar_AE" w:bidi="ar_AE"/>
         </w:rPr>
@@ -23574,6 +24646,22 @@
       </w:r>
       <w:r>
         <w:rPr>
+          <w:lang w:val="ar_AE" w:bidi="ar_AE"/>
+        </w:rPr>
+        <w:t>הֵיטַ֛בְתְּ חַסְדֵּ֥⁠ךְ הָ⁠אַחֲר֖וֹן מִן־הָ⁠רִאשׁ֑וֹן</w:t>
+      </w:r>
+    </w:p>
+    <w:p>
+      <w:pPr>
+        <w:bidi/>
+      </w:pPr>
+      <w:r>
+        <w:rPr>
+          <w:lang w:val="ar_AE" w:bidi="ar_AE"/>
+        </w:rPr>
+      </w:r>
+      <w:r>
+        <w:rPr>
           <w:b/>
           <w:lang w:val="ar_AE" w:bidi="ar_AE"/>
         </w:rPr>
@@ -24396,6 +25484,22 @@
       </w:r>
       <w:r>
         <w:rPr>
+          <w:lang w:val="ar_AE" w:bidi="ar_AE"/>
+        </w:rPr>
+        <w:t>אֵ֥שֶׁת חַ֖יִל</w:t>
+      </w:r>
+    </w:p>
+    <w:p>
+      <w:pPr>
+        <w:bidi/>
+      </w:pPr>
+      <w:r>
+        <w:rPr>
+          <w:lang w:val="ar_AE" w:bidi="ar_AE"/>
+        </w:rPr>
+      </w:r>
+      <w:r>
+        <w:rPr>
           <w:b/>
           <w:lang w:val="ar_AE" w:bidi="ar_AE"/>
         </w:rPr>
@@ -24826,6 +25930,22 @@
       </w:r>
       <w:r>
         <w:rPr>
+          <w:lang w:val="ar_AE" w:bidi="ar_AE"/>
+        </w:rPr>
+        <w:t>גֹאֵ֖ל &amp; גֹּאֵ֖ל</w:t>
+      </w:r>
+    </w:p>
+    <w:p>
+      <w:pPr>
+        <w:bidi/>
+      </w:pPr>
+      <w:r>
+        <w:rPr>
+          <w:lang w:val="ar_AE" w:bidi="ar_AE"/>
+        </w:rPr>
+      </w:r>
+      <w:r>
+        <w:rPr>
           <w:b/>
           <w:lang w:val="ar_AE" w:bidi="ar_AE"/>
         </w:rPr>
@@ -26820,6 +27940,22 @@
       </w:r>
       <w:r>
         <w:rPr>
+          <w:lang w:val="ar_AE" w:bidi="ar_AE"/>
+        </w:rPr>
+        <w:t>שֵׁשׁ־הַ⁠שְּׂעֹרִ֥ים</w:t>
+      </w:r>
+    </w:p>
+    <w:p>
+      <w:pPr>
+        <w:bidi/>
+      </w:pPr>
+      <w:r>
+        <w:rPr>
+          <w:lang w:val="ar_AE" w:bidi="ar_AE"/>
+        </w:rPr>
+      </w:r>
+      <w:r>
+        <w:rPr>
           <w:b/>
           <w:lang w:val="ar_AE" w:bidi="ar_AE"/>
         </w:rPr>
@@ -26944,6 +28080,22 @@
       </w:r>
       <w:r>
         <w:rPr>
+          <w:lang w:val="ar_AE" w:bidi="ar_AE"/>
+        </w:rPr>
+        <w:t>כִּ֚י אָמַ֣ר אַל־תָּב֥וֹאִי רֵיקָ֖ם אֶל־חֲמוֹתֵֽ⁠ךְ</w:t>
+      </w:r>
+    </w:p>
+    <w:p>
+      <w:pPr>
+        <w:bidi/>
+      </w:pPr>
+      <w:r>
+        <w:rPr>
+          <w:lang w:val="ar_AE" w:bidi="ar_AE"/>
+        </w:rPr>
+      </w:r>
+      <w:r>
+        <w:rPr>
           <w:b/>
           <w:lang w:val="ar_AE" w:bidi="ar_AE"/>
         </w:rPr>
@@ -27294,6 +28446,22 @@
         <w:rPr>
           <w:lang w:val="ar_AE" w:bidi="ar_AE"/>
         </w:rPr>
+      </w:r>
+    </w:p>
+    <w:p>
+      <w:pPr>
+        <w:bidi/>
+      </w:pPr>
+      <w:r>
+        <w:rPr>
+          <w:lang w:val="ar_AE" w:bidi="ar_AE"/>
+        </w:rPr>
+      </w:r>
+      <w:r>
+        <w:rPr>
+          <w:lang w:val="ar_AE" w:bidi="ar_AE"/>
+        </w:rPr>
+        <w:t>בִתִּ֔⁠י</w:t>
       </w:r>
     </w:p>
     <w:p>
@@ -28844,6 +30012,22 @@
       </w:r>
       <w:r>
         <w:rPr>
+          <w:lang w:val="ar_AE" w:bidi="ar_AE"/>
+        </w:rPr>
+        <w:t>וַ⁠יִּקַּ֞ח עֲשָׂרָ֧ה אֲנָשִׁ֛ים</w:t>
+      </w:r>
+    </w:p>
+    <w:p>
+      <w:pPr>
+        <w:bidi/>
+      </w:pPr>
+      <w:r>
+        <w:rPr>
+          <w:lang w:val="ar_AE" w:bidi="ar_AE"/>
+        </w:rPr>
+      </w:r>
+      <w:r>
+        <w:rPr>
           <w:b/>
           <w:lang w:val="ar_AE" w:bidi="ar_AE"/>
         </w:rPr>
@@ -29320,6 +30504,22 @@
       </w:r>
       <w:r>
         <w:rPr>
+          <w:lang w:val="ar_AE" w:bidi="ar_AE"/>
+        </w:rPr>
+        <w:t>נֶ֥גֶד הַֽ⁠יֹּשְׁבִים֮</w:t>
+      </w:r>
+    </w:p>
+    <w:p>
+      <w:pPr>
+        <w:bidi/>
+      </w:pPr>
+      <w:r>
+        <w:rPr>
+          <w:lang w:val="ar_AE" w:bidi="ar_AE"/>
+        </w:rPr>
+      </w:r>
+      <w:r>
+        <w:rPr>
           <w:b/>
           <w:lang w:val="ar_AE" w:bidi="ar_AE"/>
         </w:rPr>
@@ -29548,6 +30748,22 @@
       </w:r>
       <w:r>
         <w:rPr>
+          <w:lang w:val="ar_AE" w:bidi="ar_AE"/>
+        </w:rPr>
+        <w:t>אֵ֤ין זוּלָֽתְ⁠ךָ֙ לִ⁠גְא֔וֹל וְ⁠אָנֹכִ֖י אַחֲרֶ֑י⁠ךָ</w:t>
+      </w:r>
+    </w:p>
+    <w:p>
+      <w:pPr>
+        <w:bidi/>
+      </w:pPr>
+      <w:r>
+        <w:rPr>
+          <w:lang w:val="ar_AE" w:bidi="ar_AE"/>
+        </w:rPr>
+      </w:r>
+      <w:r>
+        <w:rPr>
           <w:b/>
           <w:lang w:val="ar_AE" w:bidi="ar_AE"/>
         </w:rPr>
@@ -30172,6 +31388,22 @@
       </w:r>
       <w:r>
         <w:rPr>
+          <w:lang w:val="ar_AE" w:bidi="ar_AE"/>
+        </w:rPr>
+        <w:t>אֵֽשֶׁת־הַ⁠מֵּת֙</w:t>
+      </w:r>
+    </w:p>
+    <w:p>
+      <w:pPr>
+        <w:bidi/>
+      </w:pPr>
+      <w:r>
+        <w:rPr>
+          <w:lang w:val="ar_AE" w:bidi="ar_AE"/>
+        </w:rPr>
+      </w:r>
+      <w:r>
+        <w:rPr>
           <w:b/>
           <w:lang w:val="ar_AE" w:bidi="ar_AE"/>
         </w:rPr>
@@ -30675,6 +31907,22 @@
       </w:r>
       <w:r>
         <w:rPr>
+          <w:lang w:val="ar_AE" w:bidi="ar_AE"/>
+        </w:rPr>
+        <w:t>גְּאַל־לְ⁠ךָ֤ אַתָּה֙ אֶת־גְּאֻלָּתִ֔⁠י</w:t>
+      </w:r>
+    </w:p>
+    <w:p>
+      <w:pPr>
+        <w:bidi/>
+      </w:pPr>
+      <w:r>
+        <w:rPr>
+          <w:lang w:val="ar_AE" w:bidi="ar_AE"/>
+        </w:rPr>
+      </w:r>
+      <w:r>
+        <w:rPr>
           <w:b/>
           <w:lang w:val="ar_AE" w:bidi="ar_AE"/>
         </w:rPr>
@@ -31320,6 +32568,22 @@
       </w:r>
       <w:r>
         <w:rPr>
+          <w:lang w:val="ar_AE" w:bidi="ar_AE"/>
+        </w:rPr>
+        <w:t>וַ⁠יֹּ֧אמֶר הַ⁠גֹּאֵ֛ל לְ⁠בֹ֖עַז קְנֵה־לָ֑⁠ךְ וַ⁠יִּשְׁלֹ֖ף נַעֲלֽ⁠וֹ</w:t>
+      </w:r>
+    </w:p>
+    <w:p>
+      <w:pPr>
+        <w:bidi/>
+      </w:pPr>
+      <w:r>
+        <w:rPr>
+          <w:lang w:val="ar_AE" w:bidi="ar_AE"/>
+        </w:rPr>
+      </w:r>
+      <w:r>
+        <w:rPr>
           <w:b/>
           <w:lang w:val="ar_AE" w:bidi="ar_AE"/>
         </w:rPr>
@@ -31426,6 +32690,22 @@
       </w:r>
       <w:r>
         <w:rPr>
+          <w:lang w:val="ar_AE" w:bidi="ar_AE"/>
+        </w:rPr>
+        <w:t>וַ⁠יֹּ֧אמֶר הַ⁠גֹּאֵ֛ל לְ⁠בֹ֖עַז קְנֵה־לָ֑⁠ךְ וַ⁠יִּשְׁלֹ֖ף נַעֲלֽ⁠וֹ</w:t>
+      </w:r>
+    </w:p>
+    <w:p>
+      <w:pPr>
+        <w:bidi/>
+      </w:pPr>
+      <w:r>
+        <w:rPr>
+          <w:lang w:val="ar_AE" w:bidi="ar_AE"/>
+        </w:rPr>
+      </w:r>
+      <w:r>
+        <w:rPr>
           <w:b/>
           <w:lang w:val="ar_AE" w:bidi="ar_AE"/>
         </w:rPr>
@@ -31937,6 +33217,22 @@
       </w:r>
       <w:r>
         <w:rPr>
+          <w:lang w:val="ar_AE" w:bidi="ar_AE"/>
+        </w:rPr>
+        <w:t>אֶת־כָּל־אֲשֶׁ֣ר לֶֽ⁠אֱלִימֶ֔לֶךְ וְ⁠אֵ֛ת כָּל־אֲשֶׁ֥ר לְ⁠כִלְי֖וֹן וּ⁠מַחְל֑וֹן</w:t>
+      </w:r>
+    </w:p>
+    <w:p>
+      <w:pPr>
+        <w:bidi/>
+      </w:pPr>
+      <w:r>
+        <w:rPr>
+          <w:lang w:val="ar_AE" w:bidi="ar_AE"/>
+        </w:rPr>
+      </w:r>
+      <w:r>
+        <w:rPr>
           <w:b/>
           <w:lang w:val="ar_AE" w:bidi="ar_AE"/>
         </w:rPr>
@@ -32130,6 +33426,22 @@
         <w:rPr>
           <w:lang w:val="ar_AE" w:bidi="ar_AE"/>
         </w:rPr>
+      </w:r>
+    </w:p>
+    <w:p>
+      <w:pPr>
+        <w:bidi/>
+      </w:pPr>
+      <w:r>
+        <w:rPr>
+          <w:lang w:val="ar_AE" w:bidi="ar_AE"/>
+        </w:rPr>
+      </w:r>
+      <w:r>
+        <w:rPr>
+          <w:lang w:val="ar_AE" w:bidi="ar_AE"/>
+        </w:rPr>
+        <w:t>לְ⁠הָקִ֤ים שֵׁם־הַ⁠מֵּת֙ עַל־נַ֣חֲלָת֔⁠וֹ</w:t>
       </w:r>
     </w:p>
     <w:p>
@@ -32412,6 +33724,22 @@
       </w:r>
       <w:r>
         <w:rPr>
+          <w:lang w:val="ar_AE" w:bidi="ar_AE"/>
+        </w:rPr>
+        <w:t>וְ⁠לֹא־יִכָּרֵ֧ת שֵׁם־הַ⁠מֵּ֛ת מֵ⁠עִ֥ם אֶחָ֖י⁠ו וּ⁠מִ⁠שַּׁ֣עַר מְקוֹמ֑⁠וֹ</w:t>
+      </w:r>
+    </w:p>
+    <w:p>
+      <w:pPr>
+        <w:bidi/>
+      </w:pPr>
+      <w:r>
+        <w:rPr>
+          <w:lang w:val="ar_AE" w:bidi="ar_AE"/>
+        </w:rPr>
+      </w:r>
+      <w:r>
+        <w:rPr>
           <w:b/>
           <w:lang w:val="ar_AE" w:bidi="ar_AE"/>
         </w:rPr>
@@ -32518,6 +33846,22 @@
       </w:r>
       <w:r>
         <w:rPr>
+          <w:lang w:val="ar_AE" w:bidi="ar_AE"/>
+        </w:rPr>
+        <w:t>וְ⁠לֹא־יִכָּרֵ֧ת שֵׁם־הַ⁠מֵּ֛ת מֵ⁠עִ֥ם אֶחָ֖י⁠ו וּ⁠מִ⁠שַּׁ֣עַר מְקוֹמ֑⁠וֹ</w:t>
+      </w:r>
+    </w:p>
+    <w:p>
+      <w:pPr>
+        <w:bidi/>
+      </w:pPr>
+      <w:r>
+        <w:rPr>
+          <w:lang w:val="ar_AE" w:bidi="ar_AE"/>
+        </w:rPr>
+      </w:r>
+      <w:r>
+        <w:rPr>
           <w:b/>
           <w:lang w:val="ar_AE" w:bidi="ar_AE"/>
         </w:rPr>
@@ -32798,6 +34142,22 @@
       </w:r>
       <w:r>
         <w:rPr>
+          <w:lang w:val="ar_AE" w:bidi="ar_AE"/>
+        </w:rPr>
+        <w:t>עֵדִ֥ים אַתֶּ֖ם הַ⁠יּֽוֹם</w:t>
+      </w:r>
+    </w:p>
+    <w:p>
+      <w:pPr>
+        <w:bidi/>
+      </w:pPr>
+      <w:r>
+        <w:rPr>
+          <w:lang w:val="ar_AE" w:bidi="ar_AE"/>
+        </w:rPr>
+      </w:r>
+      <w:r>
+        <w:rPr>
           <w:b/>
           <w:lang w:val="ar_AE" w:bidi="ar_AE"/>
         </w:rPr>
@@ -33126,6 +34486,22 @@
         <w:rPr>
           <w:lang w:val="ar_AE" w:bidi="ar_AE"/>
         </w:rPr>
+      </w:r>
+    </w:p>
+    <w:p>
+      <w:pPr>
+        <w:bidi/>
+      </w:pPr>
+      <w:r>
+        <w:rPr>
+          <w:lang w:val="ar_AE" w:bidi="ar_AE"/>
+        </w:rPr>
+      </w:r>
+      <w:r>
+        <w:rPr>
+          <w:lang w:val="ar_AE" w:bidi="ar_AE"/>
+        </w:rPr>
+        <w:t>יִתֵּן֩ יְהוָ֨ה אֶֽת־הָ⁠אִשָּׁ֜ה הַ⁠בָּאָ֣ה אֶל־בֵּיתֶ֗⁠ךָ כְּ⁠רָחֵ֤ל ׀ וּ⁠כְ⁠לֵאָה֙ אֲשֶׁ֨ר בָּנ֤וּ שְׁתֵּי⁠הֶם֙ אֶת־בֵּ֣ית יִשְׂרָאֵ֔ל</w:t>
       </w:r>
     </w:p>
     <w:p>
@@ -34752,6 +36128,22 @@
       </w:r>
       <w:r>
         <w:rPr>
+          <w:lang w:val="ar_AE" w:bidi="ar_AE"/>
+        </w:rPr>
+        <w:t>לֹ֣א הִשְׁבִּ֥ית לָ֛⁠ךְ גֹּאֵ֖ל הַ⁠יּ֑וֹם</w:t>
+      </w:r>
+    </w:p>
+    <w:p>
+      <w:pPr>
+        <w:bidi/>
+      </w:pPr>
+      <w:r>
+        <w:rPr>
+          <w:lang w:val="ar_AE" w:bidi="ar_AE"/>
+        </w:rPr>
+      </w:r>
+      <w:r>
+        <w:rPr>
           <w:b/>
           <w:lang w:val="ar_AE" w:bidi="ar_AE"/>
         </w:rPr>
@@ -35873,6 +37265,22 @@
         <w:rPr>
           <w:lang w:val="ar_AE" w:bidi="ar_AE"/>
         </w:rPr>
+      </w:r>
+    </w:p>
+    <w:p>
+      <w:pPr>
+        <w:bidi/>
+      </w:pPr>
+      <w:r>
+        <w:rPr>
+          <w:lang w:val="ar_AE" w:bidi="ar_AE"/>
+        </w:rPr>
+      </w:r>
+      <w:r>
+        <w:rPr>
+          <w:lang w:val="ar_AE" w:bidi="ar_AE"/>
+        </w:rPr>
+        <w:t>וַ⁠תִּקְרֶאנָה֩ ל֨⁠וֹ הַ⁠שְּׁכֵנ֥וֹת שֵׁם֙ לֵ⁠אמֹ֔ר &amp; וַ⁠תִּקְרֶ֤אנָֽה שְׁמ⁠וֹ֙ עוֹבֵ֔ד</w:t>
       </w:r>
     </w:p>
     <w:p>
@@ -36698,6 +38106,22 @@
       </w:r>
       <w:r>
         <w:rPr>
+          <w:lang w:val="ar_AE" w:bidi="ar_AE"/>
+        </w:rPr>
+        <w:t>פֶּ֖רֶץ הוֹלִ֥יד אֶת־חֶצְרֽוֹן</w:t>
+      </w:r>
+    </w:p>
+    <w:p>
+      <w:pPr>
+        <w:bidi/>
+      </w:pPr>
+      <w:r>
+        <w:rPr>
+          <w:lang w:val="ar_AE" w:bidi="ar_AE"/>
+        </w:rPr>
+      </w:r>
+      <w:r>
+        <w:rPr>
           <w:b/>
           <w:lang w:val="ar_AE" w:bidi="ar_AE"/>
         </w:rPr>
@@ -36824,6 +38248,22 @@
       </w:r>
       <w:r>
         <w:rPr>
+          <w:lang w:val="ar_AE" w:bidi="ar_AE"/>
+        </w:rPr>
+        <w:t>וְ⁠חֶצְרוֹן֙ &amp; אֶת־רָ֔ם &amp; אֶת־עַמִּֽינָדָֽב</w:t>
+      </w:r>
+    </w:p>
+    <w:p>
+      <w:pPr>
+        <w:bidi/>
+      </w:pPr>
+      <w:r>
+        <w:rPr>
+          <w:lang w:val="ar_AE" w:bidi="ar_AE"/>
+        </w:rPr>
+      </w:r>
+      <w:r>
+        <w:rPr>
           <w:b/>
           <w:lang w:val="ar_AE" w:bidi="ar_AE"/>
         </w:rPr>
@@ -36978,6 +38418,22 @@
         <w:rPr>
           <w:lang w:val="ar_AE" w:bidi="ar_AE"/>
         </w:rPr>
+      </w:r>
+    </w:p>
+    <w:p>
+      <w:pPr>
+        <w:bidi/>
+      </w:pPr>
+      <w:r>
+        <w:rPr>
+          <w:lang w:val="ar_AE" w:bidi="ar_AE"/>
+        </w:rPr>
+      </w:r>
+      <w:r>
+        <w:rPr>
+          <w:lang w:val="ar_AE" w:bidi="ar_AE"/>
+        </w:rPr>
+        <w:t>וְ⁠עַמִּֽינָדָב֙ &amp; וְ⁠נַחְשׁ֖וֹן &amp; אֶת־שַׂלְמָֽה</w:t>
       </w:r>
     </w:p>
     <w:p>

</xml_diff>